<commit_message>
BOEJ-5231: Add a new AD group into PTM for Contract Leads
</commit_message>
<xml_diff>
--- a/ClassifiedInstallationStuff/_Instructions/_IES Suite Upgrade Instructions.docx
+++ b/ClassifiedInstallationStuff/_Instructions/_IES Suite Upgrade Instructions.docx
@@ -2,23 +2,23 @@
 <file path=word/document.xml><?xml version="1.0" encoding="utf-8"?>
 <w:document xmlns:wpc="http://schemas.microsoft.com/office/word/2010/wordprocessingCanvas" xmlns:cx="http://schemas.microsoft.com/office/drawing/2014/chartex" xmlns:cx1="http://schemas.microsoft.com/office/drawing/2015/9/8/chartex" xmlns:cx2="http://schemas.microsoft.com/office/drawing/2015/10/21/chartex" xmlns:cx3="http://schemas.microsoft.com/office/drawing/2016/5/9/chartex" xmlns:cx4="http://schemas.microsoft.com/office/drawing/2016/5/10/chartex" xmlns:cx5="http://schemas.microsoft.com/office/drawing/2016/5/11/chartex" xmlns:cx6="http://schemas.microsoft.com/office/drawing/2016/5/12/chartex" xmlns:cx7="http://schemas.microsoft.com/office/drawing/2016/5/13/chartex" xmlns:cx8="http://schemas.microsoft.com/office/drawing/2016/5/14/chartex" xmlns:mc="http://schemas.openxmlformats.org/markup-compatibility/2006" xmlns:aink="http://schemas.microsoft.com/office/drawing/2016/ink" xmlns:am3d="http://schemas.microsoft.com/office/drawing/2017/model3d" xmlns:o="urn:schemas-microsoft-com:office:office" xmlns:r="http://schemas.openxmlformats.org/officeDocument/2006/relationships" xmlns:m="http://schemas.openxmlformats.org/officeDocument/2006/math" xmlns:v="urn:schemas-microsoft-com:vml" xmlns:wp14="http://schemas.microsoft.com/office/word/2010/wordprocessingDrawing" xmlns:wp="http://schemas.openxmlformats.org/drawingml/2006/wordprocessingDrawing" xmlns:w10="urn:schemas-microsoft-com:office:word" xmlns:w="http://schemas.openxmlformats.org/wordprocessingml/2006/main" xmlns:w14="http://schemas.microsoft.com/office/word/2010/wordml" xmlns:w15="http://schemas.microsoft.com/office/word/2012/wordml" xmlns:w16cex="http://schemas.microsoft.com/office/word/2018/wordml/cex" xmlns:w16cid="http://schemas.microsoft.com/office/word/2016/wordml/cid" xmlns:w16="http://schemas.microsoft.com/office/word/2018/wordml" xmlns:w16se="http://schemas.microsoft.com/office/word/2015/wordml/symex" xmlns:wpg="http://schemas.microsoft.com/office/word/2010/wordprocessingGroup" xmlns:wpi="http://schemas.microsoft.com/office/word/2010/wordprocessingInk" xmlns:wne="http://schemas.microsoft.com/office/word/2006/wordml" xmlns:wps="http://schemas.microsoft.com/office/word/2010/wordprocessingShape" mc:Ignorable="w14 w15 w16se w16cid w16 w16cex wp14">
   <w:body>
-    <w:bookmarkStart w:id="0" w:name="_Toc34724951" w:displacedByCustomXml="next"/>
-    <w:bookmarkStart w:id="1" w:name="_Toc443997342" w:displacedByCustomXml="next"/>
-    <w:bookmarkStart w:id="2" w:name="_Toc443996285" w:displacedByCustomXml="next"/>
-    <w:bookmarkStart w:id="3" w:name="_Toc443996238" w:displacedByCustomXml="next"/>
-    <w:bookmarkStart w:id="4" w:name="_Toc426545466" w:displacedByCustomXml="next"/>
-    <w:bookmarkStart w:id="5" w:name="_Toc426545102" w:displacedByCustomXml="next"/>
-    <w:bookmarkStart w:id="6" w:name="_Toc426544400" w:displacedByCustomXml="next"/>
-    <w:bookmarkStart w:id="7" w:name="_Toc410652409" w:displacedByCustomXml="next"/>
+    <w:bookmarkStart w:id="0" w:name="_Toc4599931" w:displacedByCustomXml="next"/>
+    <w:bookmarkStart w:id="1" w:name="_Toc534277455" w:displacedByCustomXml="next"/>
+    <w:bookmarkStart w:id="2" w:name="_Toc443999444" w:displacedByCustomXml="next"/>
+    <w:bookmarkStart w:id="3" w:name="_Toc443999244" w:displacedByCustomXml="next"/>
+    <w:bookmarkStart w:id="4" w:name="_Toc435089160" w:displacedByCustomXml="next"/>
+    <w:bookmarkStart w:id="5" w:name="_Toc402261032" w:displacedByCustomXml="next"/>
+    <w:bookmarkStart w:id="6" w:name="_Toc409096411" w:displacedByCustomXml="next"/>
+    <w:bookmarkStart w:id="7" w:name="_Toc410226779" w:displacedByCustomXml="next"/>
     <w:bookmarkStart w:id="8" w:name="_Toc410286731" w:displacedByCustomXml="next"/>
-    <w:bookmarkStart w:id="9" w:name="_Toc410226779" w:displacedByCustomXml="next"/>
-    <w:bookmarkStart w:id="10" w:name="_Toc409096411" w:displacedByCustomXml="next"/>
-    <w:bookmarkStart w:id="11" w:name="_Toc402261032" w:displacedByCustomXml="next"/>
-    <w:bookmarkStart w:id="12" w:name="_Toc435089160" w:displacedByCustomXml="next"/>
-    <w:bookmarkStart w:id="13" w:name="_Toc443999244" w:displacedByCustomXml="next"/>
-    <w:bookmarkStart w:id="14" w:name="_Toc443999444" w:displacedByCustomXml="next"/>
-    <w:bookmarkStart w:id="15" w:name="_Toc534277455" w:displacedByCustomXml="next"/>
-    <w:bookmarkStart w:id="16" w:name="_Toc4599931" w:displacedByCustomXml="next"/>
+    <w:bookmarkStart w:id="9" w:name="_Toc410652409" w:displacedByCustomXml="next"/>
+    <w:bookmarkStart w:id="10" w:name="_Toc426544400" w:displacedByCustomXml="next"/>
+    <w:bookmarkStart w:id="11" w:name="_Toc426545102" w:displacedByCustomXml="next"/>
+    <w:bookmarkStart w:id="12" w:name="_Toc426545466" w:displacedByCustomXml="next"/>
+    <w:bookmarkStart w:id="13" w:name="_Toc443996238" w:displacedByCustomXml="next"/>
+    <w:bookmarkStart w:id="14" w:name="_Toc443996285" w:displacedByCustomXml="next"/>
+    <w:bookmarkStart w:id="15" w:name="_Toc443997342" w:displacedByCustomXml="next"/>
+    <w:bookmarkStart w:id="16" w:name="_Toc34724951" w:displacedByCustomXml="next"/>
     <w:sdt>
       <w:sdtPr>
         <w:rPr>
@@ -46,8 +46,8 @@
         </w:rPr>
       </w:sdtEndPr>
       <w:sdtContent>
-        <w:bookmarkStart w:id="17" w:name="_Toc266280202" w:displacedByCustomXml="prev"/>
-        <w:bookmarkStart w:id="18" w:name="_Toc320016168" w:displacedByCustomXml="prev"/>
+        <w:bookmarkStart w:id="17" w:name="_Toc320016168" w:displacedByCustomXml="prev"/>
+        <w:bookmarkStart w:id="18" w:name="_Toc266280202" w:displacedByCustomXml="prev"/>
         <w:p>
           <w:pPr>
             <w:pStyle w:val="Heading1"/>
@@ -506,6 +506,61 @@
               <w:p>
                 <w:pPr>
                   <w:cnfStyle w:val="000000100000" w:firstRow="0" w:lastRow="0" w:firstColumn="0" w:lastColumn="0" w:oddVBand="0" w:evenVBand="0" w:oddHBand="1" w:evenHBand="0" w:firstRowFirstColumn="0" w:firstRowLastColumn="0" w:lastRowFirstColumn="0" w:lastRowLastColumn="0"/>
+                </w:pPr>
+                <w:r>
+                  <w:t>Dusan Palider</w:t>
+                </w:r>
+              </w:p>
+            </w:tc>
+          </w:tr>
+          <w:tr>
+            <w:trPr>
+              <w:cnfStyle w:val="000000010000" w:firstRow="0" w:lastRow="0" w:firstColumn="0" w:lastColumn="0" w:oddVBand="0" w:evenVBand="0" w:oddHBand="0" w:evenHBand="1" w:firstRowFirstColumn="0" w:firstRowLastColumn="0" w:lastRowFirstColumn="0" w:lastRowLastColumn="0"/>
+            </w:trPr>
+            <w:tc>
+              <w:tcPr>
+                <w:cnfStyle w:val="001000000000" w:firstRow="0" w:lastRow="0" w:firstColumn="1" w:lastColumn="0" w:oddVBand="0" w:evenVBand="0" w:oddHBand="0" w:evenHBand="0" w:firstRowFirstColumn="0" w:firstRowLastColumn="0" w:lastRowFirstColumn="0" w:lastRowLastColumn="0"/>
+                <w:tcW w:w="1188" w:type="dxa"/>
+              </w:tcPr>
+              <w:p>
+                <w:r>
+                  <w:t>15</w:t>
+                </w:r>
+              </w:p>
+            </w:tc>
+            <w:tc>
+              <w:tcPr>
+                <w:tcW w:w="1278" w:type="dxa"/>
+              </w:tcPr>
+              <w:p>
+                <w:pPr>
+                  <w:cnfStyle w:val="000000010000" w:firstRow="0" w:lastRow="0" w:firstColumn="0" w:lastColumn="0" w:oddVBand="0" w:evenVBand="0" w:oddHBand="0" w:evenHBand="1" w:firstRowFirstColumn="0" w:firstRowLastColumn="0" w:lastRowFirstColumn="0" w:lastRowLastColumn="0"/>
+                </w:pPr>
+                <w:r>
+                  <w:t>5/6/2021</w:t>
+                </w:r>
+              </w:p>
+            </w:tc>
+            <w:tc>
+              <w:tcPr>
+                <w:tcW w:w="4726" w:type="dxa"/>
+              </w:tcPr>
+              <w:p>
+                <w:pPr>
+                  <w:cnfStyle w:val="000000010000" w:firstRow="0" w:lastRow="0" w:firstColumn="0" w:lastColumn="0" w:oddVBand="0" w:evenVBand="0" w:oddHBand="0" w:evenHBand="1" w:firstRowFirstColumn="0" w:firstRowLastColumn="0" w:lastRowFirstColumn="0" w:lastRowLastColumn="0"/>
+                </w:pPr>
+                <w:r>
+                  <w:t>Added Contracts Leads to the document</w:t>
+                </w:r>
+              </w:p>
+            </w:tc>
+            <w:tc>
+              <w:tcPr>
+                <w:tcW w:w="1772" w:type="dxa"/>
+              </w:tcPr>
+              <w:p>
+                <w:pPr>
+                  <w:cnfStyle w:val="000000010000" w:firstRow="0" w:lastRow="0" w:firstColumn="0" w:lastColumn="0" w:oddVBand="0" w:evenVBand="0" w:oddHBand="0" w:evenHBand="1" w:firstRowFirstColumn="0" w:firstRowLastColumn="0" w:lastRowFirstColumn="0" w:lastRowLastColumn="0"/>
                 </w:pPr>
                 <w:r>
                   <w:t>Dusan Palider</w:t>
@@ -7217,35 +7272,136 @@
         <w:textAlignment w:val="center"/>
         <w:rPr>
           <w:rFonts w:ascii="Calibri" w:eastAsia="Times New Roman" w:hAnsi="Calibri" w:cs="Calibri"/>
-          <w:strike/>
+        </w:rPr>
+      </w:pPr>
+      <w:r>
+        <w:rPr>
+          <w:rFonts w:ascii="Consolas" w:eastAsiaTheme="minorHAnsi" w:hAnsi="Consolas" w:cs="Consolas"/>
+          <w:color w:val="0000FF"/>
+          <w:sz w:val="19"/>
+          <w:szCs w:val="19"/>
+        </w:rPr>
+        <w:t xml:space="preserve">LOBManagers </w:t>
+      </w:r>
+      <w:r>
+        <w:t xml:space="preserve">– </w:t>
+      </w:r>
+      <w:r>
+        <w:t>set this to the appropriate AD group</w:t>
+      </w:r>
+    </w:p>
+    <w:p>
+      <w:pPr>
+        <w:pStyle w:val="ListParagraph"/>
+        <w:numPr>
+          <w:ilvl w:val="1"/>
+          <w:numId w:val="4"/>
+        </w:numPr>
+        <w:spacing w:after="0"/>
+        <w:textAlignment w:val="center"/>
+        <w:rPr>
+          <w:rFonts w:ascii="Calibri" w:eastAsia="Times New Roman" w:hAnsi="Calibri" w:cs="Calibri"/>
+        </w:rPr>
+      </w:pPr>
+      <w:r>
+        <w:rPr>
+          <w:rFonts w:ascii="Consolas" w:eastAsiaTheme="minorHAnsi" w:hAnsi="Consolas" w:cs="Consolas"/>
+          <w:color w:val="0000FF"/>
+          <w:sz w:val="19"/>
+          <w:szCs w:val="19"/>
+        </w:rPr>
+        <w:t xml:space="preserve">CoverSheetApprovers </w:t>
+      </w:r>
+      <w:r>
+        <w:t>– set this to the appropriate AD group</w:t>
+      </w:r>
+    </w:p>
+    <w:p>
+      <w:pPr>
+        <w:pStyle w:val="ListParagraph"/>
+        <w:numPr>
+          <w:ilvl w:val="1"/>
+          <w:numId w:val="4"/>
+        </w:numPr>
+        <w:spacing w:after="0"/>
+        <w:textAlignment w:val="center"/>
+        <w:rPr>
+          <w:rFonts w:ascii="Calibri" w:eastAsia="Times New Roman" w:hAnsi="Calibri" w:cs="Calibri"/>
+        </w:rPr>
+      </w:pPr>
+      <w:r>
+        <w:rPr>
+          <w:rFonts w:ascii="Consolas" w:eastAsiaTheme="minorHAnsi" w:hAnsi="Consolas" w:cs="Consolas"/>
+          <w:color w:val="0000FF"/>
+          <w:sz w:val="19"/>
+          <w:szCs w:val="19"/>
+        </w:rPr>
+        <w:t xml:space="preserve">PricingVerifications </w:t>
+      </w:r>
+      <w:r>
+        <w:t>– set this to the appropriate AD group</w:t>
+      </w:r>
+    </w:p>
+    <w:p>
+      <w:pPr>
+        <w:pStyle w:val="ListParagraph"/>
+        <w:numPr>
+          <w:ilvl w:val="1"/>
+          <w:numId w:val="4"/>
+        </w:numPr>
+        <w:spacing w:after="0"/>
+        <w:textAlignment w:val="center"/>
+        <w:rPr>
+          <w:rFonts w:ascii="Calibri" w:eastAsia="Times New Roman" w:hAnsi="Calibri" w:cs="Calibri"/>
+        </w:rPr>
+      </w:pPr>
+      <w:r>
+        <w:rPr>
+          <w:rFonts w:ascii="Consolas" w:eastAsiaTheme="minorHAnsi" w:hAnsi="Consolas" w:cs="Consolas"/>
+          <w:color w:val="0000FF"/>
+          <w:sz w:val="19"/>
+          <w:szCs w:val="19"/>
+        </w:rPr>
+        <w:t xml:space="preserve">IndependentReviewers </w:t>
+      </w:r>
+      <w:r>
+        <w:t>– set this to the appropriate AD group</w:t>
+      </w:r>
+    </w:p>
+    <w:p>
+      <w:pPr>
+        <w:pStyle w:val="ListParagraph"/>
+        <w:numPr>
+          <w:ilvl w:val="1"/>
+          <w:numId w:val="4"/>
+        </w:numPr>
+        <w:spacing w:after="0"/>
+        <w:textAlignment w:val="center"/>
+        <w:rPr>
+          <w:rFonts w:ascii="Calibri" w:eastAsia="Times New Roman" w:hAnsi="Calibri" w:cs="Calibri"/>
         </w:rPr>
       </w:pPr>
       <w:commentRangeStart w:id="56"/>
       <w:r>
         <w:rPr>
           <w:rFonts w:ascii="Consolas" w:eastAsiaTheme="minorHAnsi" w:hAnsi="Consolas" w:cs="Consolas"/>
-          <w:strike/>
-          <w:color w:val="0000FF"/>
-          <w:sz w:val="19"/>
-          <w:szCs w:val="19"/>
-        </w:rPr>
-        <w:t xml:space="preserve">LOBLeads </w:t>
-      </w:r>
-      <w:r>
-        <w:rPr>
-          <w:strike/>
-        </w:rPr>
+          <w:color w:val="0000FF"/>
+          <w:sz w:val="19"/>
+          <w:szCs w:val="19"/>
+        </w:rPr>
+        <w:t>ContractsLead</w:t>
+      </w:r>
+      <w:r>
+        <w:rPr>
+          <w:rFonts w:ascii="Consolas" w:eastAsiaTheme="minorHAnsi" w:hAnsi="Consolas" w:cs="Consolas"/>
+          <w:color w:val="0000FF"/>
+          <w:sz w:val="19"/>
+          <w:szCs w:val="19"/>
+        </w:rPr>
+        <w:t xml:space="preserve"> </w:t>
+      </w:r>
+      <w:r>
         <w:t>– set this to the appropriate AD group</w:t>
-      </w:r>
-      <w:r>
-        <w:rPr>
-          <w:rFonts w:ascii="Consolas" w:eastAsiaTheme="minorHAnsi" w:hAnsi="Consolas" w:cs="Consolas"/>
-          <w:strike/>
-          <w:color w:val="0000FF"/>
-          <w:sz w:val="19"/>
-          <w:szCs w:val="19"/>
-        </w:rPr>
-        <w:t xml:space="preserve"> </w:t>
       </w:r>
       <w:commentRangeEnd w:id="56"/>
       <w:r>
@@ -7254,113 +7410,6 @@
           <w:rFonts w:ascii="Calibri" w:eastAsiaTheme="minorHAnsi" w:hAnsi="Calibri" w:cs="Times New Roman"/>
         </w:rPr>
         <w:commentReference w:id="56"/>
-      </w:r>
-    </w:p>
-    <w:p>
-      <w:pPr>
-        <w:pStyle w:val="ListParagraph"/>
-        <w:numPr>
-          <w:ilvl w:val="1"/>
-          <w:numId w:val="4"/>
-        </w:numPr>
-        <w:spacing w:after="0"/>
-        <w:textAlignment w:val="center"/>
-        <w:rPr>
-          <w:rFonts w:ascii="Calibri" w:eastAsia="Times New Roman" w:hAnsi="Calibri" w:cs="Calibri"/>
-        </w:rPr>
-      </w:pPr>
-      <w:r>
-        <w:rPr>
-          <w:rFonts w:ascii="Consolas" w:eastAsiaTheme="minorHAnsi" w:hAnsi="Consolas" w:cs="Consolas"/>
-          <w:color w:val="0000FF"/>
-          <w:sz w:val="19"/>
-          <w:szCs w:val="19"/>
-        </w:rPr>
-        <w:t xml:space="preserve">LOBManagers </w:t>
-      </w:r>
-      <w:r>
-        <w:t xml:space="preserve">– </w:t>
-      </w:r>
-      <w:r>
-        <w:t>set this to the appropriate AD group</w:t>
-      </w:r>
-    </w:p>
-    <w:p>
-      <w:pPr>
-        <w:pStyle w:val="ListParagraph"/>
-        <w:numPr>
-          <w:ilvl w:val="1"/>
-          <w:numId w:val="4"/>
-        </w:numPr>
-        <w:spacing w:after="0"/>
-        <w:textAlignment w:val="center"/>
-        <w:rPr>
-          <w:rFonts w:ascii="Calibri" w:eastAsia="Times New Roman" w:hAnsi="Calibri" w:cs="Calibri"/>
-        </w:rPr>
-      </w:pPr>
-      <w:r>
-        <w:rPr>
-          <w:rFonts w:ascii="Consolas" w:eastAsiaTheme="minorHAnsi" w:hAnsi="Consolas" w:cs="Consolas"/>
-          <w:color w:val="0000FF"/>
-          <w:sz w:val="19"/>
-          <w:szCs w:val="19"/>
-        </w:rPr>
-        <w:t xml:space="preserve">CoverSheetApprovers </w:t>
-      </w:r>
-      <w:r>
-        <w:t>– set this to the appropriate AD group</w:t>
-      </w:r>
-    </w:p>
-    <w:p>
-      <w:pPr>
-        <w:pStyle w:val="ListParagraph"/>
-        <w:numPr>
-          <w:ilvl w:val="1"/>
-          <w:numId w:val="4"/>
-        </w:numPr>
-        <w:spacing w:after="0"/>
-        <w:textAlignment w:val="center"/>
-        <w:rPr>
-          <w:rFonts w:ascii="Calibri" w:eastAsia="Times New Roman" w:hAnsi="Calibri" w:cs="Calibri"/>
-        </w:rPr>
-      </w:pPr>
-      <w:r>
-        <w:rPr>
-          <w:rFonts w:ascii="Consolas" w:eastAsiaTheme="minorHAnsi" w:hAnsi="Consolas" w:cs="Consolas"/>
-          <w:color w:val="0000FF"/>
-          <w:sz w:val="19"/>
-          <w:szCs w:val="19"/>
-        </w:rPr>
-        <w:t xml:space="preserve">PricingVerifications </w:t>
-      </w:r>
-      <w:r>
-        <w:t>– set this to the appropriate AD group</w:t>
-      </w:r>
-    </w:p>
-    <w:p>
-      <w:pPr>
-        <w:pStyle w:val="ListParagraph"/>
-        <w:numPr>
-          <w:ilvl w:val="1"/>
-          <w:numId w:val="4"/>
-        </w:numPr>
-        <w:spacing w:after="0"/>
-        <w:textAlignment w:val="center"/>
-        <w:rPr>
-          <w:rFonts w:ascii="Calibri" w:eastAsia="Times New Roman" w:hAnsi="Calibri" w:cs="Calibri"/>
-        </w:rPr>
-      </w:pPr>
-      <w:r>
-        <w:rPr>
-          <w:rFonts w:ascii="Consolas" w:eastAsiaTheme="minorHAnsi" w:hAnsi="Consolas" w:cs="Consolas"/>
-          <w:color w:val="0000FF"/>
-          <w:sz w:val="19"/>
-          <w:szCs w:val="19"/>
-        </w:rPr>
-        <w:t xml:space="preserve">IndependentReviewers </w:t>
-      </w:r>
-      <w:r>
-        <w:t>– set this to the appropriate AD group</w:t>
       </w:r>
     </w:p>
     <w:p>
@@ -12163,7 +12212,7 @@
       </w:r>
     </w:p>
   </w:comment>
-  <w:comment w:id="56" w:author="Palider, Dusan (US)" w:date="2021-03-13T10:52:00Z" w:initials="DP">
+  <w:comment w:id="56" w:author="Palider, Dusan (US)" w:date="2021-05-06T16:11:00Z" w:initials="DP">
     <w:p>
       <w:pPr>
         <w:pStyle w:val="CommentText"/>
@@ -12175,7 +12224,7 @@
         <w:annotationRef/>
       </w:r>
       <w:r>
-        <w:t>No longer needed</w:t>
+        <w:t>New</w:t>
       </w:r>
     </w:p>
   </w:comment>
@@ -12202,7 +12251,7 @@
 <w15:commentsEx xmlns:wpc="http://schemas.microsoft.com/office/word/2010/wordprocessingCanvas" xmlns:cx="http://schemas.microsoft.com/office/drawing/2014/chartex" xmlns:cx1="http://schemas.microsoft.com/office/drawing/2015/9/8/chartex" xmlns:cx2="http://schemas.microsoft.com/office/drawing/2015/10/21/chartex" xmlns:cx3="http://schemas.microsoft.com/office/drawing/2016/5/9/chartex" xmlns:cx4="http://schemas.microsoft.com/office/drawing/2016/5/10/chartex" xmlns:cx5="http://schemas.microsoft.com/office/drawing/2016/5/11/chartex" xmlns:cx6="http://schemas.microsoft.com/office/drawing/2016/5/12/chartex" xmlns:cx7="http://schemas.microsoft.com/office/drawing/2016/5/13/chartex" xmlns:cx8="http://schemas.microsoft.com/office/drawing/2016/5/14/chartex" xmlns:mc="http://schemas.openxmlformats.org/markup-compatibility/2006" xmlns:aink="http://schemas.microsoft.com/office/drawing/2016/ink" xmlns:am3d="http://schemas.microsoft.com/office/drawing/2017/model3d" xmlns:o="urn:schemas-microsoft-com:office:office" xmlns:r="http://schemas.openxmlformats.org/officeDocument/2006/relationships" xmlns:m="http://schemas.openxmlformats.org/officeDocument/2006/math" xmlns:v="urn:schemas-microsoft-com:vml" xmlns:wp14="http://schemas.microsoft.com/office/word/2010/wordprocessingDrawing" xmlns:wp="http://schemas.openxmlformats.org/drawingml/2006/wordprocessingDrawing" xmlns:w10="urn:schemas-microsoft-com:office:word" xmlns:w="http://schemas.openxmlformats.org/wordprocessingml/2006/main" xmlns:w14="http://schemas.microsoft.com/office/word/2010/wordml" xmlns:w15="http://schemas.microsoft.com/office/word/2012/wordml" xmlns:w16cex="http://schemas.microsoft.com/office/word/2018/wordml/cex" xmlns:w16cid="http://schemas.microsoft.com/office/word/2016/wordml/cid" xmlns:w16="http://schemas.microsoft.com/office/word/2018/wordml" xmlns:w16se="http://schemas.microsoft.com/office/word/2015/wordml/symex" xmlns:wpg="http://schemas.microsoft.com/office/word/2010/wordprocessingGroup" xmlns:wpi="http://schemas.microsoft.com/office/word/2010/wordprocessingInk" xmlns:wne="http://schemas.microsoft.com/office/word/2006/wordml" xmlns:wps="http://schemas.microsoft.com/office/word/2010/wordprocessingShape" mc:Ignorable="w14 w15 w16se w16cid w16 w16cex wp14">
   <w15:commentEx w15:paraId="2E46B96C" w15:done="0"/>
   <w15:commentEx w15:paraId="24BD5AFA" w15:done="0"/>
-  <w15:commentEx w15:paraId="0CF0ADFD" w15:done="0"/>
+  <w15:commentEx w15:paraId="5D43F883" w15:done="0"/>
   <w15:commentEx w15:paraId="073BDFF9" w15:done="0"/>
 </w15:commentsEx>
 </file>
@@ -12211,7 +12260,7 @@
 <w16cex:commentsExtensible xmlns:wpc="http://schemas.microsoft.com/office/word/2010/wordprocessingCanvas" xmlns:cx="http://schemas.microsoft.com/office/drawing/2014/chartex" xmlns:cx1="http://schemas.microsoft.com/office/drawing/2015/9/8/chartex" xmlns:cx2="http://schemas.microsoft.com/office/drawing/2015/10/21/chartex" xmlns:cx3="http://schemas.microsoft.com/office/drawing/2016/5/9/chartex" xmlns:cx4="http://schemas.microsoft.com/office/drawing/2016/5/10/chartex" xmlns:cx5="http://schemas.microsoft.com/office/drawing/2016/5/11/chartex" xmlns:cx6="http://schemas.microsoft.com/office/drawing/2016/5/12/chartex" xmlns:cx7="http://schemas.microsoft.com/office/drawing/2016/5/13/chartex" xmlns:cx8="http://schemas.microsoft.com/office/drawing/2016/5/14/chartex" xmlns:mc="http://schemas.openxmlformats.org/markup-compatibility/2006" xmlns:aink="http://schemas.microsoft.com/office/drawing/2016/ink" xmlns:am3d="http://schemas.microsoft.com/office/drawing/2017/model3d" xmlns:o="urn:schemas-microsoft-com:office:office" xmlns:r="http://schemas.openxmlformats.org/officeDocument/2006/relationships" xmlns:m="http://schemas.openxmlformats.org/officeDocument/2006/math" xmlns:v="urn:schemas-microsoft-com:vml" xmlns:wp14="http://schemas.microsoft.com/office/word/2010/wordprocessingDrawing" xmlns:wp="http://schemas.openxmlformats.org/drawingml/2006/wordprocessingDrawing" xmlns:w10="urn:schemas-microsoft-com:office:word" xmlns:w="http://schemas.openxmlformats.org/wordprocessingml/2006/main" xmlns:w14="http://schemas.microsoft.com/office/word/2010/wordml" xmlns:w15="http://schemas.microsoft.com/office/word/2012/wordml" xmlns:w16cex="http://schemas.microsoft.com/office/word/2018/wordml/cex" xmlns:w16cid="http://schemas.microsoft.com/office/word/2016/wordml/cid" xmlns:w16="http://schemas.microsoft.com/office/word/2018/wordml" xmlns:w16se="http://schemas.microsoft.com/office/word/2015/wordml/symex" xmlns:wpg="http://schemas.microsoft.com/office/word/2010/wordprocessingGroup" xmlns:wpi="http://schemas.microsoft.com/office/word/2010/wordprocessingInk" xmlns:wne="http://schemas.microsoft.com/office/word/2006/wordml" xmlns:wps="http://schemas.microsoft.com/office/word/2010/wordprocessingShape" mc:Ignorable="w14 w15 w16se w16cid w16 w16cex wp14">
   <w16cex:commentExtensible w16cex:durableId="23F72385" w16cex:dateUtc="2021-03-13T16:41:00Z"/>
   <w16cex:commentExtensible w16cex:durableId="23F7230D" w16cex:dateUtc="2021-03-13T16:39:00Z"/>
-  <w16cex:commentExtensible w16cex:durableId="23F71806" w16cex:dateUtc="2021-03-13T15:52:00Z"/>
+  <w16cex:commentExtensible w16cex:durableId="243E93CC" w16cex:dateUtc="2021-05-06T20:11:00Z"/>
   <w16cex:commentExtensible w16cex:durableId="23F71952" w16cex:dateUtc="2021-03-13T15:58:00Z"/>
 </w16cex:commentsExtensible>
 </file>
@@ -12220,7 +12269,7 @@
 <w16cid:commentsIds xmlns:wpc="http://schemas.microsoft.com/office/word/2010/wordprocessingCanvas" xmlns:cx="http://schemas.microsoft.com/office/drawing/2014/chartex" xmlns:cx1="http://schemas.microsoft.com/office/drawing/2015/9/8/chartex" xmlns:cx2="http://schemas.microsoft.com/office/drawing/2015/10/21/chartex" xmlns:cx3="http://schemas.microsoft.com/office/drawing/2016/5/9/chartex" xmlns:cx4="http://schemas.microsoft.com/office/drawing/2016/5/10/chartex" xmlns:cx5="http://schemas.microsoft.com/office/drawing/2016/5/11/chartex" xmlns:cx6="http://schemas.microsoft.com/office/drawing/2016/5/12/chartex" xmlns:cx7="http://schemas.microsoft.com/office/drawing/2016/5/13/chartex" xmlns:cx8="http://schemas.microsoft.com/office/drawing/2016/5/14/chartex" xmlns:mc="http://schemas.openxmlformats.org/markup-compatibility/2006" xmlns:aink="http://schemas.microsoft.com/office/drawing/2016/ink" xmlns:am3d="http://schemas.microsoft.com/office/drawing/2017/model3d" xmlns:o="urn:schemas-microsoft-com:office:office" xmlns:r="http://schemas.openxmlformats.org/officeDocument/2006/relationships" xmlns:m="http://schemas.openxmlformats.org/officeDocument/2006/math" xmlns:v="urn:schemas-microsoft-com:vml" xmlns:wp14="http://schemas.microsoft.com/office/word/2010/wordprocessingDrawing" xmlns:wp="http://schemas.openxmlformats.org/drawingml/2006/wordprocessingDrawing" xmlns:w10="urn:schemas-microsoft-com:office:word" xmlns:w="http://schemas.openxmlformats.org/wordprocessingml/2006/main" xmlns:w14="http://schemas.microsoft.com/office/word/2010/wordml" xmlns:w15="http://schemas.microsoft.com/office/word/2012/wordml" xmlns:w16cex="http://schemas.microsoft.com/office/word/2018/wordml/cex" xmlns:w16cid="http://schemas.microsoft.com/office/word/2016/wordml/cid" xmlns:w16="http://schemas.microsoft.com/office/word/2018/wordml" xmlns:w16se="http://schemas.microsoft.com/office/word/2015/wordml/symex" xmlns:wpg="http://schemas.microsoft.com/office/word/2010/wordprocessingGroup" xmlns:wpi="http://schemas.microsoft.com/office/word/2010/wordprocessingInk" xmlns:wne="http://schemas.microsoft.com/office/word/2006/wordml" xmlns:wps="http://schemas.microsoft.com/office/word/2010/wordprocessingShape" mc:Ignorable="w14 w15 w16se w16cid w16 w16cex wp14">
   <w16cid:commentId w16cid:paraId="2E46B96C" w16cid:durableId="23F72385"/>
   <w16cid:commentId w16cid:paraId="24BD5AFA" w16cid:durableId="23F7230D"/>
-  <w16cid:commentId w16cid:paraId="0CF0ADFD" w16cid:durableId="23F71806"/>
+  <w16cid:commentId w16cid:paraId="5D43F883" w16cid:durableId="243E93CC"/>
   <w16cid:commentId w16cid:paraId="073BDFF9" w16cid:durableId="23F71952"/>
 </w16cid:commentsIds>
 </file>

</xml_diff>

<commit_message>
1270 - add SAP flag and make hours fields readonly
</commit_message>
<xml_diff>
--- a/ClassifiedInstallationStuff/_Instructions/_IES Suite Upgrade Instructions.docx
+++ b/ClassifiedInstallationStuff/_Instructions/_IES Suite Upgrade Instructions.docx
@@ -2,26 +2,26 @@
 <file path=word/document.xml><?xml version="1.0" encoding="utf-8"?>
 <w:document xmlns:wpc="http://schemas.microsoft.com/office/word/2010/wordprocessingCanvas" xmlns:cx="http://schemas.microsoft.com/office/drawing/2014/chartex" xmlns:cx1="http://schemas.microsoft.com/office/drawing/2015/9/8/chartex" xmlns:cx2="http://schemas.microsoft.com/office/drawing/2015/10/21/chartex" xmlns:cx3="http://schemas.microsoft.com/office/drawing/2016/5/9/chartex" xmlns:cx4="http://schemas.microsoft.com/office/drawing/2016/5/10/chartex" xmlns:cx5="http://schemas.microsoft.com/office/drawing/2016/5/11/chartex" xmlns:cx6="http://schemas.microsoft.com/office/drawing/2016/5/12/chartex" xmlns:cx7="http://schemas.microsoft.com/office/drawing/2016/5/13/chartex" xmlns:cx8="http://schemas.microsoft.com/office/drawing/2016/5/14/chartex" xmlns:mc="http://schemas.openxmlformats.org/markup-compatibility/2006" xmlns:aink="http://schemas.microsoft.com/office/drawing/2016/ink" xmlns:am3d="http://schemas.microsoft.com/office/drawing/2017/model3d" xmlns:o="urn:schemas-microsoft-com:office:office" xmlns:r="http://schemas.openxmlformats.org/officeDocument/2006/relationships" xmlns:m="http://schemas.openxmlformats.org/officeDocument/2006/math" xmlns:v="urn:schemas-microsoft-com:vml" xmlns:wp14="http://schemas.microsoft.com/office/word/2010/wordprocessingDrawing" xmlns:wp="http://schemas.openxmlformats.org/drawingml/2006/wordprocessingDrawing" xmlns:w10="urn:schemas-microsoft-com:office:word" xmlns:w="http://schemas.openxmlformats.org/wordprocessingml/2006/main" xmlns:w14="http://schemas.microsoft.com/office/word/2010/wordml" xmlns:w15="http://schemas.microsoft.com/office/word/2012/wordml" xmlns:w16cex="http://schemas.microsoft.com/office/word/2018/wordml/cex" xmlns:w16cid="http://schemas.microsoft.com/office/word/2016/wordml/cid" xmlns:w16="http://schemas.microsoft.com/office/word/2018/wordml" xmlns:w16sdtdh="http://schemas.microsoft.com/office/word/2020/wordml/sdtdatahash" xmlns:w16se="http://schemas.microsoft.com/office/word/2015/wordml/symex" xmlns:wpg="http://schemas.microsoft.com/office/word/2010/wordprocessingGroup" xmlns:wpi="http://schemas.microsoft.com/office/word/2010/wordprocessingInk" xmlns:wne="http://schemas.microsoft.com/office/word/2006/wordml" xmlns:wps="http://schemas.microsoft.com/office/word/2010/wordprocessingShape" mc:Ignorable="w14 w15 w16se w16cid w16 w16cex w16sdtdh wp14">
   <w:body>
-    <w:bookmarkStart w:id="0" w:name="_Toc34724951" w:displacedByCustomXml="next"/>
-    <w:bookmarkStart w:id="1" w:name="_Toc443997342" w:displacedByCustomXml="next"/>
-    <w:bookmarkStart w:id="2" w:name="_Toc443996285" w:displacedByCustomXml="next"/>
-    <w:bookmarkStart w:id="3" w:name="_Toc443996238" w:displacedByCustomXml="next"/>
-    <w:bookmarkStart w:id="4" w:name="_Toc426545466" w:displacedByCustomXml="next"/>
-    <w:bookmarkStart w:id="5" w:name="_Toc426545102" w:displacedByCustomXml="next"/>
-    <w:bookmarkStart w:id="6" w:name="_Toc426544400" w:displacedByCustomXml="next"/>
-    <w:bookmarkStart w:id="7" w:name="_Toc410652409" w:displacedByCustomXml="next"/>
-    <w:bookmarkStart w:id="8" w:name="_Toc410286731" w:displacedByCustomXml="next"/>
-    <w:bookmarkStart w:id="9" w:name="_Toc410226779" w:displacedByCustomXml="next"/>
-    <w:bookmarkStart w:id="10" w:name="_Toc409096411" w:displacedByCustomXml="next"/>
-    <w:bookmarkStart w:id="11" w:name="_Toc402261032" w:displacedByCustomXml="next"/>
-    <w:bookmarkStart w:id="12" w:name="_Toc435089160" w:displacedByCustomXml="next"/>
-    <w:bookmarkStart w:id="13" w:name="_Toc443999244" w:displacedByCustomXml="next"/>
-    <w:bookmarkStart w:id="14" w:name="_Toc443999444" w:displacedByCustomXml="next"/>
-    <w:bookmarkStart w:id="15" w:name="_Toc534277455" w:displacedByCustomXml="next"/>
-    <w:bookmarkStart w:id="16" w:name="_Toc4599931" w:displacedByCustomXml="next"/>
-    <w:bookmarkStart w:id="17" w:name="_Toc69202903" w:displacedByCustomXml="next"/>
-    <w:bookmarkStart w:id="18" w:name="_Toc69203962" w:displacedByCustomXml="next"/>
-    <w:bookmarkStart w:id="19" w:name="_Toc69207018" w:displacedByCustomXml="next"/>
+    <w:bookmarkStart w:id="0" w:name="_Toc69207018" w:displacedByCustomXml="next"/>
+    <w:bookmarkStart w:id="1" w:name="_Toc69203962" w:displacedByCustomXml="next"/>
+    <w:bookmarkStart w:id="2" w:name="_Toc69202903" w:displacedByCustomXml="next"/>
+    <w:bookmarkStart w:id="3" w:name="_Toc4599931" w:displacedByCustomXml="next"/>
+    <w:bookmarkStart w:id="4" w:name="_Toc534277455" w:displacedByCustomXml="next"/>
+    <w:bookmarkStart w:id="5" w:name="_Toc443999444" w:displacedByCustomXml="next"/>
+    <w:bookmarkStart w:id="6" w:name="_Toc443999244" w:displacedByCustomXml="next"/>
+    <w:bookmarkStart w:id="7" w:name="_Toc435089160" w:displacedByCustomXml="next"/>
+    <w:bookmarkStart w:id="8" w:name="_Toc402261032" w:displacedByCustomXml="next"/>
+    <w:bookmarkStart w:id="9" w:name="_Toc409096411" w:displacedByCustomXml="next"/>
+    <w:bookmarkStart w:id="10" w:name="_Toc410226779" w:displacedByCustomXml="next"/>
+    <w:bookmarkStart w:id="11" w:name="_Toc410286731" w:displacedByCustomXml="next"/>
+    <w:bookmarkStart w:id="12" w:name="_Toc410652409" w:displacedByCustomXml="next"/>
+    <w:bookmarkStart w:id="13" w:name="_Toc426544400" w:displacedByCustomXml="next"/>
+    <w:bookmarkStart w:id="14" w:name="_Toc426545102" w:displacedByCustomXml="next"/>
+    <w:bookmarkStart w:id="15" w:name="_Toc426545466" w:displacedByCustomXml="next"/>
+    <w:bookmarkStart w:id="16" w:name="_Toc443996238" w:displacedByCustomXml="next"/>
+    <w:bookmarkStart w:id="17" w:name="_Toc443996285" w:displacedByCustomXml="next"/>
+    <w:bookmarkStart w:id="18" w:name="_Toc443997342" w:displacedByCustomXml="next"/>
+    <w:bookmarkStart w:id="19" w:name="_Toc34724951" w:displacedByCustomXml="next"/>
     <w:sdt>
       <w:sdtPr>
         <w:rPr>
@@ -49,8 +49,8 @@
         </w:rPr>
       </w:sdtEndPr>
       <w:sdtContent>
-        <w:bookmarkStart w:id="20" w:name="_Toc266280202" w:displacedByCustomXml="prev"/>
-        <w:bookmarkStart w:id="21" w:name="_Toc320016168" w:displacedByCustomXml="prev"/>
+        <w:bookmarkStart w:id="20" w:name="_Toc320016168" w:displacedByCustomXml="prev"/>
+        <w:bookmarkStart w:id="21" w:name="_Toc266280202" w:displacedByCustomXml="prev"/>
         <w:p>
           <w:pPr>
             <w:pStyle w:val="Heading1"/>
@@ -712,21 +712,7 @@
                 <w:rStyle w:val="Hyperlink"/>
                 <w:color w:val="auto"/>
               </w:rPr>
-              <w:t>Avoidin</w:t>
-            </w:r>
-            <w:r>
-              <w:rPr>
-                <w:rStyle w:val="Hyperlink"/>
-                <w:color w:val="auto"/>
-              </w:rPr>
-              <w:t>g</w:t>
-            </w:r>
-            <w:r>
-              <w:rPr>
-                <w:rStyle w:val="Hyperlink"/>
-                <w:color w:val="auto"/>
-              </w:rPr>
-              <w:t xml:space="preserve"> a common mistake</w:t>
+              <w:t>Avoiding a common mistake</w:t>
             </w:r>
             <w:r>
               <w:rPr>
@@ -1703,7 +1689,21 @@
         <w:rPr>
           <w:rFonts w:cstheme="minorHAnsi"/>
         </w:rPr>
-        <w:t>only. RMS does not have any custom applications at this time.</w:t>
+        <w:t xml:space="preserve">only. RMS does not have any custom applications </w:t>
+      </w:r>
+      <w:proofErr w:type="gramStart"/>
+      <w:r>
+        <w:rPr>
+          <w:rFonts w:cstheme="minorHAnsi"/>
+        </w:rPr>
+        <w:t>at this time</w:t>
+      </w:r>
+      <w:proofErr w:type="gramEnd"/>
+      <w:r>
+        <w:rPr>
+          <w:rFonts w:cstheme="minorHAnsi"/>
+        </w:rPr>
+        <w:t>.</w:t>
       </w:r>
     </w:p>
     <w:p>
@@ -2018,11 +2018,9 @@
         </w:rPr>
         <w:t xml:space="preserve">oth) </w:t>
       </w:r>
-      <w:proofErr w:type="spellStart"/>
       <w:r>
         <w:t>GenBOE</w:t>
       </w:r>
-      <w:proofErr w:type="spellEnd"/>
     </w:p>
     <w:p>
       <w:pPr>
@@ -2095,13 +2093,8 @@
         </w:rPr>
         <w:t xml:space="preserve">(Both) </w:t>
       </w:r>
-      <w:proofErr w:type="spellStart"/>
-      <w:r>
-        <w:t>GenBOE</w:t>
-      </w:r>
-      <w:proofErr w:type="spellEnd"/>
-      <w:r>
-        <w:t xml:space="preserve"> Data Backup </w:t>
+      <w:r>
+        <w:t xml:space="preserve">GenBOE Data Backup </w:t>
       </w:r>
       <w:r>
         <w:t>utility,</w:t>
@@ -2252,11 +2245,9 @@
         </w:rPr>
         <w:t xml:space="preserve">oth) </w:t>
       </w:r>
-      <w:proofErr w:type="spellStart"/>
       <w:r>
         <w:t>GenBOE</w:t>
       </w:r>
-      <w:proofErr w:type="spellEnd"/>
     </w:p>
     <w:p>
       <w:pPr>
@@ -2368,15 +2359,7 @@
     </w:p>
     <w:p>
       <w:r>
-        <w:t>Please carry these steps out for each of the web applications (</w:t>
-      </w:r>
-      <w:proofErr w:type="spellStart"/>
-      <w:r>
-        <w:t>GenBOE</w:t>
-      </w:r>
-      <w:proofErr w:type="spellEnd"/>
-      <w:r>
-        <w:t xml:space="preserve">, PTM, IES, RDM, RDSB). </w:t>
+        <w:t xml:space="preserve">Please carry these steps out for each of the web applications (GenBOE, PTM, IES, RDM, RDSB). </w:t>
       </w:r>
     </w:p>
     <w:p>
@@ -2556,13 +2539,21 @@
         <w:t>Overwrite item if it exists</w:t>
       </w:r>
       <w:r>
-        <w:t xml:space="preserve">” checkbox is </w:t>
+        <w:t xml:space="preserve">” checkbox </w:t>
+      </w:r>
+      <w:proofErr w:type="gramStart"/>
+      <w:r>
+        <w:t xml:space="preserve">is </w:t>
       </w:r>
       <w:r>
         <w:t xml:space="preserve"> </w:t>
       </w:r>
       <w:r>
-        <w:t>checked.</w:t>
+        <w:t>checked</w:t>
+      </w:r>
+      <w:proofErr w:type="gramEnd"/>
+      <w:r>
+        <w:t>.</w:t>
       </w:r>
     </w:p>
     <w:p>
@@ -2659,13 +2650,8 @@
         </w:rPr>
         <w:t xml:space="preserve">oth) </w:t>
       </w:r>
-      <w:proofErr w:type="spellStart"/>
-      <w:r>
-        <w:t>GenBOE</w:t>
-      </w:r>
-      <w:proofErr w:type="spellEnd"/>
-      <w:r>
-        <w:t xml:space="preserve"> Auto Backup application</w:t>
+      <w:r>
+        <w:t>GenBOE Auto Backup application</w:t>
       </w:r>
     </w:p>
     <w:p>
@@ -2796,13 +2782,8 @@
           <w:numId w:val="30"/>
         </w:numPr>
       </w:pPr>
-      <w:proofErr w:type="spellStart"/>
-      <w:r>
-        <w:t>GenBOE</w:t>
-      </w:r>
-      <w:proofErr w:type="spellEnd"/>
-      <w:r>
-        <w:t xml:space="preserve"> Auto Backup: </w:t>
+      <w:r>
+        <w:t xml:space="preserve">GenBOE Auto Backup: </w:t>
       </w:r>
       <w:proofErr w:type="spellStart"/>
       <w:r>
@@ -3018,13 +2999,8 @@
         </w:rPr>
         <w:t xml:space="preserve">(Both) </w:t>
       </w:r>
-      <w:proofErr w:type="spellStart"/>
-      <w:r>
-        <w:t>GenBOE</w:t>
-      </w:r>
-      <w:proofErr w:type="spellEnd"/>
-      <w:r>
-        <w:t xml:space="preserve"> Auto Backup – once per day Mon – Friday, in the middle of the night, not during DB backup times.</w:t>
+      <w:r>
+        <w:t>GenBOE Auto Backup – once per day Mon – Friday, in the middle of the night, not during DB backup times.</w:t>
       </w:r>
     </w:p>
     <w:p>
@@ -3358,21 +3334,7 @@
         <w:rPr>
           <w:rFonts w:ascii="Calibri" w:eastAsia="Times New Roman" w:hAnsi="Calibri" w:cs="Calibri"/>
         </w:rPr>
-        <w:t xml:space="preserve">– </w:t>
-      </w:r>
-      <w:proofErr w:type="spellStart"/>
-      <w:r>
-        <w:rPr>
-          <w:rFonts w:ascii="Calibri" w:eastAsia="Times New Roman" w:hAnsi="Calibri" w:cs="Calibri"/>
-        </w:rPr>
-        <w:t>genBOE</w:t>
-      </w:r>
-      <w:proofErr w:type="spellEnd"/>
-      <w:r>
-        <w:rPr>
-          <w:rFonts w:ascii="Calibri" w:eastAsia="Times New Roman" w:hAnsi="Calibri" w:cs="Calibri"/>
-        </w:rPr>
-        <w:t xml:space="preserve"> database connection string</w:t>
+        <w:t>– genBOE database connection string</w:t>
       </w:r>
     </w:p>
     <w:p>
@@ -4104,21 +4066,7 @@
         <w:rPr>
           <w:rFonts w:ascii="Calibri" w:eastAsia="Times New Roman" w:hAnsi="Calibri" w:cs="Calibri"/>
         </w:rPr>
-        <w:t xml:space="preserve">– AD groups containing users that have access to do </w:t>
-      </w:r>
-      <w:proofErr w:type="spellStart"/>
-      <w:r>
-        <w:rPr>
-          <w:rFonts w:ascii="Calibri" w:eastAsia="Times New Roman" w:hAnsi="Calibri" w:cs="Calibri"/>
-        </w:rPr>
-        <w:t>ProPricer</w:t>
-      </w:r>
-      <w:proofErr w:type="spellEnd"/>
-      <w:r>
-        <w:rPr>
-          <w:rFonts w:ascii="Calibri" w:eastAsia="Times New Roman" w:hAnsi="Calibri" w:cs="Calibri"/>
-        </w:rPr>
-        <w:t xml:space="preserve"> exports</w:t>
+        <w:t>– AD groups containing users that have access to do ProPricer exports</w:t>
       </w:r>
     </w:p>
     <w:p>
@@ -4342,7 +4290,25 @@
           <w:sz w:val="19"/>
           <w:szCs w:val="19"/>
         </w:rPr>
-        <w:t>http(s):\\</w:t>
+        <w:t>http(s</w:t>
+      </w:r>
+      <w:proofErr w:type="gramStart"/>
+      <w:r>
+        <w:rPr>
+          <w:rFonts w:ascii="Consolas" w:hAnsi="Consolas"/>
+          <w:sz w:val="19"/>
+          <w:szCs w:val="19"/>
+        </w:rPr>
+        <w:t>):\</w:t>
+      </w:r>
+      <w:proofErr w:type="gramEnd"/>
+      <w:r>
+        <w:rPr>
+          <w:rFonts w:ascii="Consolas" w:hAnsi="Consolas"/>
+          <w:sz w:val="19"/>
+          <w:szCs w:val="19"/>
+        </w:rPr>
+        <w:t>\</w:t>
       </w:r>
       <w:r>
         <w:t xml:space="preserve"> and end with </w:t>
@@ -4362,15 +4328,7 @@
         <w:t>“</w:t>
       </w:r>
       <w:r>
-        <w:t>https://space.p.external.lmco.com/sites/fbo/CCDME/Estimating/SiteLinks/genBOE (includes User Training List)/</w:t>
-      </w:r>
-      <w:proofErr w:type="spellStart"/>
-      <w:r>
-        <w:t>genBOE</w:t>
-      </w:r>
-      <w:proofErr w:type="spellEnd"/>
-      <w:r>
-        <w:t xml:space="preserve"> MOQ Types Help Text/</w:t>
+        <w:t>https://space.p.external.lmco.com/sites/fbo/CCDME/Estimating/SiteLinks/genBOE (includes User Training List)/genBOE MOQ Types Help Text/</w:t>
       </w:r>
       <w:r>
         <w:t>”</w:t>
@@ -4427,134 +4385,39 @@
     <w:p>
       <w:pPr>
         <w:pStyle w:val="ListParagraph"/>
-        <w:spacing w:after="0"/>
-        <w:ind w:left="1440"/>
-      </w:pPr>
-    </w:p>
-    <w:p>
-      <w:pPr>
-        <w:rPr>
-          <w:rFonts w:ascii="Consolas" w:eastAsiaTheme="minorHAnsi" w:hAnsi="Consolas" w:cs="Consolas"/>
-          <w:color w:val="008000"/>
-          <w:sz w:val="19"/>
-          <w:szCs w:val="19"/>
-        </w:rPr>
-      </w:pPr>
-      <w:r>
-        <w:rPr>
-          <w:rFonts w:ascii="Consolas" w:eastAsiaTheme="minorHAnsi" w:hAnsi="Consolas" w:cs="Consolas"/>
-          <w:color w:val="008000"/>
-          <w:sz w:val="19"/>
-          <w:szCs w:val="19"/>
-        </w:rPr>
-        <w:br w:type="page"/>
-      </w:r>
-    </w:p>
-    <w:p>
-      <w:pPr>
-        <w:pStyle w:val="ListParagraph"/>
-        <w:spacing w:after="0"/>
-        <w:ind w:left="1440"/>
-      </w:pPr>
-      <w:r>
-        <w:rPr>
-          <w:rFonts w:ascii="Consolas" w:eastAsiaTheme="minorHAnsi" w:hAnsi="Consolas" w:cs="Consolas"/>
-          <w:color w:val="008000"/>
-          <w:sz w:val="19"/>
-          <w:szCs w:val="19"/>
-        </w:rPr>
-        <w:lastRenderedPageBreak/>
-        <w:t>SSC Settings</w:t>
-      </w:r>
-    </w:p>
-    <w:p>
-      <w:pPr>
-        <w:pStyle w:val="ListParagraph"/>
         <w:numPr>
           <w:ilvl w:val="1"/>
           <w:numId w:val="4"/>
         </w:numPr>
         <w:spacing w:after="0"/>
-      </w:pPr>
-      <w:proofErr w:type="spellStart"/>
-      <w:r>
-        <w:rPr>
-          <w:rFonts w:ascii="Consolas" w:eastAsiaTheme="minorHAnsi" w:hAnsi="Consolas" w:cs="Consolas"/>
-          <w:color w:val="0000FF"/>
-          <w:sz w:val="19"/>
-          <w:szCs w:val="19"/>
-        </w:rPr>
-        <w:t>ShowEquivalentPersonsOption</w:t>
-      </w:r>
-      <w:proofErr w:type="spellEnd"/>
-    </w:p>
-    <w:p>
-      <w:pPr>
-        <w:pStyle w:val="ListParagraph"/>
-        <w:numPr>
-          <w:ilvl w:val="2"/>
-          <w:numId w:val="30"/>
-        </w:numPr>
-        <w:spacing w:after="0"/>
-      </w:pPr>
-      <w:r>
-        <w:rPr>
-          <w:rFonts w:ascii="Calibri" w:eastAsia="Times New Roman" w:hAnsi="Calibri" w:cs="Calibri"/>
-          <w:color w:val="E36C0A" w:themeColor="accent6" w:themeShade="BF"/>
-        </w:rPr>
-        <w:t>Space</w:t>
-      </w:r>
-      <w:r>
-        <w:t>:</w:t>
-      </w:r>
-      <w:r>
-        <w:t xml:space="preserve"> set as appropriate</w:t>
-      </w:r>
-      <w:r>
-        <w:t xml:space="preserve">, </w:t>
-      </w:r>
-      <w:r>
-        <w:t xml:space="preserve"> </w:t>
-      </w:r>
-      <w:r>
         <w:rPr>
           <w:rFonts w:ascii="Consolas" w:hAnsi="Consolas" w:cs="Consolas"/>
           <w:color w:val="1F497D" w:themeColor="text2"/>
           <w:sz w:val="20"/>
         </w:rPr>
-        <w:t>true</w:t>
-      </w:r>
-      <w:r>
-        <w:t xml:space="preserve"> </w:t>
-      </w:r>
-      <w:r>
-        <w:t>will cause EPs to be used, instead of hours</w:t>
-      </w:r>
-    </w:p>
-    <w:p>
-      <w:pPr>
-        <w:pStyle w:val="ListParagraph"/>
-        <w:numPr>
-          <w:ilvl w:val="2"/>
-          <w:numId w:val="30"/>
-        </w:numPr>
-        <w:spacing w:after="0"/>
-      </w:pPr>
-      <w:r>
-        <w:rPr>
-          <w:rFonts w:ascii="Calibri" w:eastAsia="Times New Roman" w:hAnsi="Calibri" w:cs="Calibri"/>
-          <w:color w:val="E36C0A" w:themeColor="accent6" w:themeShade="BF"/>
-        </w:rPr>
-        <w:t>RMS</w:t>
-      </w:r>
-      <w:r>
-        <w:t xml:space="preserve">: </w:t>
-      </w:r>
-      <w:r>
-        <w:t>keep at</w:t>
-      </w:r>
-      <w:r>
-        <w:t xml:space="preserve"> </w:t>
+      </w:pPr>
+      <w:proofErr w:type="spellStart"/>
+      <w:r>
+        <w:rPr>
+          <w:rFonts w:ascii="Consolas" w:eastAsiaTheme="minorHAnsi" w:hAnsi="Consolas" w:cs="Consolas"/>
+          <w:color w:val="0000FF"/>
+          <w:sz w:val="19"/>
+          <w:szCs w:val="19"/>
+        </w:rPr>
+        <w:t>EnableSAP</w:t>
+      </w:r>
+      <w:proofErr w:type="spellEnd"/>
+      <w:r>
+        <w:rPr>
+          <w:rFonts w:ascii="Consolas" w:eastAsiaTheme="minorHAnsi" w:hAnsi="Consolas" w:cs="Consolas"/>
+          <w:color w:val="0000FF"/>
+          <w:sz w:val="19"/>
+          <w:szCs w:val="19"/>
+        </w:rPr>
+        <w:t xml:space="preserve"> –</w:t>
+      </w:r>
+      <w:r>
+        <w:t xml:space="preserve"> set to </w:t>
       </w:r>
       <w:r>
         <w:rPr>
@@ -4568,6 +4431,50 @@
     <w:p>
       <w:pPr>
         <w:pStyle w:val="ListParagraph"/>
+        <w:spacing w:after="0"/>
+        <w:ind w:left="1440"/>
+      </w:pPr>
+    </w:p>
+    <w:p>
+      <w:pPr>
+        <w:rPr>
+          <w:rFonts w:ascii="Consolas" w:eastAsiaTheme="minorHAnsi" w:hAnsi="Consolas" w:cs="Consolas"/>
+          <w:color w:val="008000"/>
+          <w:sz w:val="19"/>
+          <w:szCs w:val="19"/>
+        </w:rPr>
+      </w:pPr>
+      <w:r>
+        <w:rPr>
+          <w:rFonts w:ascii="Consolas" w:eastAsiaTheme="minorHAnsi" w:hAnsi="Consolas" w:cs="Consolas"/>
+          <w:color w:val="008000"/>
+          <w:sz w:val="19"/>
+          <w:szCs w:val="19"/>
+        </w:rPr>
+        <w:lastRenderedPageBreak/>
+        <w:br w:type="page"/>
+      </w:r>
+    </w:p>
+    <w:p>
+      <w:pPr>
+        <w:pStyle w:val="ListParagraph"/>
+        <w:spacing w:after="0"/>
+        <w:ind w:left="1440"/>
+      </w:pPr>
+      <w:r>
+        <w:rPr>
+          <w:rFonts w:ascii="Consolas" w:eastAsiaTheme="minorHAnsi" w:hAnsi="Consolas" w:cs="Consolas"/>
+          <w:color w:val="008000"/>
+          <w:sz w:val="19"/>
+          <w:szCs w:val="19"/>
+        </w:rPr>
+        <w:lastRenderedPageBreak/>
+        <w:t>SSC Settings</w:t>
+      </w:r>
+    </w:p>
+    <w:p>
+      <w:pPr>
+        <w:pStyle w:val="ListParagraph"/>
         <w:numPr>
           <w:ilvl w:val="1"/>
           <w:numId w:val="4"/>
@@ -4582,7 +4489,7 @@
           <w:sz w:val="19"/>
           <w:szCs w:val="19"/>
         </w:rPr>
-        <w:t>IsBOEFormVisible</w:t>
+        <w:t>ShowEquivalentPersonsOption</w:t>
       </w:r>
       <w:proofErr w:type="spellEnd"/>
     </w:p>
@@ -4603,10 +4510,20 @@
         <w:t>Space</w:t>
       </w:r>
       <w:r>
-        <w:t xml:space="preserve">: </w:t>
-      </w:r>
-      <w:r>
-        <w:t xml:space="preserve">set to </w:t>
+        <w:t>:</w:t>
+      </w:r>
+      <w:r>
+        <w:t xml:space="preserve"> set as </w:t>
+      </w:r>
+      <w:proofErr w:type="gramStart"/>
+      <w:r>
+        <w:t>appropriate</w:t>
+      </w:r>
+      <w:r>
+        <w:t xml:space="preserve">, </w:t>
+      </w:r>
+      <w:r>
+        <w:t xml:space="preserve"> </w:t>
       </w:r>
       <w:r>
         <w:rPr>
@@ -4616,14 +4533,12 @@
         </w:rPr>
         <w:t>true</w:t>
       </w:r>
-      <w:r>
-        <w:rPr>
-          <w:sz w:val="20"/>
-        </w:rPr>
-        <w:t xml:space="preserve">, </w:t>
-      </w:r>
-      <w:r>
-        <w:t>will cause IBOE and PBOE forms to be enabled</w:t>
+      <w:proofErr w:type="gramEnd"/>
+      <w:r>
+        <w:t xml:space="preserve"> </w:t>
+      </w:r>
+      <w:r>
+        <w:t>will cause EPs to be used, instead of hours</w:t>
       </w:r>
     </w:p>
     <w:p>
@@ -4668,20 +4583,16 @@
           <w:numId w:val="4"/>
         </w:numPr>
         <w:spacing w:after="0"/>
-        <w:textAlignment w:val="center"/>
-        <w:rPr>
-          <w:rFonts w:ascii="Calibri" w:eastAsia="Times New Roman" w:hAnsi="Calibri" w:cs="Calibri"/>
-        </w:rPr>
-      </w:pPr>
-      <w:proofErr w:type="spellStart"/>
-      <w:r>
-        <w:rPr>
-          <w:rFonts w:ascii="Consolas" w:eastAsiaTheme="minorHAnsi" w:hAnsi="Consolas" w:cs="Consolas"/>
-          <w:color w:val="0000FF"/>
-          <w:sz w:val="19"/>
-          <w:szCs w:val="19"/>
-        </w:rPr>
-        <w:t>IsPortionMarkingEnabled</w:t>
+      </w:pPr>
+      <w:proofErr w:type="spellStart"/>
+      <w:r>
+        <w:rPr>
+          <w:rFonts w:ascii="Consolas" w:eastAsiaTheme="minorHAnsi" w:hAnsi="Consolas" w:cs="Consolas"/>
+          <w:color w:val="0000FF"/>
+          <w:sz w:val="19"/>
+          <w:szCs w:val="19"/>
+        </w:rPr>
+        <w:t>IsBOEFormVisible</w:t>
       </w:r>
       <w:proofErr w:type="spellEnd"/>
     </w:p>
@@ -4693,10 +4604,6 @@
           <w:numId w:val="30"/>
         </w:numPr>
         <w:spacing w:after="0"/>
-        <w:textAlignment w:val="center"/>
-        <w:rPr>
-          <w:rFonts w:ascii="Calibri" w:eastAsia="Times New Roman" w:hAnsi="Calibri" w:cs="Calibri"/>
-        </w:rPr>
       </w:pPr>
       <w:r>
         <w:rPr>
@@ -4721,13 +4628,12 @@
       </w:r>
       <w:r>
         <w:rPr>
-          <w:color w:val="1F497D" w:themeColor="text2"/>
           <w:sz w:val="20"/>
         </w:rPr>
-        <w:t xml:space="preserve"> </w:t>
-      </w:r>
-      <w:r>
-        <w:t>– will cause IBOE and PBOE to add (U) markings</w:t>
+        <w:t xml:space="preserve">, </w:t>
+      </w:r>
+      <w:r>
+        <w:t>will cause IBOE and PBOE forms to be enabled</w:t>
       </w:r>
     </w:p>
     <w:p>
@@ -4785,109 +4691,7 @@
           <w:sz w:val="19"/>
           <w:szCs w:val="19"/>
         </w:rPr>
-        <w:t>IESHomeUrl</w:t>
-      </w:r>
-      <w:proofErr w:type="spellEnd"/>
-    </w:p>
-    <w:p>
-      <w:pPr>
-        <w:pStyle w:val="ListParagraph"/>
-        <w:numPr>
-          <w:ilvl w:val="2"/>
-          <w:numId w:val="30"/>
-        </w:numPr>
-        <w:spacing w:after="0"/>
-        <w:textAlignment w:val="center"/>
-        <w:rPr>
-          <w:rFonts w:ascii="Calibri" w:eastAsia="Times New Roman" w:hAnsi="Calibri" w:cs="Calibri"/>
-        </w:rPr>
-      </w:pPr>
-      <w:r>
-        <w:rPr>
-          <w:rFonts w:ascii="Calibri" w:eastAsia="Times New Roman" w:hAnsi="Calibri" w:cs="Calibri"/>
-          <w:color w:val="E36C0A" w:themeColor="accent6" w:themeShade="BF"/>
-        </w:rPr>
-        <w:t>Space</w:t>
-      </w:r>
-      <w:r>
-        <w:t xml:space="preserve">: </w:t>
-      </w:r>
-      <w:r>
-        <w:t>IES URL, base URL followed by “</w:t>
-      </w:r>
-      <w:r>
-        <w:rPr>
-          <w:rFonts w:ascii="Consolas" w:eastAsiaTheme="minorHAnsi" w:hAnsi="Consolas" w:cs="Consolas"/>
-          <w:color w:val="1F497D" w:themeColor="text2"/>
-          <w:sz w:val="19"/>
-          <w:szCs w:val="19"/>
-        </w:rPr>
-        <w:t>/Home/</w:t>
-      </w:r>
-      <w:r>
-        <w:t>”</w:t>
-      </w:r>
-    </w:p>
-    <w:p>
-      <w:pPr>
-        <w:pStyle w:val="ListParagraph"/>
-        <w:numPr>
-          <w:ilvl w:val="2"/>
-          <w:numId w:val="30"/>
-        </w:numPr>
-        <w:spacing w:after="0"/>
-      </w:pPr>
-      <w:r>
-        <w:rPr>
-          <w:rFonts w:ascii="Calibri" w:eastAsia="Times New Roman" w:hAnsi="Calibri" w:cs="Calibri"/>
-          <w:color w:val="E36C0A" w:themeColor="accent6" w:themeShade="BF"/>
-        </w:rPr>
-        <w:t>RMS</w:t>
-      </w:r>
-      <w:r>
-        <w:t xml:space="preserve">: </w:t>
-      </w:r>
-      <w:r>
-        <w:t xml:space="preserve">set to </w:t>
-      </w:r>
-      <w:r>
-        <w:rPr>
-          <w:rFonts w:ascii="Calibri" w:eastAsia="Times New Roman" w:hAnsi="Calibri" w:cs="Calibri"/>
-          <w:i/>
-        </w:rPr>
-        <w:t>blank</w:t>
-      </w:r>
-      <w:r>
-        <w:rPr>
-          <w:rFonts w:ascii="Calibri" w:eastAsia="Times New Roman" w:hAnsi="Calibri" w:cs="Calibri"/>
-          <w:i/>
-          <w:vertAlign w:val="superscript"/>
-        </w:rPr>
-        <w:t>2</w:t>
-      </w:r>
-    </w:p>
-    <w:p>
-      <w:pPr>
-        <w:pStyle w:val="ListParagraph"/>
-        <w:numPr>
-          <w:ilvl w:val="1"/>
-          <w:numId w:val="4"/>
-        </w:numPr>
-        <w:spacing w:after="0"/>
-        <w:textAlignment w:val="center"/>
-        <w:rPr>
-          <w:rFonts w:ascii="Calibri" w:eastAsia="Times New Roman" w:hAnsi="Calibri" w:cs="Calibri"/>
-        </w:rPr>
-      </w:pPr>
-      <w:proofErr w:type="spellStart"/>
-      <w:r>
-        <w:rPr>
-          <w:rFonts w:ascii="Consolas" w:eastAsiaTheme="minorHAnsi" w:hAnsi="Consolas" w:cs="Consolas"/>
-          <w:color w:val="0000FF"/>
-          <w:sz w:val="19"/>
-          <w:szCs w:val="19"/>
-        </w:rPr>
-        <w:t>IsPTMIntegrated</w:t>
+        <w:t>IsPortionMarkingEnabled</w:t>
       </w:r>
       <w:proofErr w:type="spellEnd"/>
     </w:p>
@@ -4925,6 +4729,16 @@
         </w:rPr>
         <w:t>true</w:t>
       </w:r>
+      <w:r>
+        <w:rPr>
+          <w:color w:val="1F497D" w:themeColor="text2"/>
+          <w:sz w:val="20"/>
+        </w:rPr>
+        <w:t xml:space="preserve"> </w:t>
+      </w:r>
+      <w:r>
+        <w:t>– will cause IBOE and PBOE to add (U) markings</w:t>
+      </w:r>
     </w:p>
     <w:p>
       <w:pPr>
@@ -4963,37 +4777,6 @@
     <w:p>
       <w:pPr>
         <w:pStyle w:val="ListParagraph"/>
-        <w:spacing w:after="0"/>
-        <w:ind w:left="1440"/>
-        <w:textAlignment w:val="center"/>
-        <w:rPr>
-          <w:rFonts w:ascii="Calibri" w:eastAsia="Times New Roman" w:hAnsi="Calibri" w:cs="Calibri"/>
-        </w:rPr>
-      </w:pPr>
-    </w:p>
-    <w:p>
-      <w:pPr>
-        <w:pStyle w:val="ListParagraph"/>
-        <w:spacing w:after="0"/>
-        <w:ind w:left="1440"/>
-        <w:textAlignment w:val="center"/>
-        <w:rPr>
-          <w:rFonts w:ascii="Calibri" w:eastAsia="Times New Roman" w:hAnsi="Calibri" w:cs="Calibri"/>
-        </w:rPr>
-      </w:pPr>
-      <w:r>
-        <w:rPr>
-          <w:rFonts w:ascii="Consolas" w:eastAsiaTheme="minorHAnsi" w:hAnsi="Consolas" w:cs="Consolas"/>
-          <w:color w:val="008000"/>
-          <w:sz w:val="19"/>
-          <w:szCs w:val="19"/>
-        </w:rPr>
-        <w:t>Hours offset</w:t>
-      </w:r>
-    </w:p>
-    <w:p>
-      <w:pPr>
-        <w:pStyle w:val="ListParagraph"/>
         <w:numPr>
           <w:ilvl w:val="1"/>
           <w:numId w:val="4"/>
@@ -5012,14 +4795,85 @@
           <w:sz w:val="19"/>
           <w:szCs w:val="19"/>
         </w:rPr>
-        <w:t>DatabaseESTOffset</w:t>
-      </w:r>
-      <w:proofErr w:type="spellEnd"/>
-      <w:r>
-        <w:rPr>
-          <w:rFonts w:ascii="Calibri" w:eastAsia="Times New Roman" w:hAnsi="Calibri" w:cs="Calibri"/>
-        </w:rPr>
-        <w:t xml:space="preserve"> – adjust based on whether your DB is in a different time zone than your web server. 0 means it’s in the same zone.</w:t>
+        <w:t>IESHomeUrl</w:t>
+      </w:r>
+      <w:proofErr w:type="spellEnd"/>
+    </w:p>
+    <w:p>
+      <w:pPr>
+        <w:pStyle w:val="ListParagraph"/>
+        <w:numPr>
+          <w:ilvl w:val="2"/>
+          <w:numId w:val="30"/>
+        </w:numPr>
+        <w:spacing w:after="0"/>
+        <w:textAlignment w:val="center"/>
+        <w:rPr>
+          <w:rFonts w:ascii="Calibri" w:eastAsia="Times New Roman" w:hAnsi="Calibri" w:cs="Calibri"/>
+        </w:rPr>
+      </w:pPr>
+      <w:r>
+        <w:rPr>
+          <w:rFonts w:ascii="Calibri" w:eastAsia="Times New Roman" w:hAnsi="Calibri" w:cs="Calibri"/>
+          <w:color w:val="E36C0A" w:themeColor="accent6" w:themeShade="BF"/>
+        </w:rPr>
+        <w:t>Space</w:t>
+      </w:r>
+      <w:r>
+        <w:t xml:space="preserve">: </w:t>
+      </w:r>
+      <w:r>
+        <w:t>IES URL, base URL followed by “</w:t>
+      </w:r>
+      <w:r>
+        <w:rPr>
+          <w:rFonts w:ascii="Consolas" w:eastAsiaTheme="minorHAnsi" w:hAnsi="Consolas" w:cs="Consolas"/>
+          <w:color w:val="1F497D" w:themeColor="text2"/>
+          <w:sz w:val="19"/>
+          <w:szCs w:val="19"/>
+        </w:rPr>
+        <w:t>/Home/</w:t>
+      </w:r>
+      <w:r>
+        <w:t>”</w:t>
+      </w:r>
+    </w:p>
+    <w:p>
+      <w:pPr>
+        <w:pStyle w:val="ListParagraph"/>
+        <w:numPr>
+          <w:ilvl w:val="2"/>
+          <w:numId w:val="30"/>
+        </w:numPr>
+        <w:spacing w:after="0"/>
+      </w:pPr>
+      <w:r>
+        <w:rPr>
+          <w:rFonts w:ascii="Calibri" w:eastAsia="Times New Roman" w:hAnsi="Calibri" w:cs="Calibri"/>
+          <w:color w:val="E36C0A" w:themeColor="accent6" w:themeShade="BF"/>
+        </w:rPr>
+        <w:t>RMS</w:t>
+      </w:r>
+      <w:r>
+        <w:t xml:space="preserve">: </w:t>
+      </w:r>
+      <w:r>
+        <w:t xml:space="preserve">set to </w:t>
+      </w:r>
+      <w:r>
+        <w:rPr>
+          <w:rFonts w:ascii="Calibri" w:eastAsia="Times New Roman" w:hAnsi="Calibri" w:cs="Calibri"/>
+          <w:i/>
+        </w:rPr>
+        <w:t>blank</w:t>
+      </w:r>
+      <w:r>
+        <w:rPr>
+          <w:rFonts w:ascii="Calibri" w:eastAsia="Times New Roman" w:hAnsi="Calibri" w:cs="Calibri"/>
+          <w:i/>
+          <w:vertAlign w:val="superscript"/>
+        </w:rPr>
+        <w:t>2</w:t>
       </w:r>
     </w:p>
     <w:p>
@@ -5043,7 +4897,7 @@
           <w:sz w:val="19"/>
           <w:szCs w:val="19"/>
         </w:rPr>
-        <w:t>CanCreateWorkspaceWithoutPtmTrackingNumber</w:t>
+        <w:t>IsPTMIntegrated</w:t>
       </w:r>
       <w:proofErr w:type="spellEnd"/>
     </w:p>
@@ -5068,933 +4922,9 @@
         <w:t>Space</w:t>
       </w:r>
       <w:r>
-        <w:rPr>
-          <w:rFonts w:ascii="Calibri" w:eastAsia="Times New Roman" w:hAnsi="Calibri" w:cs="Calibri"/>
-        </w:rPr>
         <w:t xml:space="preserve">: </w:t>
       </w:r>
       <w:r>
-        <w:rPr>
-          <w:rFonts w:ascii="Calibri" w:eastAsia="Times New Roman" w:hAnsi="Calibri" w:cs="Calibri"/>
-        </w:rPr>
-        <w:t xml:space="preserve">We have this </w:t>
-      </w:r>
-      <w:r>
-        <w:rPr>
-          <w:rFonts w:ascii="Calibri" w:eastAsia="Times New Roman" w:hAnsi="Calibri" w:cs="Calibri"/>
-          <w:i/>
-          <w:iCs/>
-        </w:rPr>
-        <w:t>blank</w:t>
-      </w:r>
-      <w:r>
-        <w:rPr>
-          <w:rFonts w:ascii="Calibri" w:eastAsia="Times New Roman" w:hAnsi="Calibri" w:cs="Calibri"/>
-        </w:rPr>
-        <w:t>, but please verify this with Frank – there may be a group of users that needs to be added here.</w:t>
-      </w:r>
-    </w:p>
-    <w:p>
-      <w:pPr>
-        <w:pStyle w:val="ListParagraph"/>
-        <w:numPr>
-          <w:ilvl w:val="2"/>
-          <w:numId w:val="30"/>
-        </w:numPr>
-        <w:spacing w:after="0"/>
-      </w:pPr>
-      <w:r>
-        <w:rPr>
-          <w:rFonts w:ascii="Calibri" w:eastAsia="Times New Roman" w:hAnsi="Calibri" w:cs="Calibri"/>
-          <w:color w:val="E36C0A" w:themeColor="accent6" w:themeShade="BF"/>
-        </w:rPr>
-        <w:t>RMS</w:t>
-      </w:r>
-      <w:r>
-        <w:t xml:space="preserve">: </w:t>
-      </w:r>
-      <w:r>
-        <w:t>keep at</w:t>
-      </w:r>
-      <w:r>
-        <w:rPr>
-          <w:rFonts w:ascii="Calibri" w:eastAsia="Times New Roman" w:hAnsi="Calibri" w:cs="Calibri"/>
-          <w:i/>
-          <w:iCs/>
-        </w:rPr>
-        <w:t xml:space="preserve"> </w:t>
-      </w:r>
-      <w:r>
-        <w:rPr>
-          <w:rFonts w:ascii="Calibri" w:eastAsia="Times New Roman" w:hAnsi="Calibri" w:cs="Calibri"/>
-          <w:i/>
-          <w:iCs/>
-        </w:rPr>
-        <w:t>blank</w:t>
-      </w:r>
-    </w:p>
-    <w:p>
-      <w:pPr>
-        <w:pStyle w:val="ListParagraph"/>
-        <w:spacing w:after="0"/>
-        <w:ind w:left="1440"/>
-        <w:textAlignment w:val="center"/>
-        <w:rPr>
-          <w:rFonts w:ascii="Calibri" w:eastAsia="Times New Roman" w:hAnsi="Calibri" w:cs="Calibri"/>
-        </w:rPr>
-      </w:pPr>
-    </w:p>
-    <w:p>
-      <w:pPr>
-        <w:pStyle w:val="ListParagraph"/>
-        <w:spacing w:after="0"/>
-        <w:ind w:left="1440"/>
-        <w:textAlignment w:val="center"/>
-        <w:rPr>
-          <w:rFonts w:ascii="Calibri" w:eastAsia="Times New Roman" w:hAnsi="Calibri" w:cs="Calibri"/>
-        </w:rPr>
-      </w:pPr>
-      <w:proofErr w:type="spellStart"/>
-      <w:r>
-        <w:rPr>
-          <w:rFonts w:ascii="Consolas" w:eastAsiaTheme="minorHAnsi" w:hAnsi="Consolas" w:cs="Consolas"/>
-          <w:color w:val="008000"/>
-          <w:sz w:val="19"/>
-          <w:szCs w:val="19"/>
-        </w:rPr>
-        <w:t>Piwik</w:t>
-      </w:r>
-      <w:proofErr w:type="spellEnd"/>
-      <w:r>
-        <w:rPr>
-          <w:rFonts w:ascii="Consolas" w:eastAsiaTheme="minorHAnsi" w:hAnsi="Consolas" w:cs="Consolas"/>
-          <w:color w:val="008000"/>
-          <w:sz w:val="19"/>
-          <w:szCs w:val="19"/>
-        </w:rPr>
-        <w:t xml:space="preserve"> Settings</w:t>
-      </w:r>
-    </w:p>
-    <w:p>
-      <w:pPr>
-        <w:pStyle w:val="ListParagraph"/>
-        <w:numPr>
-          <w:ilvl w:val="1"/>
-          <w:numId w:val="4"/>
-        </w:numPr>
-        <w:spacing w:after="0"/>
-        <w:textAlignment w:val="center"/>
-        <w:rPr>
-          <w:rFonts w:ascii="Calibri" w:eastAsia="Times New Roman" w:hAnsi="Calibri" w:cs="Calibri"/>
-        </w:rPr>
-      </w:pPr>
-      <w:proofErr w:type="spellStart"/>
-      <w:r>
-        <w:rPr>
-          <w:rFonts w:ascii="Consolas" w:eastAsiaTheme="minorHAnsi" w:hAnsi="Consolas" w:cs="Consolas"/>
-          <w:color w:val="0000FF"/>
-          <w:sz w:val="19"/>
-          <w:szCs w:val="19"/>
-        </w:rPr>
-        <w:t>DisablePiwik</w:t>
-      </w:r>
-      <w:proofErr w:type="spellEnd"/>
-      <w:r>
-        <w:rPr>
-          <w:rStyle w:val="FootnoteReference"/>
-          <w:rFonts w:eastAsiaTheme="minorHAnsi" w:cs="Consolas"/>
-        </w:rPr>
-        <w:footnoteReference w:id="3"/>
-      </w:r>
-      <w:r>
-        <w:t xml:space="preserve"> – set this to </w:t>
-      </w:r>
-      <w:r>
-        <w:rPr>
-          <w:rFonts w:ascii="Consolas" w:hAnsi="Consolas" w:cs="Consolas"/>
-          <w:sz w:val="20"/>
-        </w:rPr>
-        <w:t>true</w:t>
-      </w:r>
-      <w:r>
-        <w:rPr>
-          <w:sz w:val="20"/>
-        </w:rPr>
-        <w:t xml:space="preserve"> </w:t>
-      </w:r>
-      <w:r>
-        <w:t xml:space="preserve">(to not track the website usage via </w:t>
-      </w:r>
-      <w:proofErr w:type="spellStart"/>
-      <w:r>
-        <w:t>piwik</w:t>
-      </w:r>
-      <w:proofErr w:type="spellEnd"/>
-      <w:r>
-        <w:t>)</w:t>
-      </w:r>
-      <w:r>
-        <w:t xml:space="preserve">. </w:t>
-      </w:r>
-      <w:r>
-        <w:rPr>
-          <w:rFonts w:ascii="Calibri" w:eastAsia="Times New Roman" w:hAnsi="Calibri" w:cs="Calibri"/>
-        </w:rPr>
-        <w:t>I</w:t>
-      </w:r>
-      <w:r>
-        <w:rPr>
-          <w:rFonts w:ascii="Calibri" w:eastAsia="Times New Roman" w:hAnsi="Calibri" w:cs="Calibri"/>
-        </w:rPr>
-        <w:t xml:space="preserve">gnore the other </w:t>
-      </w:r>
-      <w:proofErr w:type="spellStart"/>
-      <w:r>
-        <w:rPr>
-          <w:rFonts w:ascii="Calibri" w:eastAsia="Times New Roman" w:hAnsi="Calibri" w:cs="Calibri"/>
-        </w:rPr>
-        <w:t>piwik</w:t>
-      </w:r>
-      <w:proofErr w:type="spellEnd"/>
-      <w:r>
-        <w:rPr>
-          <w:rFonts w:ascii="Calibri" w:eastAsia="Times New Roman" w:hAnsi="Calibri" w:cs="Calibri"/>
-        </w:rPr>
-        <w:t xml:space="preserve"> settings once you disable it</w:t>
-      </w:r>
-    </w:p>
-    <w:p>
-      <w:pPr>
-        <w:pStyle w:val="ListParagraph"/>
-        <w:spacing w:after="0"/>
-        <w:ind w:left="1440"/>
-      </w:pPr>
-    </w:p>
-    <w:p>
-      <w:pPr>
-        <w:pStyle w:val="ListParagraph"/>
-        <w:spacing w:after="0"/>
-        <w:ind w:left="1440"/>
-      </w:pPr>
-      <w:r>
-        <w:rPr>
-          <w:rFonts w:ascii="Consolas" w:eastAsiaTheme="minorHAnsi" w:hAnsi="Consolas" w:cs="Consolas"/>
-          <w:color w:val="008000"/>
-          <w:sz w:val="19"/>
-          <w:szCs w:val="19"/>
-        </w:rPr>
-        <w:t>MST Measure / Metrics</w:t>
-      </w:r>
-    </w:p>
-    <w:p>
-      <w:pPr>
-        <w:pStyle w:val="ListParagraph"/>
-        <w:numPr>
-          <w:ilvl w:val="1"/>
-          <w:numId w:val="4"/>
-        </w:numPr>
-        <w:spacing w:after="0"/>
-      </w:pPr>
-      <w:proofErr w:type="spellStart"/>
-      <w:r>
-        <w:rPr>
-          <w:rFonts w:ascii="Consolas" w:eastAsiaTheme="minorHAnsi" w:hAnsi="Consolas" w:cs="Consolas"/>
-          <w:color w:val="0000FF"/>
-          <w:sz w:val="19"/>
-          <w:szCs w:val="19"/>
-        </w:rPr>
-        <w:t>MstMetricsUrl</w:t>
-      </w:r>
-      <w:proofErr w:type="spellEnd"/>
-    </w:p>
-    <w:p>
-      <w:pPr>
-        <w:pStyle w:val="ListParagraph"/>
-        <w:numPr>
-          <w:ilvl w:val="2"/>
-          <w:numId w:val="30"/>
-        </w:numPr>
-        <w:spacing w:after="0"/>
-      </w:pPr>
-      <w:r>
-        <w:rPr>
-          <w:rFonts w:ascii="Calibri" w:eastAsia="Times New Roman" w:hAnsi="Calibri" w:cs="Calibri"/>
-          <w:color w:val="E36C0A" w:themeColor="accent6" w:themeShade="BF"/>
-        </w:rPr>
-        <w:t>Space</w:t>
-      </w:r>
-      <w:r>
-        <w:rPr>
-          <w:rFonts w:ascii="Calibri" w:eastAsia="Times New Roman" w:hAnsi="Calibri" w:cs="Calibri"/>
-        </w:rPr>
-        <w:t xml:space="preserve">: </w:t>
-      </w:r>
-      <w:r>
-        <w:t xml:space="preserve">set to </w:t>
-      </w:r>
-      <w:r>
-        <w:rPr>
-          <w:rFonts w:ascii="Calibri" w:eastAsia="Times New Roman" w:hAnsi="Calibri" w:cs="Calibri"/>
-          <w:i/>
-        </w:rPr>
-        <w:t>blank</w:t>
-      </w:r>
-      <w:r>
-        <w:rPr>
-          <w:rFonts w:ascii="Calibri" w:eastAsia="Times New Roman" w:hAnsi="Calibri" w:cs="Calibri"/>
-          <w:i/>
-          <w:vertAlign w:val="superscript"/>
-        </w:rPr>
-        <w:t>2</w:t>
-      </w:r>
-    </w:p>
-    <w:p>
-      <w:pPr>
-        <w:pStyle w:val="ListParagraph"/>
-        <w:numPr>
-          <w:ilvl w:val="2"/>
-          <w:numId w:val="30"/>
-        </w:numPr>
-        <w:spacing w:after="0"/>
-      </w:pPr>
-      <w:r>
-        <w:rPr>
-          <w:rFonts w:ascii="Calibri" w:eastAsia="Times New Roman" w:hAnsi="Calibri" w:cs="Calibri"/>
-          <w:color w:val="E36C0A" w:themeColor="accent6" w:themeShade="BF"/>
-        </w:rPr>
-        <w:t>RMS</w:t>
-      </w:r>
-      <w:r>
-        <w:rPr>
-          <w:rFonts w:ascii="Calibri" w:eastAsia="Times New Roman" w:hAnsi="Calibri" w:cs="Calibri"/>
-        </w:rPr>
-        <w:t xml:space="preserve">: </w:t>
-      </w:r>
-      <w:r>
-        <w:rPr>
-          <w:rFonts w:ascii="Calibri" w:eastAsia="Times New Roman" w:hAnsi="Calibri" w:cs="Calibri"/>
-        </w:rPr>
-        <w:t>If used, the URL to the application</w:t>
-      </w:r>
-    </w:p>
-    <w:p>
-      <w:pPr>
-        <w:pStyle w:val="ListParagraph"/>
-        <w:numPr>
-          <w:ilvl w:val="1"/>
-          <w:numId w:val="4"/>
-        </w:numPr>
-        <w:spacing w:after="0"/>
-      </w:pPr>
-      <w:proofErr w:type="spellStart"/>
-      <w:r>
-        <w:rPr>
-          <w:rFonts w:ascii="Consolas" w:eastAsiaTheme="minorHAnsi" w:hAnsi="Consolas" w:cs="Consolas"/>
-          <w:color w:val="0000FF"/>
-          <w:sz w:val="19"/>
-          <w:szCs w:val="19"/>
-        </w:rPr>
-        <w:t>MSTSearchCriteriaHelp</w:t>
-      </w:r>
-      <w:proofErr w:type="spellEnd"/>
-    </w:p>
-    <w:p>
-      <w:pPr>
-        <w:pStyle w:val="ListParagraph"/>
-        <w:numPr>
-          <w:ilvl w:val="2"/>
-          <w:numId w:val="30"/>
-        </w:numPr>
-        <w:spacing w:after="0"/>
-      </w:pPr>
-      <w:r>
-        <w:rPr>
-          <w:rFonts w:ascii="Calibri" w:eastAsia="Times New Roman" w:hAnsi="Calibri" w:cs="Calibri"/>
-          <w:color w:val="E36C0A" w:themeColor="accent6" w:themeShade="BF"/>
-        </w:rPr>
-        <w:t>Space</w:t>
-      </w:r>
-      <w:r>
-        <w:rPr>
-          <w:rFonts w:ascii="Calibri" w:eastAsia="Times New Roman" w:hAnsi="Calibri" w:cs="Calibri"/>
-        </w:rPr>
-        <w:t xml:space="preserve">: </w:t>
-      </w:r>
-      <w:r>
-        <w:t xml:space="preserve">set to </w:t>
-      </w:r>
-      <w:r>
-        <w:rPr>
-          <w:rFonts w:ascii="Calibri" w:eastAsia="Times New Roman" w:hAnsi="Calibri" w:cs="Calibri"/>
-          <w:i/>
-        </w:rPr>
-        <w:t>blank</w:t>
-      </w:r>
-      <w:r>
-        <w:rPr>
-          <w:rFonts w:ascii="Calibri" w:eastAsia="Times New Roman" w:hAnsi="Calibri" w:cs="Calibri"/>
-          <w:i/>
-          <w:vertAlign w:val="superscript"/>
-        </w:rPr>
-        <w:t>2</w:t>
-      </w:r>
-    </w:p>
-    <w:p>
-      <w:pPr>
-        <w:pStyle w:val="ListParagraph"/>
-        <w:numPr>
-          <w:ilvl w:val="2"/>
-          <w:numId w:val="30"/>
-        </w:numPr>
-        <w:spacing w:after="0"/>
-      </w:pPr>
-      <w:r>
-        <w:rPr>
-          <w:rFonts w:ascii="Calibri" w:eastAsia="Times New Roman" w:hAnsi="Calibri" w:cs="Calibri"/>
-          <w:color w:val="E36C0A" w:themeColor="accent6" w:themeShade="BF"/>
-        </w:rPr>
-        <w:t>RMS</w:t>
-      </w:r>
-      <w:r>
-        <w:rPr>
-          <w:rFonts w:ascii="Calibri" w:eastAsia="Times New Roman" w:hAnsi="Calibri" w:cs="Calibri"/>
-        </w:rPr>
-        <w:t xml:space="preserve">: If used, the URL to </w:t>
-      </w:r>
-      <w:r>
-        <w:rPr>
-          <w:rFonts w:ascii="Calibri" w:eastAsia="Times New Roman" w:hAnsi="Calibri" w:cs="Calibri"/>
-        </w:rPr>
-        <w:t>the Search Criteria Help</w:t>
-      </w:r>
-    </w:p>
-    <w:p>
-      <w:pPr>
-        <w:pStyle w:val="ListParagraph"/>
-        <w:numPr>
-          <w:ilvl w:val="1"/>
-          <w:numId w:val="4"/>
-        </w:numPr>
-        <w:spacing w:after="0"/>
-      </w:pPr>
-      <w:proofErr w:type="spellStart"/>
-      <w:r>
-        <w:rPr>
-          <w:rFonts w:ascii="Consolas" w:eastAsiaTheme="minorHAnsi" w:hAnsi="Consolas" w:cs="Consolas"/>
-          <w:color w:val="0000FF"/>
-          <w:sz w:val="19"/>
-          <w:szCs w:val="19"/>
-        </w:rPr>
-        <w:t>MSTSearchResultsHelpLink</w:t>
-      </w:r>
-      <w:proofErr w:type="spellEnd"/>
-    </w:p>
-    <w:p>
-      <w:pPr>
-        <w:pStyle w:val="ListParagraph"/>
-        <w:numPr>
-          <w:ilvl w:val="2"/>
-          <w:numId w:val="30"/>
-        </w:numPr>
-        <w:spacing w:after="0"/>
-      </w:pPr>
-      <w:r>
-        <w:rPr>
-          <w:rFonts w:ascii="Calibri" w:eastAsia="Times New Roman" w:hAnsi="Calibri" w:cs="Calibri"/>
-          <w:color w:val="E36C0A" w:themeColor="accent6" w:themeShade="BF"/>
-        </w:rPr>
-        <w:t>Space</w:t>
-      </w:r>
-      <w:r>
-        <w:rPr>
-          <w:rFonts w:ascii="Calibri" w:eastAsia="Times New Roman" w:hAnsi="Calibri" w:cs="Calibri"/>
-        </w:rPr>
-        <w:t xml:space="preserve">: </w:t>
-      </w:r>
-      <w:r>
-        <w:t xml:space="preserve">set to </w:t>
-      </w:r>
-      <w:r>
-        <w:rPr>
-          <w:rFonts w:ascii="Calibri" w:eastAsia="Times New Roman" w:hAnsi="Calibri" w:cs="Calibri"/>
-          <w:i/>
-        </w:rPr>
-        <w:t>blank</w:t>
-      </w:r>
-      <w:r>
-        <w:rPr>
-          <w:rFonts w:ascii="Calibri" w:eastAsia="Times New Roman" w:hAnsi="Calibri" w:cs="Calibri"/>
-          <w:i/>
-          <w:vertAlign w:val="superscript"/>
-        </w:rPr>
-        <w:t>2</w:t>
-      </w:r>
-    </w:p>
-    <w:p>
-      <w:pPr>
-        <w:pStyle w:val="ListParagraph"/>
-        <w:numPr>
-          <w:ilvl w:val="2"/>
-          <w:numId w:val="30"/>
-        </w:numPr>
-        <w:spacing w:after="0"/>
-      </w:pPr>
-      <w:r>
-        <w:rPr>
-          <w:rFonts w:ascii="Calibri" w:eastAsia="Times New Roman" w:hAnsi="Calibri" w:cs="Calibri"/>
-          <w:color w:val="E36C0A" w:themeColor="accent6" w:themeShade="BF"/>
-        </w:rPr>
-        <w:t>RMS</w:t>
-      </w:r>
-      <w:r>
-        <w:rPr>
-          <w:rFonts w:ascii="Calibri" w:eastAsia="Times New Roman" w:hAnsi="Calibri" w:cs="Calibri"/>
-        </w:rPr>
-        <w:t xml:space="preserve">: If used, the URL to </w:t>
-      </w:r>
-      <w:r>
-        <w:rPr>
-          <w:rFonts w:ascii="Calibri" w:eastAsia="Times New Roman" w:hAnsi="Calibri" w:cs="Calibri"/>
-        </w:rPr>
-        <w:t>the Results Help</w:t>
-      </w:r>
-    </w:p>
-    <w:p>
-      <w:pPr>
-        <w:pStyle w:val="ListParagraph"/>
-        <w:numPr>
-          <w:ilvl w:val="1"/>
-          <w:numId w:val="4"/>
-        </w:numPr>
-        <w:spacing w:after="0"/>
-      </w:pPr>
-      <w:proofErr w:type="spellStart"/>
-      <w:r>
-        <w:rPr>
-          <w:rFonts w:ascii="Consolas" w:eastAsiaTheme="minorHAnsi" w:hAnsi="Consolas" w:cs="Consolas"/>
-          <w:color w:val="0000FF"/>
-          <w:sz w:val="19"/>
-          <w:szCs w:val="19"/>
-        </w:rPr>
-        <w:t>MSTSearchResultsDetailHelpLink</w:t>
-      </w:r>
-      <w:proofErr w:type="spellEnd"/>
-      <w:r>
-        <w:rPr>
-          <w:rFonts w:ascii="Calibri" w:eastAsia="Times New Roman" w:hAnsi="Calibri" w:cs="Calibri"/>
-        </w:rPr>
-        <w:t xml:space="preserve"> </w:t>
-      </w:r>
-    </w:p>
-    <w:p>
-      <w:pPr>
-        <w:pStyle w:val="ListParagraph"/>
-        <w:numPr>
-          <w:ilvl w:val="2"/>
-          <w:numId w:val="30"/>
-        </w:numPr>
-        <w:spacing w:after="0"/>
-      </w:pPr>
-      <w:r>
-        <w:rPr>
-          <w:rFonts w:ascii="Calibri" w:eastAsia="Times New Roman" w:hAnsi="Calibri" w:cs="Calibri"/>
-          <w:color w:val="E36C0A" w:themeColor="accent6" w:themeShade="BF"/>
-        </w:rPr>
-        <w:t>Space</w:t>
-      </w:r>
-      <w:r>
-        <w:rPr>
-          <w:rFonts w:ascii="Calibri" w:eastAsia="Times New Roman" w:hAnsi="Calibri" w:cs="Calibri"/>
-        </w:rPr>
-        <w:t xml:space="preserve">: </w:t>
-      </w:r>
-      <w:r>
-        <w:t xml:space="preserve">set to </w:t>
-      </w:r>
-      <w:r>
-        <w:rPr>
-          <w:rFonts w:ascii="Calibri" w:eastAsia="Times New Roman" w:hAnsi="Calibri" w:cs="Calibri"/>
-          <w:i/>
-        </w:rPr>
-        <w:t>blank</w:t>
-      </w:r>
-      <w:r>
-        <w:rPr>
-          <w:rFonts w:ascii="Calibri" w:eastAsia="Times New Roman" w:hAnsi="Calibri" w:cs="Calibri"/>
-          <w:i/>
-          <w:vertAlign w:val="superscript"/>
-        </w:rPr>
-        <w:t>2</w:t>
-      </w:r>
-    </w:p>
-    <w:p>
-      <w:pPr>
-        <w:pStyle w:val="ListParagraph"/>
-        <w:numPr>
-          <w:ilvl w:val="2"/>
-          <w:numId w:val="30"/>
-        </w:numPr>
-        <w:spacing w:after="0"/>
-      </w:pPr>
-      <w:r>
-        <w:rPr>
-          <w:rFonts w:ascii="Calibri" w:eastAsia="Times New Roman" w:hAnsi="Calibri" w:cs="Calibri"/>
-          <w:color w:val="E36C0A" w:themeColor="accent6" w:themeShade="BF"/>
-        </w:rPr>
-        <w:lastRenderedPageBreak/>
-        <w:t>RMS</w:t>
-      </w:r>
-      <w:r>
-        <w:rPr>
-          <w:rFonts w:ascii="Calibri" w:eastAsia="Times New Roman" w:hAnsi="Calibri" w:cs="Calibri"/>
-        </w:rPr>
-        <w:t xml:space="preserve">: If used, the URL to </w:t>
-      </w:r>
-      <w:r>
-        <w:rPr>
-          <w:rFonts w:ascii="Calibri" w:eastAsia="Times New Roman" w:hAnsi="Calibri" w:cs="Calibri"/>
-        </w:rPr>
-        <w:t>the Result Details Help</w:t>
-      </w:r>
-    </w:p>
-    <w:p>
-      <w:pPr>
-        <w:rPr>
-          <w:rFonts w:ascii="Consolas" w:eastAsiaTheme="minorHAnsi" w:hAnsi="Consolas" w:cs="Consolas"/>
-          <w:color w:val="008000"/>
-          <w:sz w:val="19"/>
-          <w:szCs w:val="19"/>
-        </w:rPr>
-      </w:pPr>
-    </w:p>
-    <w:p>
-      <w:pPr>
-        <w:pStyle w:val="ListParagraph"/>
-        <w:spacing w:after="0"/>
-        <w:ind w:left="1440"/>
-        <w:textAlignment w:val="center"/>
-        <w:rPr>
-          <w:rFonts w:ascii="Calibri" w:eastAsia="Times New Roman" w:hAnsi="Calibri" w:cs="Calibri"/>
-        </w:rPr>
-      </w:pPr>
-      <w:r>
-        <w:rPr>
-          <w:rFonts w:ascii="Consolas" w:eastAsiaTheme="minorHAnsi" w:hAnsi="Consolas" w:cs="Consolas"/>
-          <w:color w:val="008000"/>
-          <w:sz w:val="19"/>
-          <w:szCs w:val="19"/>
-        </w:rPr>
-        <w:t>Additional RMS Settings</w:t>
-      </w:r>
-    </w:p>
-    <w:p>
-      <w:pPr>
-        <w:pStyle w:val="ListParagraph"/>
-        <w:numPr>
-          <w:ilvl w:val="1"/>
-          <w:numId w:val="4"/>
-        </w:numPr>
-        <w:spacing w:after="0"/>
-      </w:pPr>
-      <w:proofErr w:type="spellStart"/>
-      <w:r>
-        <w:rPr>
-          <w:rFonts w:ascii="Consolas" w:eastAsiaTheme="minorHAnsi" w:hAnsi="Consolas" w:cs="Consolas"/>
-          <w:color w:val="0000FF"/>
-          <w:sz w:val="19"/>
-          <w:szCs w:val="19"/>
-        </w:rPr>
-        <w:t>RmsHelpBaseLink</w:t>
-      </w:r>
-      <w:proofErr w:type="spellEnd"/>
-    </w:p>
-    <w:p>
-      <w:pPr>
-        <w:pStyle w:val="ListParagraph"/>
-        <w:numPr>
-          <w:ilvl w:val="2"/>
-          <w:numId w:val="30"/>
-        </w:numPr>
-        <w:spacing w:after="0"/>
-      </w:pPr>
-      <w:r>
-        <w:rPr>
-          <w:rFonts w:ascii="Calibri" w:eastAsia="Times New Roman" w:hAnsi="Calibri" w:cs="Calibri"/>
-          <w:color w:val="E36C0A" w:themeColor="accent6" w:themeShade="BF"/>
-        </w:rPr>
-        <w:t>Space</w:t>
-      </w:r>
-      <w:r>
-        <w:rPr>
-          <w:rFonts w:ascii="Calibri" w:eastAsia="Times New Roman" w:hAnsi="Calibri" w:cs="Calibri"/>
-        </w:rPr>
-        <w:t xml:space="preserve">: </w:t>
-      </w:r>
-      <w:r>
-        <w:t xml:space="preserve">set to </w:t>
-      </w:r>
-      <w:r>
-        <w:rPr>
-          <w:rFonts w:ascii="Calibri" w:eastAsia="Times New Roman" w:hAnsi="Calibri" w:cs="Calibri"/>
-          <w:i/>
-        </w:rPr>
-        <w:t>blank</w:t>
-      </w:r>
-      <w:r>
-        <w:rPr>
-          <w:rFonts w:ascii="Calibri" w:eastAsia="Times New Roman" w:hAnsi="Calibri" w:cs="Calibri"/>
-          <w:i/>
-          <w:vertAlign w:val="superscript"/>
-        </w:rPr>
-        <w:t>2</w:t>
-      </w:r>
-    </w:p>
-    <w:p>
-      <w:pPr>
-        <w:pStyle w:val="ListParagraph"/>
-        <w:numPr>
-          <w:ilvl w:val="2"/>
-          <w:numId w:val="30"/>
-        </w:numPr>
-        <w:spacing w:after="0"/>
-      </w:pPr>
-      <w:r>
-        <w:rPr>
-          <w:rFonts w:ascii="Calibri" w:eastAsia="Times New Roman" w:hAnsi="Calibri" w:cs="Calibri"/>
-          <w:color w:val="E36C0A" w:themeColor="accent6" w:themeShade="BF"/>
-        </w:rPr>
-        <w:t>RMS</w:t>
-      </w:r>
-      <w:r>
-        <w:rPr>
-          <w:rFonts w:ascii="Calibri" w:eastAsia="Times New Roman" w:hAnsi="Calibri" w:cs="Calibri"/>
-        </w:rPr>
-        <w:t xml:space="preserve">: A base URL where RMS help files will be located. It should start with </w:t>
-      </w:r>
-      <w:r>
-        <w:rPr>
-          <w:rFonts w:ascii="Consolas" w:eastAsia="Times New Roman" w:hAnsi="Consolas" w:cs="Calibri"/>
-          <w:color w:val="1F497D" w:themeColor="text2"/>
-          <w:sz w:val="19"/>
-          <w:szCs w:val="19"/>
-        </w:rPr>
-        <w:t>http(s)://</w:t>
-      </w:r>
-      <w:r>
-        <w:rPr>
-          <w:rFonts w:ascii="Calibri" w:eastAsia="Times New Roman" w:hAnsi="Calibri" w:cs="Calibri"/>
-          <w:color w:val="1F497D" w:themeColor="text2"/>
-        </w:rPr>
-        <w:t xml:space="preserve"> </w:t>
-      </w:r>
-      <w:r>
-        <w:rPr>
-          <w:rFonts w:ascii="Calibri" w:eastAsia="Times New Roman" w:hAnsi="Calibri" w:cs="Calibri"/>
-        </w:rPr>
-        <w:t xml:space="preserve">and end with a </w:t>
-      </w:r>
-      <w:r>
-        <w:rPr>
-          <w:rFonts w:ascii="Consolas" w:eastAsia="Times New Roman" w:hAnsi="Consolas" w:cs="Calibri"/>
-          <w:color w:val="1F497D" w:themeColor="text2"/>
-          <w:sz w:val="19"/>
-          <w:szCs w:val="19"/>
-        </w:rPr>
-        <w:t>/</w:t>
-      </w:r>
-    </w:p>
-    <w:p>
-      <w:pPr>
-        <w:pStyle w:val="ListParagraph"/>
-        <w:numPr>
-          <w:ilvl w:val="1"/>
-          <w:numId w:val="4"/>
-        </w:numPr>
-        <w:spacing w:after="0"/>
-      </w:pPr>
-      <w:proofErr w:type="spellStart"/>
-      <w:r>
-        <w:rPr>
-          <w:rFonts w:ascii="Consolas" w:eastAsiaTheme="minorHAnsi" w:hAnsi="Consolas" w:cs="Consolas"/>
-          <w:color w:val="0000FF"/>
-          <w:sz w:val="19"/>
-          <w:szCs w:val="19"/>
-        </w:rPr>
-        <w:t>RmsHelpBaseLinkNew</w:t>
-      </w:r>
-      <w:proofErr w:type="spellEnd"/>
-    </w:p>
-    <w:p>
-      <w:pPr>
-        <w:pStyle w:val="ListParagraph"/>
-        <w:numPr>
-          <w:ilvl w:val="2"/>
-          <w:numId w:val="30"/>
-        </w:numPr>
-        <w:spacing w:after="0"/>
-      </w:pPr>
-      <w:r>
-        <w:rPr>
-          <w:rFonts w:ascii="Calibri" w:eastAsia="Times New Roman" w:hAnsi="Calibri" w:cs="Calibri"/>
-          <w:color w:val="E36C0A" w:themeColor="accent6" w:themeShade="BF"/>
-        </w:rPr>
-        <w:t>Space</w:t>
-      </w:r>
-      <w:r>
-        <w:rPr>
-          <w:rFonts w:ascii="Calibri" w:eastAsia="Times New Roman" w:hAnsi="Calibri" w:cs="Calibri"/>
-        </w:rPr>
-        <w:t xml:space="preserve">: </w:t>
-      </w:r>
-      <w:r>
-        <w:t xml:space="preserve">set to </w:t>
-      </w:r>
-      <w:r>
-        <w:rPr>
-          <w:rFonts w:ascii="Calibri" w:eastAsia="Times New Roman" w:hAnsi="Calibri" w:cs="Calibri"/>
-          <w:i/>
-        </w:rPr>
-        <w:t>blank</w:t>
-      </w:r>
-      <w:r>
-        <w:rPr>
-          <w:rFonts w:ascii="Calibri" w:eastAsia="Times New Roman" w:hAnsi="Calibri" w:cs="Calibri"/>
-          <w:i/>
-          <w:vertAlign w:val="superscript"/>
-        </w:rPr>
-        <w:t>2</w:t>
-      </w:r>
-    </w:p>
-    <w:p>
-      <w:pPr>
-        <w:pStyle w:val="ListParagraph"/>
-        <w:numPr>
-          <w:ilvl w:val="2"/>
-          <w:numId w:val="30"/>
-        </w:numPr>
-        <w:spacing w:after="0"/>
-      </w:pPr>
-      <w:r>
-        <w:rPr>
-          <w:rFonts w:ascii="Calibri" w:eastAsia="Times New Roman" w:hAnsi="Calibri" w:cs="Calibri"/>
-          <w:color w:val="E36C0A" w:themeColor="accent6" w:themeShade="BF"/>
-        </w:rPr>
-        <w:t>RMS</w:t>
-      </w:r>
-      <w:r>
-        <w:rPr>
-          <w:rFonts w:ascii="Calibri" w:eastAsia="Times New Roman" w:hAnsi="Calibri" w:cs="Calibri"/>
-        </w:rPr>
-        <w:t xml:space="preserve">: A base URL where RMS help files will be located. It should start with </w:t>
-      </w:r>
-      <w:r>
-        <w:rPr>
-          <w:rFonts w:ascii="Consolas" w:eastAsia="Times New Roman" w:hAnsi="Consolas" w:cs="Calibri"/>
-          <w:color w:val="1F497D" w:themeColor="text2"/>
-          <w:sz w:val="19"/>
-          <w:szCs w:val="19"/>
-        </w:rPr>
-        <w:t>http(s)://</w:t>
-      </w:r>
-      <w:r>
-        <w:rPr>
-          <w:rFonts w:ascii="Calibri" w:eastAsia="Times New Roman" w:hAnsi="Calibri" w:cs="Calibri"/>
-          <w:color w:val="1F497D" w:themeColor="text2"/>
-        </w:rPr>
-        <w:t xml:space="preserve"> </w:t>
-      </w:r>
-      <w:r>
-        <w:rPr>
-          <w:rFonts w:ascii="Calibri" w:eastAsia="Times New Roman" w:hAnsi="Calibri" w:cs="Calibri"/>
-        </w:rPr>
-        <w:t xml:space="preserve">and end with a </w:t>
-      </w:r>
-      <w:r>
-        <w:rPr>
-          <w:rFonts w:ascii="Consolas" w:eastAsia="Times New Roman" w:hAnsi="Consolas" w:cs="Calibri"/>
-          <w:color w:val="1F497D" w:themeColor="text2"/>
-          <w:sz w:val="19"/>
-          <w:szCs w:val="19"/>
-        </w:rPr>
-        <w:t>/</w:t>
-      </w:r>
-    </w:p>
-    <w:p/>
-    <w:p>
-      <w:pPr>
-        <w:pStyle w:val="ListParagraph"/>
-        <w:spacing w:after="0"/>
-        <w:ind w:left="1440"/>
-        <w:textAlignment w:val="center"/>
-        <w:rPr>
-          <w:rFonts w:ascii="Calibri" w:eastAsia="Times New Roman" w:hAnsi="Calibri" w:cs="Calibri"/>
-        </w:rPr>
-      </w:pPr>
-      <w:r>
-        <w:rPr>
-          <w:rFonts w:ascii="Consolas" w:eastAsiaTheme="minorHAnsi" w:hAnsi="Consolas" w:cs="Consolas"/>
-          <w:color w:val="008000"/>
-          <w:sz w:val="19"/>
-          <w:szCs w:val="19"/>
-        </w:rPr>
-        <w:t>Project Map Settings</w:t>
-      </w:r>
-    </w:p>
-    <w:p>
-      <w:pPr>
-        <w:pStyle w:val="ListParagraph"/>
-        <w:numPr>
-          <w:ilvl w:val="1"/>
-          <w:numId w:val="4"/>
-        </w:numPr>
-        <w:spacing w:after="0"/>
-        <w:textAlignment w:val="center"/>
-        <w:rPr>
-          <w:rFonts w:ascii="Calibri" w:eastAsia="Times New Roman" w:hAnsi="Calibri" w:cs="Calibri"/>
-        </w:rPr>
-      </w:pPr>
-      <w:proofErr w:type="spellStart"/>
-      <w:r>
-        <w:rPr>
-          <w:rFonts w:ascii="Consolas" w:eastAsiaTheme="minorHAnsi" w:hAnsi="Consolas" w:cs="Consolas"/>
-          <w:color w:val="0000FF"/>
-          <w:sz w:val="19"/>
-          <w:szCs w:val="19"/>
-        </w:rPr>
-        <w:t>IsProjectMapEnabled</w:t>
-      </w:r>
-      <w:proofErr w:type="spellEnd"/>
-    </w:p>
-    <w:p>
-      <w:pPr>
-        <w:pStyle w:val="ListParagraph"/>
-        <w:numPr>
-          <w:ilvl w:val="2"/>
-          <w:numId w:val="30"/>
-        </w:numPr>
-        <w:spacing w:after="0"/>
-        <w:textAlignment w:val="center"/>
-        <w:rPr>
-          <w:rFonts w:ascii="Calibri" w:eastAsia="Times New Roman" w:hAnsi="Calibri" w:cs="Calibri"/>
-        </w:rPr>
-      </w:pPr>
-      <w:r>
-        <w:rPr>
-          <w:rFonts w:ascii="Calibri" w:eastAsia="Times New Roman" w:hAnsi="Calibri" w:cs="Calibri"/>
-          <w:color w:val="E36C0A" w:themeColor="accent6" w:themeShade="BF"/>
-        </w:rPr>
-        <w:t>Space</w:t>
-      </w:r>
-      <w:r>
-        <w:rPr>
-          <w:rFonts w:ascii="Calibri" w:eastAsia="Times New Roman" w:hAnsi="Calibri" w:cs="Calibri"/>
-        </w:rPr>
-        <w:t xml:space="preserve">: </w:t>
-      </w:r>
-      <w:r>
-        <w:rPr>
-          <w:rFonts w:ascii="Calibri" w:eastAsia="Times New Roman" w:hAnsi="Calibri" w:cs="Calibri"/>
-        </w:rPr>
         <w:t xml:space="preserve">set to </w:t>
       </w:r>
       <w:r>
@@ -6003,7 +4933,7 @@
           <w:color w:val="1F497D" w:themeColor="text2"/>
           <w:sz w:val="20"/>
         </w:rPr>
-        <w:t>false</w:t>
+        <w:t>true</w:t>
       </w:r>
     </w:p>
     <w:p>
@@ -6014,10 +4944,6 @@
           <w:numId w:val="30"/>
         </w:numPr>
         <w:spacing w:after="0"/>
-        <w:textAlignment w:val="center"/>
-        <w:rPr>
-          <w:rFonts w:ascii="Calibri" w:eastAsia="Times New Roman" w:hAnsi="Calibri" w:cs="Calibri"/>
-        </w:rPr>
       </w:pPr>
       <w:r>
         <w:rPr>
@@ -6027,22 +4953,13 @@
         <w:t>RMS</w:t>
       </w:r>
       <w:r>
-        <w:rPr>
-          <w:rFonts w:ascii="Calibri" w:eastAsia="Times New Roman" w:hAnsi="Calibri" w:cs="Calibri"/>
-        </w:rPr>
         <w:t xml:space="preserve">: </w:t>
       </w:r>
       <w:r>
-        <w:rPr>
-          <w:rFonts w:cstheme="minorHAnsi"/>
-        </w:rPr>
-        <w:t xml:space="preserve">set </w:t>
-      </w:r>
-      <w:r>
-        <w:rPr>
-          <w:rFonts w:cstheme="minorHAnsi"/>
-        </w:rPr>
-        <w:t xml:space="preserve">to </w:t>
+        <w:t>keep at</w:t>
+      </w:r>
+      <w:r>
+        <w:t xml:space="preserve"> </w:t>
       </w:r>
       <w:r>
         <w:rPr>
@@ -6050,6 +4967,1099 @@
           <w:color w:val="1F497D" w:themeColor="text2"/>
           <w:sz w:val="20"/>
         </w:rPr>
+        <w:t>false</w:t>
+      </w:r>
+    </w:p>
+    <w:p>
+      <w:pPr>
+        <w:pStyle w:val="ListParagraph"/>
+        <w:spacing w:after="0"/>
+        <w:ind w:left="1440"/>
+        <w:textAlignment w:val="center"/>
+        <w:rPr>
+          <w:rFonts w:ascii="Calibri" w:eastAsia="Times New Roman" w:hAnsi="Calibri" w:cs="Calibri"/>
+        </w:rPr>
+      </w:pPr>
+    </w:p>
+    <w:p>
+      <w:pPr>
+        <w:pStyle w:val="ListParagraph"/>
+        <w:spacing w:after="0"/>
+        <w:ind w:left="1440"/>
+        <w:textAlignment w:val="center"/>
+        <w:rPr>
+          <w:rFonts w:ascii="Calibri" w:eastAsia="Times New Roman" w:hAnsi="Calibri" w:cs="Calibri"/>
+        </w:rPr>
+      </w:pPr>
+      <w:r>
+        <w:rPr>
+          <w:rFonts w:ascii="Consolas" w:eastAsiaTheme="minorHAnsi" w:hAnsi="Consolas" w:cs="Consolas"/>
+          <w:color w:val="008000"/>
+          <w:sz w:val="19"/>
+          <w:szCs w:val="19"/>
+        </w:rPr>
+        <w:t>Hours offset</w:t>
+      </w:r>
+    </w:p>
+    <w:p>
+      <w:pPr>
+        <w:pStyle w:val="ListParagraph"/>
+        <w:numPr>
+          <w:ilvl w:val="1"/>
+          <w:numId w:val="4"/>
+        </w:numPr>
+        <w:spacing w:after="0"/>
+        <w:textAlignment w:val="center"/>
+        <w:rPr>
+          <w:rFonts w:ascii="Calibri" w:eastAsia="Times New Roman" w:hAnsi="Calibri" w:cs="Calibri"/>
+        </w:rPr>
+      </w:pPr>
+      <w:proofErr w:type="spellStart"/>
+      <w:r>
+        <w:rPr>
+          <w:rFonts w:ascii="Consolas" w:eastAsiaTheme="minorHAnsi" w:hAnsi="Consolas" w:cs="Consolas"/>
+          <w:color w:val="0000FF"/>
+          <w:sz w:val="19"/>
+          <w:szCs w:val="19"/>
+        </w:rPr>
+        <w:t>DatabaseESTOffset</w:t>
+      </w:r>
+      <w:proofErr w:type="spellEnd"/>
+      <w:r>
+        <w:rPr>
+          <w:rFonts w:ascii="Calibri" w:eastAsia="Times New Roman" w:hAnsi="Calibri" w:cs="Calibri"/>
+        </w:rPr>
+        <w:t xml:space="preserve"> – adjust based on whether your DB is in a different time zone than your web server. 0 means it’s in the same zone.</w:t>
+      </w:r>
+    </w:p>
+    <w:p>
+      <w:pPr>
+        <w:pStyle w:val="ListParagraph"/>
+        <w:numPr>
+          <w:ilvl w:val="1"/>
+          <w:numId w:val="4"/>
+        </w:numPr>
+        <w:spacing w:after="0"/>
+        <w:textAlignment w:val="center"/>
+        <w:rPr>
+          <w:rFonts w:ascii="Calibri" w:eastAsia="Times New Roman" w:hAnsi="Calibri" w:cs="Calibri"/>
+        </w:rPr>
+      </w:pPr>
+      <w:proofErr w:type="spellStart"/>
+      <w:r>
+        <w:rPr>
+          <w:rFonts w:ascii="Consolas" w:eastAsiaTheme="minorHAnsi" w:hAnsi="Consolas" w:cs="Consolas"/>
+          <w:color w:val="0000FF"/>
+          <w:sz w:val="19"/>
+          <w:szCs w:val="19"/>
+        </w:rPr>
+        <w:t>CanCreateWorkspaceWithoutPtmTrackingNumber</w:t>
+      </w:r>
+      <w:proofErr w:type="spellEnd"/>
+    </w:p>
+    <w:p>
+      <w:pPr>
+        <w:pStyle w:val="ListParagraph"/>
+        <w:numPr>
+          <w:ilvl w:val="2"/>
+          <w:numId w:val="30"/>
+        </w:numPr>
+        <w:spacing w:after="0"/>
+        <w:textAlignment w:val="center"/>
+        <w:rPr>
+          <w:rFonts w:ascii="Calibri" w:eastAsia="Times New Roman" w:hAnsi="Calibri" w:cs="Calibri"/>
+        </w:rPr>
+      </w:pPr>
+      <w:r>
+        <w:rPr>
+          <w:rFonts w:ascii="Calibri" w:eastAsia="Times New Roman" w:hAnsi="Calibri" w:cs="Calibri"/>
+          <w:color w:val="E36C0A" w:themeColor="accent6" w:themeShade="BF"/>
+        </w:rPr>
+        <w:t>Space</w:t>
+      </w:r>
+      <w:r>
+        <w:rPr>
+          <w:rFonts w:ascii="Calibri" w:eastAsia="Times New Roman" w:hAnsi="Calibri" w:cs="Calibri"/>
+        </w:rPr>
+        <w:t xml:space="preserve">: </w:t>
+      </w:r>
+      <w:r>
+        <w:rPr>
+          <w:rFonts w:ascii="Calibri" w:eastAsia="Times New Roman" w:hAnsi="Calibri" w:cs="Calibri"/>
+        </w:rPr>
+        <w:t xml:space="preserve">We have this </w:t>
+      </w:r>
+      <w:r>
+        <w:rPr>
+          <w:rFonts w:ascii="Calibri" w:eastAsia="Times New Roman" w:hAnsi="Calibri" w:cs="Calibri"/>
+          <w:i/>
+          <w:iCs/>
+        </w:rPr>
+        <w:t>blank</w:t>
+      </w:r>
+      <w:r>
+        <w:rPr>
+          <w:rFonts w:ascii="Calibri" w:eastAsia="Times New Roman" w:hAnsi="Calibri" w:cs="Calibri"/>
+        </w:rPr>
+        <w:t>, but please verify this with Frank – there may be a group of users that needs to be added here.</w:t>
+      </w:r>
+    </w:p>
+    <w:p>
+      <w:pPr>
+        <w:pStyle w:val="ListParagraph"/>
+        <w:numPr>
+          <w:ilvl w:val="2"/>
+          <w:numId w:val="30"/>
+        </w:numPr>
+        <w:spacing w:after="0"/>
+      </w:pPr>
+      <w:r>
+        <w:rPr>
+          <w:rFonts w:ascii="Calibri" w:eastAsia="Times New Roman" w:hAnsi="Calibri" w:cs="Calibri"/>
+          <w:color w:val="E36C0A" w:themeColor="accent6" w:themeShade="BF"/>
+        </w:rPr>
+        <w:t>RMS</w:t>
+      </w:r>
+      <w:r>
+        <w:t xml:space="preserve">: </w:t>
+      </w:r>
+      <w:r>
+        <w:t>keep at</w:t>
+      </w:r>
+      <w:r>
+        <w:rPr>
+          <w:rFonts w:ascii="Calibri" w:eastAsia="Times New Roman" w:hAnsi="Calibri" w:cs="Calibri"/>
+          <w:i/>
+          <w:iCs/>
+        </w:rPr>
+        <w:t xml:space="preserve"> </w:t>
+      </w:r>
+      <w:r>
+        <w:rPr>
+          <w:rFonts w:ascii="Calibri" w:eastAsia="Times New Roman" w:hAnsi="Calibri" w:cs="Calibri"/>
+          <w:i/>
+          <w:iCs/>
+        </w:rPr>
+        <w:t>blank</w:t>
+      </w:r>
+    </w:p>
+    <w:p>
+      <w:pPr>
+        <w:pStyle w:val="ListParagraph"/>
+        <w:spacing w:after="0"/>
+        <w:ind w:left="1440"/>
+        <w:textAlignment w:val="center"/>
+        <w:rPr>
+          <w:rFonts w:ascii="Calibri" w:eastAsia="Times New Roman" w:hAnsi="Calibri" w:cs="Calibri"/>
+        </w:rPr>
+      </w:pPr>
+    </w:p>
+    <w:p>
+      <w:pPr>
+        <w:pStyle w:val="ListParagraph"/>
+        <w:spacing w:after="0"/>
+        <w:ind w:left="1440"/>
+        <w:textAlignment w:val="center"/>
+        <w:rPr>
+          <w:rFonts w:ascii="Calibri" w:eastAsia="Times New Roman" w:hAnsi="Calibri" w:cs="Calibri"/>
+        </w:rPr>
+      </w:pPr>
+      <w:proofErr w:type="spellStart"/>
+      <w:r>
+        <w:rPr>
+          <w:rFonts w:ascii="Consolas" w:eastAsiaTheme="minorHAnsi" w:hAnsi="Consolas" w:cs="Consolas"/>
+          <w:color w:val="008000"/>
+          <w:sz w:val="19"/>
+          <w:szCs w:val="19"/>
+        </w:rPr>
+        <w:t>Piwik</w:t>
+      </w:r>
+      <w:proofErr w:type="spellEnd"/>
+      <w:r>
+        <w:rPr>
+          <w:rFonts w:ascii="Consolas" w:eastAsiaTheme="minorHAnsi" w:hAnsi="Consolas" w:cs="Consolas"/>
+          <w:color w:val="008000"/>
+          <w:sz w:val="19"/>
+          <w:szCs w:val="19"/>
+        </w:rPr>
+        <w:t xml:space="preserve"> Settings</w:t>
+      </w:r>
+    </w:p>
+    <w:p>
+      <w:pPr>
+        <w:pStyle w:val="ListParagraph"/>
+        <w:numPr>
+          <w:ilvl w:val="1"/>
+          <w:numId w:val="4"/>
+        </w:numPr>
+        <w:spacing w:after="0"/>
+        <w:textAlignment w:val="center"/>
+        <w:rPr>
+          <w:rFonts w:ascii="Calibri" w:eastAsia="Times New Roman" w:hAnsi="Calibri" w:cs="Calibri"/>
+        </w:rPr>
+      </w:pPr>
+      <w:proofErr w:type="spellStart"/>
+      <w:r>
+        <w:rPr>
+          <w:rFonts w:ascii="Consolas" w:eastAsiaTheme="minorHAnsi" w:hAnsi="Consolas" w:cs="Consolas"/>
+          <w:color w:val="0000FF"/>
+          <w:sz w:val="19"/>
+          <w:szCs w:val="19"/>
+        </w:rPr>
+        <w:t>DisablePiwik</w:t>
+      </w:r>
+      <w:proofErr w:type="spellEnd"/>
+      <w:r>
+        <w:rPr>
+          <w:rStyle w:val="FootnoteReference"/>
+          <w:rFonts w:eastAsiaTheme="minorHAnsi" w:cs="Consolas"/>
+        </w:rPr>
+        <w:footnoteReference w:id="3"/>
+      </w:r>
+      <w:r>
+        <w:t xml:space="preserve"> – set this to </w:t>
+      </w:r>
+      <w:r>
+        <w:rPr>
+          <w:rFonts w:ascii="Consolas" w:hAnsi="Consolas" w:cs="Consolas"/>
+          <w:sz w:val="20"/>
+        </w:rPr>
+        <w:t>true</w:t>
+      </w:r>
+      <w:r>
+        <w:rPr>
+          <w:sz w:val="20"/>
+        </w:rPr>
+        <w:t xml:space="preserve"> </w:t>
+      </w:r>
+      <w:r>
+        <w:t xml:space="preserve">(to not track the website usage via </w:t>
+      </w:r>
+      <w:proofErr w:type="spellStart"/>
+      <w:r>
+        <w:t>piwik</w:t>
+      </w:r>
+      <w:proofErr w:type="spellEnd"/>
+      <w:r>
+        <w:t>)</w:t>
+      </w:r>
+      <w:r>
+        <w:t xml:space="preserve">. </w:t>
+      </w:r>
+      <w:r>
+        <w:rPr>
+          <w:rFonts w:ascii="Calibri" w:eastAsia="Times New Roman" w:hAnsi="Calibri" w:cs="Calibri"/>
+        </w:rPr>
+        <w:t>I</w:t>
+      </w:r>
+      <w:r>
+        <w:rPr>
+          <w:rFonts w:ascii="Calibri" w:eastAsia="Times New Roman" w:hAnsi="Calibri" w:cs="Calibri"/>
+        </w:rPr>
+        <w:t xml:space="preserve">gnore the other </w:t>
+      </w:r>
+      <w:proofErr w:type="spellStart"/>
+      <w:r>
+        <w:rPr>
+          <w:rFonts w:ascii="Calibri" w:eastAsia="Times New Roman" w:hAnsi="Calibri" w:cs="Calibri"/>
+        </w:rPr>
+        <w:t>piwik</w:t>
+      </w:r>
+      <w:proofErr w:type="spellEnd"/>
+      <w:r>
+        <w:rPr>
+          <w:rFonts w:ascii="Calibri" w:eastAsia="Times New Roman" w:hAnsi="Calibri" w:cs="Calibri"/>
+        </w:rPr>
+        <w:t xml:space="preserve"> settings once you disable it</w:t>
+      </w:r>
+    </w:p>
+    <w:p>
+      <w:pPr>
+        <w:pStyle w:val="ListParagraph"/>
+        <w:spacing w:after="0"/>
+        <w:ind w:left="1440"/>
+      </w:pPr>
+    </w:p>
+    <w:p>
+      <w:pPr>
+        <w:pStyle w:val="ListParagraph"/>
+        <w:spacing w:after="0"/>
+        <w:ind w:left="1440"/>
+      </w:pPr>
+      <w:r>
+        <w:rPr>
+          <w:rFonts w:ascii="Consolas" w:eastAsiaTheme="minorHAnsi" w:hAnsi="Consolas" w:cs="Consolas"/>
+          <w:color w:val="008000"/>
+          <w:sz w:val="19"/>
+          <w:szCs w:val="19"/>
+        </w:rPr>
+        <w:t>MST Measure / Metrics</w:t>
+      </w:r>
+    </w:p>
+    <w:p>
+      <w:pPr>
+        <w:pStyle w:val="ListParagraph"/>
+        <w:numPr>
+          <w:ilvl w:val="1"/>
+          <w:numId w:val="4"/>
+        </w:numPr>
+        <w:spacing w:after="0"/>
+      </w:pPr>
+      <w:proofErr w:type="spellStart"/>
+      <w:r>
+        <w:rPr>
+          <w:rFonts w:ascii="Consolas" w:eastAsiaTheme="minorHAnsi" w:hAnsi="Consolas" w:cs="Consolas"/>
+          <w:color w:val="0000FF"/>
+          <w:sz w:val="19"/>
+          <w:szCs w:val="19"/>
+        </w:rPr>
+        <w:t>MstMetricsUrl</w:t>
+      </w:r>
+      <w:proofErr w:type="spellEnd"/>
+    </w:p>
+    <w:p>
+      <w:pPr>
+        <w:pStyle w:val="ListParagraph"/>
+        <w:numPr>
+          <w:ilvl w:val="2"/>
+          <w:numId w:val="30"/>
+        </w:numPr>
+        <w:spacing w:after="0"/>
+      </w:pPr>
+      <w:r>
+        <w:rPr>
+          <w:rFonts w:ascii="Calibri" w:eastAsia="Times New Roman" w:hAnsi="Calibri" w:cs="Calibri"/>
+          <w:color w:val="E36C0A" w:themeColor="accent6" w:themeShade="BF"/>
+        </w:rPr>
+        <w:t>Space</w:t>
+      </w:r>
+      <w:r>
+        <w:rPr>
+          <w:rFonts w:ascii="Calibri" w:eastAsia="Times New Roman" w:hAnsi="Calibri" w:cs="Calibri"/>
+        </w:rPr>
+        <w:t xml:space="preserve">: </w:t>
+      </w:r>
+      <w:r>
+        <w:t xml:space="preserve">set to </w:t>
+      </w:r>
+      <w:r>
+        <w:rPr>
+          <w:rFonts w:ascii="Calibri" w:eastAsia="Times New Roman" w:hAnsi="Calibri" w:cs="Calibri"/>
+          <w:i/>
+        </w:rPr>
+        <w:t>blank</w:t>
+      </w:r>
+      <w:r>
+        <w:rPr>
+          <w:rFonts w:ascii="Calibri" w:eastAsia="Times New Roman" w:hAnsi="Calibri" w:cs="Calibri"/>
+          <w:i/>
+          <w:vertAlign w:val="superscript"/>
+        </w:rPr>
+        <w:t>2</w:t>
+      </w:r>
+    </w:p>
+    <w:p>
+      <w:pPr>
+        <w:pStyle w:val="ListParagraph"/>
+        <w:numPr>
+          <w:ilvl w:val="2"/>
+          <w:numId w:val="30"/>
+        </w:numPr>
+        <w:spacing w:after="0"/>
+      </w:pPr>
+      <w:r>
+        <w:rPr>
+          <w:rFonts w:ascii="Calibri" w:eastAsia="Times New Roman" w:hAnsi="Calibri" w:cs="Calibri"/>
+          <w:color w:val="E36C0A" w:themeColor="accent6" w:themeShade="BF"/>
+        </w:rPr>
+        <w:t>RMS</w:t>
+      </w:r>
+      <w:r>
+        <w:rPr>
+          <w:rFonts w:ascii="Calibri" w:eastAsia="Times New Roman" w:hAnsi="Calibri" w:cs="Calibri"/>
+        </w:rPr>
+        <w:t xml:space="preserve">: </w:t>
+      </w:r>
+      <w:r>
+        <w:rPr>
+          <w:rFonts w:ascii="Calibri" w:eastAsia="Times New Roman" w:hAnsi="Calibri" w:cs="Calibri"/>
+        </w:rPr>
+        <w:t>If used, the URL to the application</w:t>
+      </w:r>
+    </w:p>
+    <w:p>
+      <w:pPr>
+        <w:pStyle w:val="ListParagraph"/>
+        <w:numPr>
+          <w:ilvl w:val="1"/>
+          <w:numId w:val="4"/>
+        </w:numPr>
+        <w:spacing w:after="0"/>
+      </w:pPr>
+      <w:proofErr w:type="spellStart"/>
+      <w:r>
+        <w:rPr>
+          <w:rFonts w:ascii="Consolas" w:eastAsiaTheme="minorHAnsi" w:hAnsi="Consolas" w:cs="Consolas"/>
+          <w:color w:val="0000FF"/>
+          <w:sz w:val="19"/>
+          <w:szCs w:val="19"/>
+        </w:rPr>
+        <w:t>MSTSearchCriteriaHelp</w:t>
+      </w:r>
+      <w:proofErr w:type="spellEnd"/>
+    </w:p>
+    <w:p>
+      <w:pPr>
+        <w:pStyle w:val="ListParagraph"/>
+        <w:numPr>
+          <w:ilvl w:val="2"/>
+          <w:numId w:val="30"/>
+        </w:numPr>
+        <w:spacing w:after="0"/>
+      </w:pPr>
+      <w:r>
+        <w:rPr>
+          <w:rFonts w:ascii="Calibri" w:eastAsia="Times New Roman" w:hAnsi="Calibri" w:cs="Calibri"/>
+          <w:color w:val="E36C0A" w:themeColor="accent6" w:themeShade="BF"/>
+        </w:rPr>
+        <w:t>Space</w:t>
+      </w:r>
+      <w:r>
+        <w:rPr>
+          <w:rFonts w:ascii="Calibri" w:eastAsia="Times New Roman" w:hAnsi="Calibri" w:cs="Calibri"/>
+        </w:rPr>
+        <w:t xml:space="preserve">: </w:t>
+      </w:r>
+      <w:r>
+        <w:t xml:space="preserve">set to </w:t>
+      </w:r>
+      <w:r>
+        <w:rPr>
+          <w:rFonts w:ascii="Calibri" w:eastAsia="Times New Roman" w:hAnsi="Calibri" w:cs="Calibri"/>
+          <w:i/>
+        </w:rPr>
+        <w:t>blank</w:t>
+      </w:r>
+      <w:r>
+        <w:rPr>
+          <w:rFonts w:ascii="Calibri" w:eastAsia="Times New Roman" w:hAnsi="Calibri" w:cs="Calibri"/>
+          <w:i/>
+          <w:vertAlign w:val="superscript"/>
+        </w:rPr>
+        <w:t>2</w:t>
+      </w:r>
+    </w:p>
+    <w:p>
+      <w:pPr>
+        <w:pStyle w:val="ListParagraph"/>
+        <w:numPr>
+          <w:ilvl w:val="2"/>
+          <w:numId w:val="30"/>
+        </w:numPr>
+        <w:spacing w:after="0"/>
+      </w:pPr>
+      <w:r>
+        <w:rPr>
+          <w:rFonts w:ascii="Calibri" w:eastAsia="Times New Roman" w:hAnsi="Calibri" w:cs="Calibri"/>
+          <w:color w:val="E36C0A" w:themeColor="accent6" w:themeShade="BF"/>
+        </w:rPr>
+        <w:t>RMS</w:t>
+      </w:r>
+      <w:r>
+        <w:rPr>
+          <w:rFonts w:ascii="Calibri" w:eastAsia="Times New Roman" w:hAnsi="Calibri" w:cs="Calibri"/>
+        </w:rPr>
+        <w:t xml:space="preserve">: If used, the URL to </w:t>
+      </w:r>
+      <w:r>
+        <w:rPr>
+          <w:rFonts w:ascii="Calibri" w:eastAsia="Times New Roman" w:hAnsi="Calibri" w:cs="Calibri"/>
+        </w:rPr>
+        <w:t>the Search Criteria Help</w:t>
+      </w:r>
+    </w:p>
+    <w:p>
+      <w:pPr>
+        <w:pStyle w:val="ListParagraph"/>
+        <w:numPr>
+          <w:ilvl w:val="1"/>
+          <w:numId w:val="4"/>
+        </w:numPr>
+        <w:spacing w:after="0"/>
+      </w:pPr>
+      <w:proofErr w:type="spellStart"/>
+      <w:r>
+        <w:rPr>
+          <w:rFonts w:ascii="Consolas" w:eastAsiaTheme="minorHAnsi" w:hAnsi="Consolas" w:cs="Consolas"/>
+          <w:color w:val="0000FF"/>
+          <w:sz w:val="19"/>
+          <w:szCs w:val="19"/>
+        </w:rPr>
+        <w:t>MSTSearchResultsHelpLink</w:t>
+      </w:r>
+      <w:proofErr w:type="spellEnd"/>
+    </w:p>
+    <w:p>
+      <w:pPr>
+        <w:pStyle w:val="ListParagraph"/>
+        <w:numPr>
+          <w:ilvl w:val="2"/>
+          <w:numId w:val="30"/>
+        </w:numPr>
+        <w:spacing w:after="0"/>
+      </w:pPr>
+      <w:r>
+        <w:rPr>
+          <w:rFonts w:ascii="Calibri" w:eastAsia="Times New Roman" w:hAnsi="Calibri" w:cs="Calibri"/>
+          <w:color w:val="E36C0A" w:themeColor="accent6" w:themeShade="BF"/>
+        </w:rPr>
+        <w:t>Space</w:t>
+      </w:r>
+      <w:r>
+        <w:rPr>
+          <w:rFonts w:ascii="Calibri" w:eastAsia="Times New Roman" w:hAnsi="Calibri" w:cs="Calibri"/>
+        </w:rPr>
+        <w:t xml:space="preserve">: </w:t>
+      </w:r>
+      <w:r>
+        <w:t xml:space="preserve">set to </w:t>
+      </w:r>
+      <w:r>
+        <w:rPr>
+          <w:rFonts w:ascii="Calibri" w:eastAsia="Times New Roman" w:hAnsi="Calibri" w:cs="Calibri"/>
+          <w:i/>
+        </w:rPr>
+        <w:t>blank</w:t>
+      </w:r>
+      <w:r>
+        <w:rPr>
+          <w:rFonts w:ascii="Calibri" w:eastAsia="Times New Roman" w:hAnsi="Calibri" w:cs="Calibri"/>
+          <w:i/>
+          <w:vertAlign w:val="superscript"/>
+        </w:rPr>
+        <w:t>2</w:t>
+      </w:r>
+    </w:p>
+    <w:p>
+      <w:pPr>
+        <w:pStyle w:val="ListParagraph"/>
+        <w:numPr>
+          <w:ilvl w:val="2"/>
+          <w:numId w:val="30"/>
+        </w:numPr>
+        <w:spacing w:after="0"/>
+      </w:pPr>
+      <w:r>
+        <w:rPr>
+          <w:rFonts w:ascii="Calibri" w:eastAsia="Times New Roman" w:hAnsi="Calibri" w:cs="Calibri"/>
+          <w:color w:val="E36C0A" w:themeColor="accent6" w:themeShade="BF"/>
+        </w:rPr>
+        <w:t>RMS</w:t>
+      </w:r>
+      <w:r>
+        <w:rPr>
+          <w:rFonts w:ascii="Calibri" w:eastAsia="Times New Roman" w:hAnsi="Calibri" w:cs="Calibri"/>
+        </w:rPr>
+        <w:t xml:space="preserve">: If used, the URL to </w:t>
+      </w:r>
+      <w:r>
+        <w:rPr>
+          <w:rFonts w:ascii="Calibri" w:eastAsia="Times New Roman" w:hAnsi="Calibri" w:cs="Calibri"/>
+        </w:rPr>
+        <w:t>the Results Help</w:t>
+      </w:r>
+    </w:p>
+    <w:p>
+      <w:pPr>
+        <w:pStyle w:val="ListParagraph"/>
+        <w:numPr>
+          <w:ilvl w:val="1"/>
+          <w:numId w:val="4"/>
+        </w:numPr>
+        <w:spacing w:after="0"/>
+      </w:pPr>
+      <w:proofErr w:type="spellStart"/>
+      <w:r>
+        <w:rPr>
+          <w:rFonts w:ascii="Consolas" w:eastAsiaTheme="minorHAnsi" w:hAnsi="Consolas" w:cs="Consolas"/>
+          <w:color w:val="0000FF"/>
+          <w:sz w:val="19"/>
+          <w:szCs w:val="19"/>
+        </w:rPr>
+        <w:t>MSTSearchResultsDetailHelpLink</w:t>
+      </w:r>
+      <w:proofErr w:type="spellEnd"/>
+      <w:r>
+        <w:rPr>
+          <w:rFonts w:ascii="Calibri" w:eastAsia="Times New Roman" w:hAnsi="Calibri" w:cs="Calibri"/>
+        </w:rPr>
+        <w:t xml:space="preserve"> </w:t>
+      </w:r>
+    </w:p>
+    <w:p>
+      <w:pPr>
+        <w:pStyle w:val="ListParagraph"/>
+        <w:numPr>
+          <w:ilvl w:val="2"/>
+          <w:numId w:val="30"/>
+        </w:numPr>
+        <w:spacing w:after="0"/>
+      </w:pPr>
+      <w:r>
+        <w:rPr>
+          <w:rFonts w:ascii="Calibri" w:eastAsia="Times New Roman" w:hAnsi="Calibri" w:cs="Calibri"/>
+          <w:color w:val="E36C0A" w:themeColor="accent6" w:themeShade="BF"/>
+        </w:rPr>
+        <w:t>Space</w:t>
+      </w:r>
+      <w:r>
+        <w:rPr>
+          <w:rFonts w:ascii="Calibri" w:eastAsia="Times New Roman" w:hAnsi="Calibri" w:cs="Calibri"/>
+        </w:rPr>
+        <w:t xml:space="preserve">: </w:t>
+      </w:r>
+      <w:r>
+        <w:t xml:space="preserve">set to </w:t>
+      </w:r>
+      <w:r>
+        <w:rPr>
+          <w:rFonts w:ascii="Calibri" w:eastAsia="Times New Roman" w:hAnsi="Calibri" w:cs="Calibri"/>
+          <w:i/>
+        </w:rPr>
+        <w:t>blank</w:t>
+      </w:r>
+      <w:r>
+        <w:rPr>
+          <w:rFonts w:ascii="Calibri" w:eastAsia="Times New Roman" w:hAnsi="Calibri" w:cs="Calibri"/>
+          <w:i/>
+          <w:vertAlign w:val="superscript"/>
+        </w:rPr>
+        <w:t>2</w:t>
+      </w:r>
+    </w:p>
+    <w:p>
+      <w:pPr>
+        <w:pStyle w:val="ListParagraph"/>
+        <w:numPr>
+          <w:ilvl w:val="2"/>
+          <w:numId w:val="30"/>
+        </w:numPr>
+        <w:spacing w:after="0"/>
+      </w:pPr>
+      <w:r>
+        <w:rPr>
+          <w:rFonts w:ascii="Calibri" w:eastAsia="Times New Roman" w:hAnsi="Calibri" w:cs="Calibri"/>
+          <w:color w:val="E36C0A" w:themeColor="accent6" w:themeShade="BF"/>
+        </w:rPr>
+        <w:lastRenderedPageBreak/>
+        <w:t>RMS</w:t>
+      </w:r>
+      <w:r>
+        <w:rPr>
+          <w:rFonts w:ascii="Calibri" w:eastAsia="Times New Roman" w:hAnsi="Calibri" w:cs="Calibri"/>
+        </w:rPr>
+        <w:t xml:space="preserve">: If used, the URL to </w:t>
+      </w:r>
+      <w:r>
+        <w:rPr>
+          <w:rFonts w:ascii="Calibri" w:eastAsia="Times New Roman" w:hAnsi="Calibri" w:cs="Calibri"/>
+        </w:rPr>
+        <w:t>the Result Details Help</w:t>
+      </w:r>
+    </w:p>
+    <w:p>
+      <w:pPr>
+        <w:rPr>
+          <w:rFonts w:ascii="Consolas" w:eastAsiaTheme="minorHAnsi" w:hAnsi="Consolas" w:cs="Consolas"/>
+          <w:color w:val="008000"/>
+          <w:sz w:val="19"/>
+          <w:szCs w:val="19"/>
+        </w:rPr>
+      </w:pPr>
+    </w:p>
+    <w:p>
+      <w:pPr>
+        <w:pStyle w:val="ListParagraph"/>
+        <w:spacing w:after="0"/>
+        <w:ind w:left="1440"/>
+        <w:textAlignment w:val="center"/>
+        <w:rPr>
+          <w:rFonts w:ascii="Calibri" w:eastAsia="Times New Roman" w:hAnsi="Calibri" w:cs="Calibri"/>
+        </w:rPr>
+      </w:pPr>
+      <w:r>
+        <w:rPr>
+          <w:rFonts w:ascii="Consolas" w:eastAsiaTheme="minorHAnsi" w:hAnsi="Consolas" w:cs="Consolas"/>
+          <w:color w:val="008000"/>
+          <w:sz w:val="19"/>
+          <w:szCs w:val="19"/>
+        </w:rPr>
+        <w:t>Additional RMS Settings</w:t>
+      </w:r>
+    </w:p>
+    <w:p>
+      <w:pPr>
+        <w:pStyle w:val="ListParagraph"/>
+        <w:numPr>
+          <w:ilvl w:val="1"/>
+          <w:numId w:val="4"/>
+        </w:numPr>
+        <w:spacing w:after="0"/>
+      </w:pPr>
+      <w:proofErr w:type="spellStart"/>
+      <w:r>
+        <w:rPr>
+          <w:rFonts w:ascii="Consolas" w:eastAsiaTheme="minorHAnsi" w:hAnsi="Consolas" w:cs="Consolas"/>
+          <w:color w:val="0000FF"/>
+          <w:sz w:val="19"/>
+          <w:szCs w:val="19"/>
+        </w:rPr>
+        <w:t>RmsHelpBaseLink</w:t>
+      </w:r>
+      <w:proofErr w:type="spellEnd"/>
+    </w:p>
+    <w:p>
+      <w:pPr>
+        <w:pStyle w:val="ListParagraph"/>
+        <w:numPr>
+          <w:ilvl w:val="2"/>
+          <w:numId w:val="30"/>
+        </w:numPr>
+        <w:spacing w:after="0"/>
+      </w:pPr>
+      <w:r>
+        <w:rPr>
+          <w:rFonts w:ascii="Calibri" w:eastAsia="Times New Roman" w:hAnsi="Calibri" w:cs="Calibri"/>
+          <w:color w:val="E36C0A" w:themeColor="accent6" w:themeShade="BF"/>
+        </w:rPr>
+        <w:t>Space</w:t>
+      </w:r>
+      <w:r>
+        <w:rPr>
+          <w:rFonts w:ascii="Calibri" w:eastAsia="Times New Roman" w:hAnsi="Calibri" w:cs="Calibri"/>
+        </w:rPr>
+        <w:t xml:space="preserve">: </w:t>
+      </w:r>
+      <w:r>
+        <w:t xml:space="preserve">set to </w:t>
+      </w:r>
+      <w:r>
+        <w:rPr>
+          <w:rFonts w:ascii="Calibri" w:eastAsia="Times New Roman" w:hAnsi="Calibri" w:cs="Calibri"/>
+          <w:i/>
+        </w:rPr>
+        <w:t>blank</w:t>
+      </w:r>
+      <w:r>
+        <w:rPr>
+          <w:rFonts w:ascii="Calibri" w:eastAsia="Times New Roman" w:hAnsi="Calibri" w:cs="Calibri"/>
+          <w:i/>
+          <w:vertAlign w:val="superscript"/>
+        </w:rPr>
+        <w:t>2</w:t>
+      </w:r>
+    </w:p>
+    <w:p>
+      <w:pPr>
+        <w:pStyle w:val="ListParagraph"/>
+        <w:numPr>
+          <w:ilvl w:val="2"/>
+          <w:numId w:val="30"/>
+        </w:numPr>
+        <w:spacing w:after="0"/>
+      </w:pPr>
+      <w:r>
+        <w:rPr>
+          <w:rFonts w:ascii="Calibri" w:eastAsia="Times New Roman" w:hAnsi="Calibri" w:cs="Calibri"/>
+          <w:color w:val="E36C0A" w:themeColor="accent6" w:themeShade="BF"/>
+        </w:rPr>
+        <w:t>RMS</w:t>
+      </w:r>
+      <w:r>
+        <w:rPr>
+          <w:rFonts w:ascii="Calibri" w:eastAsia="Times New Roman" w:hAnsi="Calibri" w:cs="Calibri"/>
+        </w:rPr>
+        <w:t xml:space="preserve">: A base URL where RMS help files will be located. It should start with </w:t>
+      </w:r>
+      <w:r>
+        <w:rPr>
+          <w:rFonts w:ascii="Consolas" w:eastAsia="Times New Roman" w:hAnsi="Consolas" w:cs="Calibri"/>
+          <w:color w:val="1F497D" w:themeColor="text2"/>
+          <w:sz w:val="19"/>
+          <w:szCs w:val="19"/>
+        </w:rPr>
+        <w:t>http(s)://</w:t>
+      </w:r>
+      <w:r>
+        <w:rPr>
+          <w:rFonts w:ascii="Calibri" w:eastAsia="Times New Roman" w:hAnsi="Calibri" w:cs="Calibri"/>
+          <w:color w:val="1F497D" w:themeColor="text2"/>
+        </w:rPr>
+        <w:t xml:space="preserve"> </w:t>
+      </w:r>
+      <w:r>
+        <w:rPr>
+          <w:rFonts w:ascii="Calibri" w:eastAsia="Times New Roman" w:hAnsi="Calibri" w:cs="Calibri"/>
+        </w:rPr>
+        <w:t xml:space="preserve">and end with a </w:t>
+      </w:r>
+      <w:r>
+        <w:rPr>
+          <w:rFonts w:ascii="Consolas" w:eastAsia="Times New Roman" w:hAnsi="Consolas" w:cs="Calibri"/>
+          <w:color w:val="1F497D" w:themeColor="text2"/>
+          <w:sz w:val="19"/>
+          <w:szCs w:val="19"/>
+        </w:rPr>
+        <w:t>/</w:t>
+      </w:r>
+    </w:p>
+    <w:p>
+      <w:pPr>
+        <w:pStyle w:val="ListParagraph"/>
+        <w:numPr>
+          <w:ilvl w:val="1"/>
+          <w:numId w:val="4"/>
+        </w:numPr>
+        <w:spacing w:after="0"/>
+      </w:pPr>
+      <w:proofErr w:type="spellStart"/>
+      <w:r>
+        <w:rPr>
+          <w:rFonts w:ascii="Consolas" w:eastAsiaTheme="minorHAnsi" w:hAnsi="Consolas" w:cs="Consolas"/>
+          <w:color w:val="0000FF"/>
+          <w:sz w:val="19"/>
+          <w:szCs w:val="19"/>
+        </w:rPr>
+        <w:t>RmsHelpBaseLinkNew</w:t>
+      </w:r>
+      <w:proofErr w:type="spellEnd"/>
+    </w:p>
+    <w:p>
+      <w:pPr>
+        <w:pStyle w:val="ListParagraph"/>
+        <w:numPr>
+          <w:ilvl w:val="2"/>
+          <w:numId w:val="30"/>
+        </w:numPr>
+        <w:spacing w:after="0"/>
+      </w:pPr>
+      <w:r>
+        <w:rPr>
+          <w:rFonts w:ascii="Calibri" w:eastAsia="Times New Roman" w:hAnsi="Calibri" w:cs="Calibri"/>
+          <w:color w:val="E36C0A" w:themeColor="accent6" w:themeShade="BF"/>
+        </w:rPr>
+        <w:t>Space</w:t>
+      </w:r>
+      <w:r>
+        <w:rPr>
+          <w:rFonts w:ascii="Calibri" w:eastAsia="Times New Roman" w:hAnsi="Calibri" w:cs="Calibri"/>
+        </w:rPr>
+        <w:t xml:space="preserve">: </w:t>
+      </w:r>
+      <w:r>
+        <w:t xml:space="preserve">set to </w:t>
+      </w:r>
+      <w:r>
+        <w:rPr>
+          <w:rFonts w:ascii="Calibri" w:eastAsia="Times New Roman" w:hAnsi="Calibri" w:cs="Calibri"/>
+          <w:i/>
+        </w:rPr>
+        <w:t>blank</w:t>
+      </w:r>
+      <w:r>
+        <w:rPr>
+          <w:rFonts w:ascii="Calibri" w:eastAsia="Times New Roman" w:hAnsi="Calibri" w:cs="Calibri"/>
+          <w:i/>
+          <w:vertAlign w:val="superscript"/>
+        </w:rPr>
+        <w:t>2</w:t>
+      </w:r>
+    </w:p>
+    <w:p>
+      <w:pPr>
+        <w:pStyle w:val="ListParagraph"/>
+        <w:numPr>
+          <w:ilvl w:val="2"/>
+          <w:numId w:val="30"/>
+        </w:numPr>
+        <w:spacing w:after="0"/>
+      </w:pPr>
+      <w:r>
+        <w:rPr>
+          <w:rFonts w:ascii="Calibri" w:eastAsia="Times New Roman" w:hAnsi="Calibri" w:cs="Calibri"/>
+          <w:color w:val="E36C0A" w:themeColor="accent6" w:themeShade="BF"/>
+        </w:rPr>
+        <w:t>RMS</w:t>
+      </w:r>
+      <w:r>
+        <w:rPr>
+          <w:rFonts w:ascii="Calibri" w:eastAsia="Times New Roman" w:hAnsi="Calibri" w:cs="Calibri"/>
+        </w:rPr>
+        <w:t xml:space="preserve">: A base URL where RMS help files will be located. It should start with </w:t>
+      </w:r>
+      <w:r>
+        <w:rPr>
+          <w:rFonts w:ascii="Consolas" w:eastAsia="Times New Roman" w:hAnsi="Consolas" w:cs="Calibri"/>
+          <w:color w:val="1F497D" w:themeColor="text2"/>
+          <w:sz w:val="19"/>
+          <w:szCs w:val="19"/>
+        </w:rPr>
+        <w:t>http(s)://</w:t>
+      </w:r>
+      <w:r>
+        <w:rPr>
+          <w:rFonts w:ascii="Calibri" w:eastAsia="Times New Roman" w:hAnsi="Calibri" w:cs="Calibri"/>
+          <w:color w:val="1F497D" w:themeColor="text2"/>
+        </w:rPr>
+        <w:t xml:space="preserve"> </w:t>
+      </w:r>
+      <w:r>
+        <w:rPr>
+          <w:rFonts w:ascii="Calibri" w:eastAsia="Times New Roman" w:hAnsi="Calibri" w:cs="Calibri"/>
+        </w:rPr>
+        <w:t xml:space="preserve">and end with a </w:t>
+      </w:r>
+      <w:r>
+        <w:rPr>
+          <w:rFonts w:ascii="Consolas" w:eastAsia="Times New Roman" w:hAnsi="Consolas" w:cs="Calibri"/>
+          <w:color w:val="1F497D" w:themeColor="text2"/>
+          <w:sz w:val="19"/>
+          <w:szCs w:val="19"/>
+        </w:rPr>
+        <w:t>/</w:t>
+      </w:r>
+    </w:p>
+    <w:p/>
+    <w:p>
+      <w:pPr>
+        <w:pStyle w:val="ListParagraph"/>
+        <w:spacing w:after="0"/>
+        <w:ind w:left="1440"/>
+        <w:textAlignment w:val="center"/>
+        <w:rPr>
+          <w:rFonts w:ascii="Calibri" w:eastAsia="Times New Roman" w:hAnsi="Calibri" w:cs="Calibri"/>
+        </w:rPr>
+      </w:pPr>
+      <w:r>
+        <w:rPr>
+          <w:rFonts w:ascii="Consolas" w:eastAsiaTheme="minorHAnsi" w:hAnsi="Consolas" w:cs="Consolas"/>
+          <w:color w:val="008000"/>
+          <w:sz w:val="19"/>
+          <w:szCs w:val="19"/>
+        </w:rPr>
+        <w:t>Project Map Settings</w:t>
+      </w:r>
+    </w:p>
+    <w:p>
+      <w:pPr>
+        <w:pStyle w:val="ListParagraph"/>
+        <w:numPr>
+          <w:ilvl w:val="1"/>
+          <w:numId w:val="4"/>
+        </w:numPr>
+        <w:spacing w:after="0"/>
+        <w:textAlignment w:val="center"/>
+        <w:rPr>
+          <w:rFonts w:ascii="Calibri" w:eastAsia="Times New Roman" w:hAnsi="Calibri" w:cs="Calibri"/>
+        </w:rPr>
+      </w:pPr>
+      <w:proofErr w:type="spellStart"/>
+      <w:r>
+        <w:rPr>
+          <w:rFonts w:ascii="Consolas" w:eastAsiaTheme="minorHAnsi" w:hAnsi="Consolas" w:cs="Consolas"/>
+          <w:color w:val="0000FF"/>
+          <w:sz w:val="19"/>
+          <w:szCs w:val="19"/>
+        </w:rPr>
+        <w:t>IsProjectMapEnabled</w:t>
+      </w:r>
+      <w:proofErr w:type="spellEnd"/>
+    </w:p>
+    <w:p>
+      <w:pPr>
+        <w:pStyle w:val="ListParagraph"/>
+        <w:numPr>
+          <w:ilvl w:val="2"/>
+          <w:numId w:val="30"/>
+        </w:numPr>
+        <w:spacing w:after="0"/>
+        <w:textAlignment w:val="center"/>
+        <w:rPr>
+          <w:rFonts w:ascii="Calibri" w:eastAsia="Times New Roman" w:hAnsi="Calibri" w:cs="Calibri"/>
+        </w:rPr>
+      </w:pPr>
+      <w:r>
+        <w:rPr>
+          <w:rFonts w:ascii="Calibri" w:eastAsia="Times New Roman" w:hAnsi="Calibri" w:cs="Calibri"/>
+          <w:color w:val="E36C0A" w:themeColor="accent6" w:themeShade="BF"/>
+        </w:rPr>
+        <w:t>Space</w:t>
+      </w:r>
+      <w:r>
+        <w:rPr>
+          <w:rFonts w:ascii="Calibri" w:eastAsia="Times New Roman" w:hAnsi="Calibri" w:cs="Calibri"/>
+        </w:rPr>
+        <w:t xml:space="preserve">: </w:t>
+      </w:r>
+      <w:r>
+        <w:rPr>
+          <w:rFonts w:ascii="Calibri" w:eastAsia="Times New Roman" w:hAnsi="Calibri" w:cs="Calibri"/>
+        </w:rPr>
+        <w:t xml:space="preserve">set to </w:t>
+      </w:r>
+      <w:r>
+        <w:rPr>
+          <w:rFonts w:ascii="Consolas" w:hAnsi="Consolas" w:cs="Consolas"/>
+          <w:color w:val="1F497D" w:themeColor="text2"/>
+          <w:sz w:val="20"/>
+        </w:rPr>
+        <w:t>false</w:t>
+      </w:r>
+    </w:p>
+    <w:p>
+      <w:pPr>
+        <w:pStyle w:val="ListParagraph"/>
+        <w:numPr>
+          <w:ilvl w:val="2"/>
+          <w:numId w:val="30"/>
+        </w:numPr>
+        <w:spacing w:after="0"/>
+        <w:textAlignment w:val="center"/>
+        <w:rPr>
+          <w:rFonts w:ascii="Calibri" w:eastAsia="Times New Roman" w:hAnsi="Calibri" w:cs="Calibri"/>
+        </w:rPr>
+      </w:pPr>
+      <w:r>
+        <w:rPr>
+          <w:rFonts w:ascii="Calibri" w:eastAsia="Times New Roman" w:hAnsi="Calibri" w:cs="Calibri"/>
+          <w:color w:val="E36C0A" w:themeColor="accent6" w:themeShade="BF"/>
+        </w:rPr>
+        <w:t>RMS</w:t>
+      </w:r>
+      <w:r>
+        <w:rPr>
+          <w:rFonts w:ascii="Calibri" w:eastAsia="Times New Roman" w:hAnsi="Calibri" w:cs="Calibri"/>
+        </w:rPr>
+        <w:t xml:space="preserve">: </w:t>
+      </w:r>
+      <w:r>
+        <w:rPr>
+          <w:rFonts w:cstheme="minorHAnsi"/>
+        </w:rPr>
+        <w:t xml:space="preserve">set </w:t>
+      </w:r>
+      <w:r>
+        <w:rPr>
+          <w:rFonts w:cstheme="minorHAnsi"/>
+        </w:rPr>
+        <w:t xml:space="preserve">to </w:t>
+      </w:r>
+      <w:r>
+        <w:rPr>
+          <w:rFonts w:ascii="Consolas" w:hAnsi="Consolas" w:cs="Consolas"/>
+          <w:color w:val="1F497D" w:themeColor="text2"/>
+          <w:sz w:val="20"/>
+        </w:rPr>
         <w:t>true</w:t>
       </w:r>
       <w:r>
@@ -6076,8 +6086,16 @@
         <w:rPr>
           <w:rFonts w:ascii="Calibri" w:eastAsia="Times New Roman" w:hAnsi="Calibri" w:cs="Calibri"/>
         </w:rPr>
-        <w:t>Below are used by Project Map functionality (if turned on above)..</w:t>
-      </w:r>
+        <w:t>Below are used by Project Map functionality (if turned on above</w:t>
+      </w:r>
+      <w:proofErr w:type="gramStart"/>
+      <w:r>
+        <w:rPr>
+          <w:rFonts w:ascii="Calibri" w:eastAsia="Times New Roman" w:hAnsi="Calibri" w:cs="Calibri"/>
+        </w:rPr>
+        <w:t>)..</w:t>
+      </w:r>
+      <w:proofErr w:type="gramEnd"/>
     </w:p>
     <w:p>
       <w:pPr>
@@ -6264,16 +6282,8 @@
         <w:rPr>
           <w:rFonts w:ascii="Calibri" w:eastAsia="Times New Roman" w:hAnsi="Calibri" w:cs="Calibri"/>
         </w:rPr>
-        <w:t xml:space="preserve"> – AD groups allowed to access </w:t>
-      </w:r>
-      <w:proofErr w:type="spellStart"/>
-      <w:r>
-        <w:rPr>
-          <w:rFonts w:ascii="Calibri" w:eastAsia="Times New Roman" w:hAnsi="Calibri" w:cs="Calibri"/>
-        </w:rPr>
-        <w:t>GenBOE</w:t>
-      </w:r>
-      <w:proofErr w:type="spellEnd"/>
+        <w:t xml:space="preserve"> – AD groups allowed to access GenBOE</w:t>
+      </w:r>
     </w:p>
     <w:p>
       <w:pPr>
@@ -6509,7 +6519,21 @@
         <w:rPr>
           <w:rFonts w:ascii="Calibri" w:eastAsia="Times New Roman" w:hAnsi="Calibri" w:cs="Calibri"/>
         </w:rPr>
-        <w:t xml:space="preserve"> setting,  update the </w:t>
+        <w:t xml:space="preserve"> </w:t>
+      </w:r>
+      <w:proofErr w:type="gramStart"/>
+      <w:r>
+        <w:rPr>
+          <w:rFonts w:ascii="Calibri" w:eastAsia="Times New Roman" w:hAnsi="Calibri" w:cs="Calibri"/>
+        </w:rPr>
+        <w:t>setting,  update</w:t>
+      </w:r>
+      <w:proofErr w:type="gramEnd"/>
+      <w:r>
+        <w:rPr>
+          <w:rFonts w:ascii="Calibri" w:eastAsia="Times New Roman" w:hAnsi="Calibri" w:cs="Calibri"/>
+        </w:rPr>
+        <w:t xml:space="preserve"> the </w:t>
       </w:r>
       <w:proofErr w:type="spellStart"/>
       <w:r>
@@ -6732,7 +6756,27 @@
           <w:sz w:val="19"/>
           <w:szCs w:val="19"/>
         </w:rPr>
-        <w:t>="(.*)"</w:t>
+        <w:t>="</w:t>
+      </w:r>
+      <w:proofErr w:type="gramStart"/>
+      <w:r>
+        <w:rPr>
+          <w:rFonts w:ascii="Consolas" w:eastAsiaTheme="minorHAnsi" w:hAnsi="Consolas" w:cs="Consolas"/>
+          <w:color w:val="8064A2" w:themeColor="accent4"/>
+          <w:sz w:val="19"/>
+          <w:szCs w:val="19"/>
+        </w:rPr>
+        <w:t>(.*</w:t>
+      </w:r>
+      <w:proofErr w:type="gramEnd"/>
+      <w:r>
+        <w:rPr>
+          <w:rFonts w:ascii="Consolas" w:eastAsiaTheme="minorHAnsi" w:hAnsi="Consolas" w:cs="Consolas"/>
+          <w:color w:val="8064A2" w:themeColor="accent4"/>
+          <w:sz w:val="19"/>
+          <w:szCs w:val="19"/>
+        </w:rPr>
+        <w:t>)"</w:t>
       </w:r>
       <w:r>
         <w:rPr>
@@ -7184,21 +7228,7 @@
         <w:rPr>
           <w:rFonts w:ascii="Calibri" w:eastAsia="Times New Roman" w:hAnsi="Calibri" w:cs="Calibri"/>
         </w:rPr>
-        <w:t xml:space="preserve">– </w:t>
-      </w:r>
-      <w:proofErr w:type="spellStart"/>
-      <w:r>
-        <w:rPr>
-          <w:rFonts w:ascii="Calibri" w:eastAsia="Times New Roman" w:hAnsi="Calibri" w:cs="Calibri"/>
-        </w:rPr>
-        <w:t>genBOE</w:t>
-      </w:r>
-      <w:proofErr w:type="spellEnd"/>
-      <w:r>
-        <w:rPr>
-          <w:rFonts w:ascii="Calibri" w:eastAsia="Times New Roman" w:hAnsi="Calibri" w:cs="Calibri"/>
-        </w:rPr>
-        <w:t xml:space="preserve"> database connection string</w:t>
+        <w:t>– genBOE database connection string</w:t>
       </w:r>
     </w:p>
     <w:p>
@@ -7478,29 +7508,13 @@
         <w:t xml:space="preserve"> </w:t>
       </w:r>
       <w:r>
-        <w:t xml:space="preserve">– </w:t>
-      </w:r>
-      <w:proofErr w:type="spellStart"/>
-      <w:r>
-        <w:t>ProPricer</w:t>
-      </w:r>
-      <w:proofErr w:type="spellEnd"/>
-      <w:r>
-        <w:t xml:space="preserve"> URL – a URL to a </w:t>
+        <w:t xml:space="preserve">– ProPricer URL – a URL to a </w:t>
       </w:r>
       <w:r>
         <w:t>SharePoint</w:t>
       </w:r>
       <w:r>
-        <w:t xml:space="preserve"> site where </w:t>
-      </w:r>
-      <w:proofErr w:type="spellStart"/>
-      <w:r>
-        <w:t>ProPricer</w:t>
-      </w:r>
-      <w:proofErr w:type="spellEnd"/>
-      <w:r>
-        <w:t xml:space="preserve"> links are located</w:t>
+        <w:t xml:space="preserve"> site where ProPricer links are located</w:t>
       </w:r>
     </w:p>
     <w:p>
@@ -7614,13 +7628,7 @@
         <w:t xml:space="preserve">, </w:t>
       </w:r>
       <w:r>
-        <w:t xml:space="preserve">ACV </w:t>
-      </w:r>
-      <w:r>
-        <w:t xml:space="preserve">is still </w:t>
-      </w:r>
-      <w:r>
-        <w:t>not in classified environment yet</w:t>
+        <w:t>ACV is still not in classified environment yet</w:t>
       </w:r>
     </w:p>
     <w:p>
@@ -7686,13 +7694,7 @@
         <w:t xml:space="preserve"> </w:t>
       </w:r>
       <w:r>
-        <w:t xml:space="preserve">is not in classified </w:t>
-      </w:r>
-      <w:r>
-        <w:t xml:space="preserve">environment </w:t>
-      </w:r>
-      <w:r>
-        <w:t>yet</w:t>
+        <w:t>is not in classified environment yet</w:t>
       </w:r>
     </w:p>
     <w:p>
@@ -8037,16 +8039,22 @@
         <w:rPr>
           <w:rFonts w:ascii="Calibri" w:eastAsia="Times New Roman" w:hAnsi="Calibri" w:cs="Calibri"/>
         </w:rPr>
-        <w:t xml:space="preserve"> – all AD groups allowed to access all of the IES suite applications, including </w:t>
-      </w:r>
-      <w:proofErr w:type="spellStart"/>
-      <w:r>
-        <w:rPr>
-          <w:rFonts w:ascii="Calibri" w:eastAsia="Times New Roman" w:hAnsi="Calibri" w:cs="Calibri"/>
-        </w:rPr>
-        <w:t>GenBOE</w:t>
-      </w:r>
-      <w:proofErr w:type="spellEnd"/>
+        <w:t xml:space="preserve"> – all AD groups allowed to access </w:t>
+      </w:r>
+      <w:proofErr w:type="gramStart"/>
+      <w:r>
+        <w:rPr>
+          <w:rFonts w:ascii="Calibri" w:eastAsia="Times New Roman" w:hAnsi="Calibri" w:cs="Calibri"/>
+        </w:rPr>
+        <w:t>all of</w:t>
+      </w:r>
+      <w:proofErr w:type="gramEnd"/>
+      <w:r>
+        <w:rPr>
+          <w:rFonts w:ascii="Calibri" w:eastAsia="Times New Roman" w:hAnsi="Calibri" w:cs="Calibri"/>
+        </w:rPr>
+        <w:t xml:space="preserve"> the IES suite applications, including GenBOE</w:t>
+      </w:r>
     </w:p>
     <w:p>
       <w:pPr>
@@ -8270,7 +8278,21 @@
         <w:rPr>
           <w:rFonts w:ascii="Calibri" w:eastAsia="Times New Roman" w:hAnsi="Calibri" w:cs="Calibri"/>
         </w:rPr>
-        <w:t xml:space="preserve"> setting,  update the </w:t>
+        <w:t xml:space="preserve"> </w:t>
+      </w:r>
+      <w:proofErr w:type="gramStart"/>
+      <w:r>
+        <w:rPr>
+          <w:rFonts w:ascii="Calibri" w:eastAsia="Times New Roman" w:hAnsi="Calibri" w:cs="Calibri"/>
+        </w:rPr>
+        <w:t>setting,  update</w:t>
+      </w:r>
+      <w:proofErr w:type="gramEnd"/>
+      <w:r>
+        <w:rPr>
+          <w:rFonts w:ascii="Calibri" w:eastAsia="Times New Roman" w:hAnsi="Calibri" w:cs="Calibri"/>
+        </w:rPr>
+        <w:t xml:space="preserve"> the </w:t>
       </w:r>
       <w:proofErr w:type="spellStart"/>
       <w:r>
@@ -8497,7 +8519,27 @@
           <w:sz w:val="19"/>
           <w:szCs w:val="19"/>
         </w:rPr>
-        <w:t>="(.*)"</w:t>
+        <w:t>="</w:t>
+      </w:r>
+      <w:proofErr w:type="gramStart"/>
+      <w:r>
+        <w:rPr>
+          <w:rFonts w:ascii="Consolas" w:eastAsiaTheme="minorHAnsi" w:hAnsi="Consolas" w:cs="Consolas"/>
+          <w:color w:val="8064A2" w:themeColor="accent4"/>
+          <w:sz w:val="19"/>
+          <w:szCs w:val="19"/>
+        </w:rPr>
+        <w:t>(.*</w:t>
+      </w:r>
+      <w:proofErr w:type="gramEnd"/>
+      <w:r>
+        <w:rPr>
+          <w:rFonts w:ascii="Consolas" w:eastAsiaTheme="minorHAnsi" w:hAnsi="Consolas" w:cs="Consolas"/>
+          <w:color w:val="8064A2" w:themeColor="accent4"/>
+          <w:sz w:val="19"/>
+          <w:szCs w:val="19"/>
+        </w:rPr>
+        <w:t>)"</w:t>
       </w:r>
       <w:r>
         <w:rPr>
@@ -8912,21 +8954,7 @@
         <w:rPr>
           <w:rFonts w:ascii="Calibri" w:eastAsia="Times New Roman" w:hAnsi="Calibri" w:cs="Calibri"/>
         </w:rPr>
-        <w:t xml:space="preserve">– </w:t>
-      </w:r>
-      <w:proofErr w:type="spellStart"/>
-      <w:r>
-        <w:rPr>
-          <w:rFonts w:ascii="Calibri" w:eastAsia="Times New Roman" w:hAnsi="Calibri" w:cs="Calibri"/>
-        </w:rPr>
-        <w:t>GenBOE</w:t>
-      </w:r>
-      <w:proofErr w:type="spellEnd"/>
-      <w:r>
-        <w:rPr>
-          <w:rFonts w:ascii="Calibri" w:eastAsia="Times New Roman" w:hAnsi="Calibri" w:cs="Calibri"/>
-        </w:rPr>
-        <w:t xml:space="preserve"> database connection string</w:t>
+        <w:t>– GenBOE database connection string</w:t>
       </w:r>
     </w:p>
     <w:p>
@@ -9231,7 +9259,25 @@
           <w:sz w:val="19"/>
           <w:szCs w:val="19"/>
         </w:rPr>
-        <w:t>http(s):\\</w:t>
+        <w:t>http(s</w:t>
+      </w:r>
+      <w:proofErr w:type="gramStart"/>
+      <w:r>
+        <w:rPr>
+          <w:rFonts w:ascii="Consolas" w:hAnsi="Consolas"/>
+          <w:sz w:val="19"/>
+          <w:szCs w:val="19"/>
+        </w:rPr>
+        <w:t>):\</w:t>
+      </w:r>
+      <w:proofErr w:type="gramEnd"/>
+      <w:r>
+        <w:rPr>
+          <w:rFonts w:ascii="Consolas" w:hAnsi="Consolas"/>
+          <w:sz w:val="19"/>
+          <w:szCs w:val="19"/>
+        </w:rPr>
+        <w:t>\</w:t>
       </w:r>
       <w:r>
         <w:t xml:space="preserve"> and end with </w:t>
@@ -9650,15 +9696,7 @@
         <w:t>–</w:t>
       </w:r>
       <w:r>
-        <w:t xml:space="preserve"> </w:t>
-      </w:r>
-      <w:proofErr w:type="spellStart"/>
-      <w:r>
-        <w:t>GenBOE</w:t>
-      </w:r>
-      <w:proofErr w:type="spellEnd"/>
-      <w:r>
-        <w:t xml:space="preserve"> URL</w:t>
+        <w:t xml:space="preserve"> GenBOE URL</w:t>
       </w:r>
     </w:p>
     <w:p>
@@ -10339,7 +10377,21 @@
         <w:rPr>
           <w:rFonts w:ascii="Calibri" w:eastAsia="Times New Roman" w:hAnsi="Calibri" w:cs="Calibri"/>
         </w:rPr>
-        <w:t xml:space="preserve"> setting,  update the </w:t>
+        <w:t xml:space="preserve"> </w:t>
+      </w:r>
+      <w:proofErr w:type="gramStart"/>
+      <w:r>
+        <w:rPr>
+          <w:rFonts w:ascii="Calibri" w:eastAsia="Times New Roman" w:hAnsi="Calibri" w:cs="Calibri"/>
+        </w:rPr>
+        <w:t>setting,  update</w:t>
+      </w:r>
+      <w:proofErr w:type="gramEnd"/>
+      <w:r>
+        <w:rPr>
+          <w:rFonts w:ascii="Calibri" w:eastAsia="Times New Roman" w:hAnsi="Calibri" w:cs="Calibri"/>
+        </w:rPr>
+        <w:t xml:space="preserve"> the </w:t>
       </w:r>
       <w:proofErr w:type="spellStart"/>
       <w:r>
@@ -10566,7 +10618,27 @@
           <w:sz w:val="19"/>
           <w:szCs w:val="19"/>
         </w:rPr>
-        <w:t>="(.*)"</w:t>
+        <w:t>="</w:t>
+      </w:r>
+      <w:proofErr w:type="gramStart"/>
+      <w:r>
+        <w:rPr>
+          <w:rFonts w:ascii="Consolas" w:eastAsiaTheme="minorHAnsi" w:hAnsi="Consolas" w:cs="Consolas"/>
+          <w:color w:val="8064A2" w:themeColor="accent4"/>
+          <w:sz w:val="19"/>
+          <w:szCs w:val="19"/>
+        </w:rPr>
+        <w:t>(.*</w:t>
+      </w:r>
+      <w:proofErr w:type="gramEnd"/>
+      <w:r>
+        <w:rPr>
+          <w:rFonts w:ascii="Consolas" w:eastAsiaTheme="minorHAnsi" w:hAnsi="Consolas" w:cs="Consolas"/>
+          <w:color w:val="8064A2" w:themeColor="accent4"/>
+          <w:sz w:val="19"/>
+          <w:szCs w:val="19"/>
+        </w:rPr>
+        <w:t>)"</w:t>
       </w:r>
       <w:r>
         <w:rPr>
@@ -11539,8 +11611,13 @@
         <w:t xml:space="preserve"> </w:t>
       </w:r>
       <w:r>
-        <w:t>– all users that need to have read access to the system;</w:t>
-      </w:r>
+        <w:t xml:space="preserve">– all users that need to have read access to the </w:t>
+      </w:r>
+      <w:proofErr w:type="gramStart"/>
+      <w:r>
+        <w:t>system;</w:t>
+      </w:r>
+      <w:proofErr w:type="gramEnd"/>
     </w:p>
     <w:p>
       <w:pPr>
@@ -11641,7 +11718,21 @@
         <w:rPr>
           <w:rFonts w:ascii="Calibri" w:eastAsia="Times New Roman" w:hAnsi="Calibri" w:cs="Calibri"/>
         </w:rPr>
-        <w:t xml:space="preserve"> – AD groups allowed to access the app, at the minimum all of the above</w:t>
+        <w:t xml:space="preserve"> – AD groups allowed to access the app, at the minimum </w:t>
+      </w:r>
+      <w:proofErr w:type="gramStart"/>
+      <w:r>
+        <w:rPr>
+          <w:rFonts w:ascii="Calibri" w:eastAsia="Times New Roman" w:hAnsi="Calibri" w:cs="Calibri"/>
+        </w:rPr>
+        <w:t>all of</w:t>
+      </w:r>
+      <w:proofErr w:type="gramEnd"/>
+      <w:r>
+        <w:rPr>
+          <w:rFonts w:ascii="Calibri" w:eastAsia="Times New Roman" w:hAnsi="Calibri" w:cs="Calibri"/>
+        </w:rPr>
+        <w:t xml:space="preserve"> the above</w:t>
       </w:r>
     </w:p>
     <w:p>
@@ -11866,7 +11957,21 @@
         <w:rPr>
           <w:rFonts w:ascii="Calibri" w:eastAsia="Times New Roman" w:hAnsi="Calibri" w:cs="Calibri"/>
         </w:rPr>
-        <w:t xml:space="preserve"> setting,  update the </w:t>
+        <w:t xml:space="preserve"> </w:t>
+      </w:r>
+      <w:proofErr w:type="gramStart"/>
+      <w:r>
+        <w:rPr>
+          <w:rFonts w:ascii="Calibri" w:eastAsia="Times New Roman" w:hAnsi="Calibri" w:cs="Calibri"/>
+        </w:rPr>
+        <w:t>setting,  update</w:t>
+      </w:r>
+      <w:proofErr w:type="gramEnd"/>
+      <w:r>
+        <w:rPr>
+          <w:rFonts w:ascii="Calibri" w:eastAsia="Times New Roman" w:hAnsi="Calibri" w:cs="Calibri"/>
+        </w:rPr>
+        <w:t xml:space="preserve"> the </w:t>
       </w:r>
       <w:proofErr w:type="spellStart"/>
       <w:r>
@@ -12093,7 +12198,27 @@
           <w:sz w:val="19"/>
           <w:szCs w:val="19"/>
         </w:rPr>
-        <w:t>="(.*)"</w:t>
+        <w:t>="</w:t>
+      </w:r>
+      <w:proofErr w:type="gramStart"/>
+      <w:r>
+        <w:rPr>
+          <w:rFonts w:ascii="Consolas" w:eastAsiaTheme="minorHAnsi" w:hAnsi="Consolas" w:cs="Consolas"/>
+          <w:color w:val="8064A2" w:themeColor="accent4"/>
+          <w:sz w:val="19"/>
+          <w:szCs w:val="19"/>
+        </w:rPr>
+        <w:t>(.*</w:t>
+      </w:r>
+      <w:proofErr w:type="gramEnd"/>
+      <w:r>
+        <w:rPr>
+          <w:rFonts w:ascii="Consolas" w:eastAsiaTheme="minorHAnsi" w:hAnsi="Consolas" w:cs="Consolas"/>
+          <w:color w:val="8064A2" w:themeColor="accent4"/>
+          <w:sz w:val="19"/>
+          <w:szCs w:val="19"/>
+        </w:rPr>
+        <w:t>)"</w:t>
       </w:r>
       <w:r>
         <w:rPr>
@@ -12952,7 +13077,21 @@
         <w:rPr>
           <w:rFonts w:ascii="Calibri" w:eastAsia="Times New Roman" w:hAnsi="Calibri" w:cs="Calibri"/>
         </w:rPr>
-        <w:t xml:space="preserve"> – AD groups allowed to access the app, at the minimum all of the above</w:t>
+        <w:t xml:space="preserve"> – AD groups allowed to access the app, at the minimum </w:t>
+      </w:r>
+      <w:proofErr w:type="gramStart"/>
+      <w:r>
+        <w:rPr>
+          <w:rFonts w:ascii="Calibri" w:eastAsia="Times New Roman" w:hAnsi="Calibri" w:cs="Calibri"/>
+        </w:rPr>
+        <w:t>all of</w:t>
+      </w:r>
+      <w:proofErr w:type="gramEnd"/>
+      <w:r>
+        <w:rPr>
+          <w:rFonts w:ascii="Calibri" w:eastAsia="Times New Roman" w:hAnsi="Calibri" w:cs="Calibri"/>
+        </w:rPr>
+        <w:t xml:space="preserve"> the above</w:t>
       </w:r>
     </w:p>
     <w:p>
@@ -13177,7 +13316,21 @@
         <w:rPr>
           <w:rFonts w:ascii="Calibri" w:eastAsia="Times New Roman" w:hAnsi="Calibri" w:cs="Calibri"/>
         </w:rPr>
-        <w:t xml:space="preserve"> setting,  update the </w:t>
+        <w:t xml:space="preserve"> </w:t>
+      </w:r>
+      <w:proofErr w:type="gramStart"/>
+      <w:r>
+        <w:rPr>
+          <w:rFonts w:ascii="Calibri" w:eastAsia="Times New Roman" w:hAnsi="Calibri" w:cs="Calibri"/>
+        </w:rPr>
+        <w:t>setting,  update</w:t>
+      </w:r>
+      <w:proofErr w:type="gramEnd"/>
+      <w:r>
+        <w:rPr>
+          <w:rFonts w:ascii="Calibri" w:eastAsia="Times New Roman" w:hAnsi="Calibri" w:cs="Calibri"/>
+        </w:rPr>
+        <w:t xml:space="preserve"> the </w:t>
       </w:r>
       <w:proofErr w:type="spellStart"/>
       <w:r>
@@ -13404,7 +13557,27 @@
           <w:sz w:val="19"/>
           <w:szCs w:val="19"/>
         </w:rPr>
-        <w:t>="(.*)"</w:t>
+        <w:t>="</w:t>
+      </w:r>
+      <w:proofErr w:type="gramStart"/>
+      <w:r>
+        <w:rPr>
+          <w:rFonts w:ascii="Consolas" w:eastAsiaTheme="minorHAnsi" w:hAnsi="Consolas" w:cs="Consolas"/>
+          <w:color w:val="8064A2" w:themeColor="accent4"/>
+          <w:sz w:val="19"/>
+          <w:szCs w:val="19"/>
+        </w:rPr>
+        <w:t>(.*</w:t>
+      </w:r>
+      <w:proofErr w:type="gramEnd"/>
+      <w:r>
+        <w:rPr>
+          <w:rFonts w:ascii="Consolas" w:eastAsiaTheme="minorHAnsi" w:hAnsi="Consolas" w:cs="Consolas"/>
+          <w:color w:val="8064A2" w:themeColor="accent4"/>
+          <w:sz w:val="19"/>
+          <w:szCs w:val="19"/>
+        </w:rPr>
+        <w:t>)"</w:t>
       </w:r>
       <w:r>
         <w:rPr>
@@ -13724,16 +13897,11 @@
         </w:rPr>
         <w:t xml:space="preserve">oth) </w:t>
       </w:r>
-      <w:proofErr w:type="spellStart"/>
       <w:r>
         <w:t>g</w:t>
       </w:r>
       <w:r>
-        <w:t>enBOE</w:t>
-      </w:r>
-      <w:proofErr w:type="spellEnd"/>
-      <w:r>
-        <w:t xml:space="preserve"> Auto Backup - </w:t>
+        <w:t xml:space="preserve">enBOE Auto Backup - </w:t>
       </w:r>
       <w:proofErr w:type="spellStart"/>
       <w:r>
@@ -13806,21 +13974,7 @@
         <w:rPr>
           <w:rFonts w:ascii="Calibri" w:eastAsia="Times New Roman" w:hAnsi="Calibri" w:cs="Calibri"/>
         </w:rPr>
-        <w:t xml:space="preserve">– </w:t>
-      </w:r>
-      <w:proofErr w:type="spellStart"/>
-      <w:r>
-        <w:rPr>
-          <w:rFonts w:ascii="Calibri" w:eastAsia="Times New Roman" w:hAnsi="Calibri" w:cs="Calibri"/>
-        </w:rPr>
-        <w:t>GenBOE</w:t>
-      </w:r>
-      <w:proofErr w:type="spellEnd"/>
-      <w:r>
-        <w:rPr>
-          <w:rFonts w:ascii="Calibri" w:eastAsia="Times New Roman" w:hAnsi="Calibri" w:cs="Calibri"/>
-        </w:rPr>
-        <w:t xml:space="preserve"> database connection string</w:t>
+        <w:t>– GenBOE database connection string</w:t>
       </w:r>
     </w:p>
     <w:p>
@@ -14064,7 +14218,21 @@
         <w:rPr>
           <w:rFonts w:ascii="Calibri" w:eastAsia="Times New Roman" w:hAnsi="Calibri" w:cs="Calibri"/>
         </w:rPr>
-        <w:t xml:space="preserve"> setting,  update the </w:t>
+        <w:t xml:space="preserve"> </w:t>
+      </w:r>
+      <w:proofErr w:type="gramStart"/>
+      <w:r>
+        <w:rPr>
+          <w:rFonts w:ascii="Calibri" w:eastAsia="Times New Roman" w:hAnsi="Calibri" w:cs="Calibri"/>
+        </w:rPr>
+        <w:t>setting,  update</w:t>
+      </w:r>
+      <w:proofErr w:type="gramEnd"/>
+      <w:r>
+        <w:rPr>
+          <w:rFonts w:ascii="Calibri" w:eastAsia="Times New Roman" w:hAnsi="Calibri" w:cs="Calibri"/>
+        </w:rPr>
+        <w:t xml:space="preserve"> the </w:t>
       </w:r>
       <w:proofErr w:type="spellStart"/>
       <w:r>
@@ -14288,21 +14456,7 @@
         <w:rPr>
           <w:rFonts w:ascii="Calibri" w:eastAsia="Times New Roman" w:hAnsi="Calibri" w:cs="Calibri"/>
         </w:rPr>
-        <w:t xml:space="preserve">– </w:t>
-      </w:r>
-      <w:proofErr w:type="spellStart"/>
-      <w:r>
-        <w:rPr>
-          <w:rFonts w:ascii="Calibri" w:eastAsia="Times New Roman" w:hAnsi="Calibri" w:cs="Calibri"/>
-        </w:rPr>
-        <w:t>GenBOE</w:t>
-      </w:r>
-      <w:proofErr w:type="spellEnd"/>
-      <w:r>
-        <w:rPr>
-          <w:rFonts w:ascii="Calibri" w:eastAsia="Times New Roman" w:hAnsi="Calibri" w:cs="Calibri"/>
-        </w:rPr>
-        <w:t xml:space="preserve"> database connection string</w:t>
+        <w:t>– GenBOE database connection string</w:t>
       </w:r>
     </w:p>
     <w:p>
@@ -14711,21 +14865,7 @@
         <w:rPr>
           <w:rFonts w:ascii="Calibri" w:eastAsia="Times New Roman" w:hAnsi="Calibri" w:cs="Calibri"/>
         </w:rPr>
-        <w:t xml:space="preserve"> – all AD groups allowed to access the </w:t>
-      </w:r>
-      <w:proofErr w:type="spellStart"/>
-      <w:r>
-        <w:rPr>
-          <w:rFonts w:ascii="Calibri" w:eastAsia="Times New Roman" w:hAnsi="Calibri" w:cs="Calibri"/>
-        </w:rPr>
-        <w:t>GenBOE</w:t>
-      </w:r>
-      <w:proofErr w:type="spellEnd"/>
-      <w:r>
-        <w:rPr>
-          <w:rFonts w:ascii="Calibri" w:eastAsia="Times New Roman" w:hAnsi="Calibri" w:cs="Calibri"/>
-        </w:rPr>
-        <w:t xml:space="preserve"> application</w:t>
+        <w:t xml:space="preserve"> – all AD groups allowed to access the GenBOE application</w:t>
       </w:r>
     </w:p>
     <w:p>
@@ -14786,7 +14926,21 @@
         <w:rPr>
           <w:rFonts w:ascii="Calibri" w:eastAsia="Times New Roman" w:hAnsi="Calibri" w:cs="Calibri"/>
         </w:rPr>
-        <w:t xml:space="preserve"> setting,  update the </w:t>
+        <w:t xml:space="preserve"> </w:t>
+      </w:r>
+      <w:proofErr w:type="gramStart"/>
+      <w:r>
+        <w:rPr>
+          <w:rFonts w:ascii="Calibri" w:eastAsia="Times New Roman" w:hAnsi="Calibri" w:cs="Calibri"/>
+        </w:rPr>
+        <w:t>setting,  update</w:t>
+      </w:r>
+      <w:proofErr w:type="gramEnd"/>
+      <w:r>
+        <w:rPr>
+          <w:rFonts w:ascii="Calibri" w:eastAsia="Times New Roman" w:hAnsi="Calibri" w:cs="Calibri"/>
+        </w:rPr>
+        <w:t xml:space="preserve"> the </w:t>
       </w:r>
       <w:proofErr w:type="spellStart"/>
       <w:r>
@@ -15103,7 +15257,21 @@
         <w:rPr>
           <w:rFonts w:ascii="Calibri" w:eastAsia="Times New Roman" w:hAnsi="Calibri" w:cs="Calibri"/>
         </w:rPr>
-        <w:t xml:space="preserve"> setting,  update the </w:t>
+        <w:t xml:space="preserve"> </w:t>
+      </w:r>
+      <w:proofErr w:type="gramStart"/>
+      <w:r>
+        <w:rPr>
+          <w:rFonts w:ascii="Calibri" w:eastAsia="Times New Roman" w:hAnsi="Calibri" w:cs="Calibri"/>
+        </w:rPr>
+        <w:t>setting,  update</w:t>
+      </w:r>
+      <w:proofErr w:type="gramEnd"/>
+      <w:r>
+        <w:rPr>
+          <w:rFonts w:ascii="Calibri" w:eastAsia="Times New Roman" w:hAnsi="Calibri" w:cs="Calibri"/>
+        </w:rPr>
+        <w:t xml:space="preserve"> the </w:t>
       </w:r>
       <w:proofErr w:type="spellStart"/>
       <w:r>
@@ -15329,8 +15497,16 @@
         <w:rPr>
           <w:rFonts w:ascii="Calibri" w:eastAsia="Times New Roman" w:hAnsi="Calibri" w:cs="Calibri"/>
         </w:rPr>
-        <w:t>– emails for users that need to be notified of data loads. At the minimum Frank’s email, possibly other admins as well; comma separated list, if multiple are needed;</w:t>
-      </w:r>
+        <w:t xml:space="preserve">– emails for users that need to be notified of data loads. At the minimum Frank’s email, possibly other admins as well; comma separated list, if multiple are </w:t>
+      </w:r>
+      <w:proofErr w:type="gramStart"/>
+      <w:r>
+        <w:rPr>
+          <w:rFonts w:ascii="Calibri" w:eastAsia="Times New Roman" w:hAnsi="Calibri" w:cs="Calibri"/>
+        </w:rPr>
+        <w:t>needed;</w:t>
+      </w:r>
+      <w:proofErr w:type="gramEnd"/>
     </w:p>
     <w:p>
       <w:pPr>
@@ -15377,7 +15553,15 @@
       </w:r>
       <w:proofErr w:type="spellEnd"/>
       <w:r>
-        <w:t xml:space="preserve"> – the account has to have full access to this folder; the folder has to exist ahead of time; this is where the security will place files once they are moved from unclassified location; </w:t>
+        <w:t xml:space="preserve"> – the account has to have full access to this folder; the folder has to exist ahead of time; this is where the security will place files </w:t>
+      </w:r>
+      <w:proofErr w:type="gramStart"/>
+      <w:r>
+        <w:t>once</w:t>
+      </w:r>
+      <w:proofErr w:type="gramEnd"/>
+      <w:r>
+        <w:t xml:space="preserve"> they are moved from unclassified location; </w:t>
       </w:r>
     </w:p>
     <w:p>
@@ -15401,7 +15585,15 @@
       </w:r>
       <w:proofErr w:type="spellEnd"/>
       <w:r>
-        <w:t xml:space="preserve"> – the account has to have full access to this folder; the folder has to exist ahead of time; suggested location would be an “Archive” folder in the folder above</w:t>
+        <w:t xml:space="preserve"> – the account </w:t>
+      </w:r>
+      <w:proofErr w:type="gramStart"/>
+      <w:r>
+        <w:t>has to</w:t>
+      </w:r>
+      <w:proofErr w:type="gramEnd"/>
+      <w:r>
+        <w:t xml:space="preserve"> have full access to this folder; the folder has to exist ahead of time; suggested location would be an “Archive” folder in the folder above</w:t>
       </w:r>
     </w:p>
     <w:p>
@@ -15445,7 +15637,15 @@
       </w:r>
       <w:proofErr w:type="spellEnd"/>
       <w:r>
-        <w:t xml:space="preserve"> represents the URL of the application) is : </w:t>
+        <w:t xml:space="preserve"> represents the URL of the application) </w:t>
+      </w:r>
+      <w:proofErr w:type="gramStart"/>
+      <w:r>
+        <w:t>is :</w:t>
+      </w:r>
+      <w:proofErr w:type="gramEnd"/>
+      <w:r>
+        <w:t xml:space="preserve"> </w:t>
       </w:r>
       <w:r>
         <w:rPr>
@@ -15553,7 +15753,21 @@
         <w:rPr>
           <w:rFonts w:ascii="Calibri" w:eastAsia="Times New Roman" w:hAnsi="Calibri" w:cs="Calibri"/>
         </w:rPr>
-        <w:t xml:space="preserve"> setting,  update the </w:t>
+        <w:t xml:space="preserve"> </w:t>
+      </w:r>
+      <w:proofErr w:type="gramStart"/>
+      <w:r>
+        <w:rPr>
+          <w:rFonts w:ascii="Calibri" w:eastAsia="Times New Roman" w:hAnsi="Calibri" w:cs="Calibri"/>
+        </w:rPr>
+        <w:t>setting,  update</w:t>
+      </w:r>
+      <w:proofErr w:type="gramEnd"/>
+      <w:r>
+        <w:rPr>
+          <w:rFonts w:ascii="Calibri" w:eastAsia="Times New Roman" w:hAnsi="Calibri" w:cs="Calibri"/>
+        </w:rPr>
+        <w:t xml:space="preserve"> the </w:t>
       </w:r>
       <w:proofErr w:type="spellStart"/>
       <w:r>
@@ -15728,7 +15942,15 @@
         <w:t>The</w:t>
       </w:r>
       <w:r>
-        <w:t xml:space="preserve"> blanked out entry will look like this: </w:t>
+        <w:t xml:space="preserve"> </w:t>
+      </w:r>
+      <w:proofErr w:type="gramStart"/>
+      <w:r>
+        <w:t>blanked out</w:t>
+      </w:r>
+      <w:proofErr w:type="gramEnd"/>
+      <w:r>
+        <w:t xml:space="preserve"> entry will look like this: </w:t>
       </w:r>
       <w:r>
         <w:rPr>

</xml_diff>

<commit_message>
More Updates for Classified install 2024.1
</commit_message>
<xml_diff>
--- a/ClassifiedInstallationStuff/_Instructions/_IES Suite Upgrade Instructions.docx
+++ b/ClassifiedInstallationStuff/_Instructions/_IES Suite Upgrade Instructions.docx
@@ -2,26 +2,26 @@
 <file path=word/document.xml><?xml version="1.0" encoding="utf-8"?>
 <w:document xmlns:wpc="http://schemas.microsoft.com/office/word/2010/wordprocessingCanvas" xmlns:cx="http://schemas.microsoft.com/office/drawing/2014/chartex" xmlns:cx1="http://schemas.microsoft.com/office/drawing/2015/9/8/chartex" xmlns:cx2="http://schemas.microsoft.com/office/drawing/2015/10/21/chartex" xmlns:cx3="http://schemas.microsoft.com/office/drawing/2016/5/9/chartex" xmlns:cx4="http://schemas.microsoft.com/office/drawing/2016/5/10/chartex" xmlns:cx5="http://schemas.microsoft.com/office/drawing/2016/5/11/chartex" xmlns:cx6="http://schemas.microsoft.com/office/drawing/2016/5/12/chartex" xmlns:cx7="http://schemas.microsoft.com/office/drawing/2016/5/13/chartex" xmlns:cx8="http://schemas.microsoft.com/office/drawing/2016/5/14/chartex" xmlns:mc="http://schemas.openxmlformats.org/markup-compatibility/2006" xmlns:aink="http://schemas.microsoft.com/office/drawing/2016/ink" xmlns:am3d="http://schemas.microsoft.com/office/drawing/2017/model3d" xmlns:o="urn:schemas-microsoft-com:office:office" xmlns:oel="http://schemas.microsoft.com/office/2019/extlst" xmlns:r="http://schemas.openxmlformats.org/officeDocument/2006/relationships" xmlns:m="http://schemas.openxmlformats.org/officeDocument/2006/math" xmlns:v="urn:schemas-microsoft-com:vml" xmlns:wp14="http://schemas.microsoft.com/office/word/2010/wordprocessingDrawing" xmlns:wp="http://schemas.openxmlformats.org/drawingml/2006/wordprocessingDrawing" xmlns:w10="urn:schemas-microsoft-com:office:word" xmlns:w="http://schemas.openxmlformats.org/wordprocessingml/2006/main" xmlns:w14="http://schemas.microsoft.com/office/word/2010/wordml" xmlns:w15="http://schemas.microsoft.com/office/word/2012/wordml" xmlns:w16cex="http://schemas.microsoft.com/office/word/2018/wordml/cex" xmlns:w16cid="http://schemas.microsoft.com/office/word/2016/wordml/cid" xmlns:w16="http://schemas.microsoft.com/office/word/2018/wordml" xmlns:w16sdtdh="http://schemas.microsoft.com/office/word/2020/wordml/sdtdatahash" xmlns:w16se="http://schemas.microsoft.com/office/word/2015/wordml/symex" xmlns:wpg="http://schemas.microsoft.com/office/word/2010/wordprocessingGroup" xmlns:wpi="http://schemas.microsoft.com/office/word/2010/wordprocessingInk" xmlns:wne="http://schemas.microsoft.com/office/word/2006/wordml" xmlns:wps="http://schemas.microsoft.com/office/word/2010/wordprocessingShape" mc:Ignorable="w14 w15 w16se w16cid w16 w16cex w16sdtdh wp14">
   <w:body>
-    <w:bookmarkStart w:id="0" w:name="_Toc69207018" w:displacedByCustomXml="next"/>
-    <w:bookmarkStart w:id="1" w:name="_Toc69203962" w:displacedByCustomXml="next"/>
-    <w:bookmarkStart w:id="2" w:name="_Toc69202903" w:displacedByCustomXml="next"/>
-    <w:bookmarkStart w:id="3" w:name="_Toc4599931" w:displacedByCustomXml="next"/>
-    <w:bookmarkStart w:id="4" w:name="_Toc534277455" w:displacedByCustomXml="next"/>
-    <w:bookmarkStart w:id="5" w:name="_Toc443999444" w:displacedByCustomXml="next"/>
-    <w:bookmarkStart w:id="6" w:name="_Toc443999244" w:displacedByCustomXml="next"/>
-    <w:bookmarkStart w:id="7" w:name="_Toc435089160" w:displacedByCustomXml="next"/>
-    <w:bookmarkStart w:id="8" w:name="_Toc402261032" w:displacedByCustomXml="next"/>
-    <w:bookmarkStart w:id="9" w:name="_Toc409096411" w:displacedByCustomXml="next"/>
-    <w:bookmarkStart w:id="10" w:name="_Toc410226779" w:displacedByCustomXml="next"/>
-    <w:bookmarkStart w:id="11" w:name="_Toc410286731" w:displacedByCustomXml="next"/>
-    <w:bookmarkStart w:id="12" w:name="_Toc410652409" w:displacedByCustomXml="next"/>
-    <w:bookmarkStart w:id="13" w:name="_Toc426544400" w:displacedByCustomXml="next"/>
-    <w:bookmarkStart w:id="14" w:name="_Toc426545102" w:displacedByCustomXml="next"/>
-    <w:bookmarkStart w:id="15" w:name="_Toc426545466" w:displacedByCustomXml="next"/>
-    <w:bookmarkStart w:id="16" w:name="_Toc443996238" w:displacedByCustomXml="next"/>
-    <w:bookmarkStart w:id="17" w:name="_Toc443996285" w:displacedByCustomXml="next"/>
-    <w:bookmarkStart w:id="18" w:name="_Toc443997342" w:displacedByCustomXml="next"/>
-    <w:bookmarkStart w:id="19" w:name="_Toc34724951" w:displacedByCustomXml="next"/>
+    <w:bookmarkStart w:id="0" w:name="_Toc34724951" w:displacedByCustomXml="next"/>
+    <w:bookmarkStart w:id="1" w:name="_Toc443997342" w:displacedByCustomXml="next"/>
+    <w:bookmarkStart w:id="2" w:name="_Toc443996285" w:displacedByCustomXml="next"/>
+    <w:bookmarkStart w:id="3" w:name="_Toc443996238" w:displacedByCustomXml="next"/>
+    <w:bookmarkStart w:id="4" w:name="_Toc426545466" w:displacedByCustomXml="next"/>
+    <w:bookmarkStart w:id="5" w:name="_Toc426545102" w:displacedByCustomXml="next"/>
+    <w:bookmarkStart w:id="6" w:name="_Toc426544400" w:displacedByCustomXml="next"/>
+    <w:bookmarkStart w:id="7" w:name="_Toc410652409" w:displacedByCustomXml="next"/>
+    <w:bookmarkStart w:id="8" w:name="_Toc410286731" w:displacedByCustomXml="next"/>
+    <w:bookmarkStart w:id="9" w:name="_Toc410226779" w:displacedByCustomXml="next"/>
+    <w:bookmarkStart w:id="10" w:name="_Toc409096411" w:displacedByCustomXml="next"/>
+    <w:bookmarkStart w:id="11" w:name="_Toc402261032" w:displacedByCustomXml="next"/>
+    <w:bookmarkStart w:id="12" w:name="_Toc435089160" w:displacedByCustomXml="next"/>
+    <w:bookmarkStart w:id="13" w:name="_Toc443999244" w:displacedByCustomXml="next"/>
+    <w:bookmarkStart w:id="14" w:name="_Toc443999444" w:displacedByCustomXml="next"/>
+    <w:bookmarkStart w:id="15" w:name="_Toc534277455" w:displacedByCustomXml="next"/>
+    <w:bookmarkStart w:id="16" w:name="_Toc4599931" w:displacedByCustomXml="next"/>
+    <w:bookmarkStart w:id="17" w:name="_Toc69202903" w:displacedByCustomXml="next"/>
+    <w:bookmarkStart w:id="18" w:name="_Toc69203962" w:displacedByCustomXml="next"/>
+    <w:bookmarkStart w:id="19" w:name="_Toc69207018" w:displacedByCustomXml="next"/>
     <w:sdt>
       <w:sdtPr>
         <w:rPr>
@@ -49,8 +49,8 @@
         </w:rPr>
       </w:sdtEndPr>
       <w:sdtContent>
-        <w:bookmarkStart w:id="20" w:name="_Toc320016168" w:displacedByCustomXml="prev"/>
-        <w:bookmarkStart w:id="21" w:name="_Toc266280202" w:displacedByCustomXml="prev"/>
+        <w:bookmarkStart w:id="20" w:name="_Toc266280202" w:displacedByCustomXml="prev"/>
+        <w:bookmarkStart w:id="21" w:name="_Toc320016168" w:displacedByCustomXml="prev"/>
         <w:p>
           <w:pPr>
             <w:pStyle w:val="Heading1"/>
@@ -577,6 +577,97 @@
               <w:p>
                 <w:pPr>
                   <w:cnfStyle w:val="000000010000" w:firstRow="0" w:lastRow="0" w:firstColumn="0" w:lastColumn="0" w:oddVBand="0" w:evenVBand="0" w:oddHBand="0" w:evenHBand="1" w:firstRowFirstColumn="0" w:firstRowLastColumn="0" w:lastRowFirstColumn="0" w:lastRowLastColumn="0"/>
+                </w:pPr>
+                <w:r>
+                  <w:t>Timothy Wilson</w:t>
+                </w:r>
+              </w:p>
+            </w:tc>
+          </w:tr>
+          <w:tr>
+            <w:trPr>
+              <w:cnfStyle w:val="000000100000" w:firstRow="0" w:lastRow="0" w:firstColumn="0" w:lastColumn="0" w:oddVBand="0" w:evenVBand="0" w:oddHBand="1" w:evenHBand="0" w:firstRowFirstColumn="0" w:firstRowLastColumn="0" w:lastRowFirstColumn="0" w:lastRowLastColumn="0"/>
+            </w:trPr>
+            <w:tc>
+              <w:tcPr>
+                <w:cnfStyle w:val="001000000000" w:firstRow="0" w:lastRow="0" w:firstColumn="1" w:lastColumn="0" w:oddVBand="0" w:evenVBand="0" w:oddHBand="0" w:evenHBand="0" w:firstRowFirstColumn="0" w:firstRowLastColumn="0" w:lastRowFirstColumn="0" w:lastRowLastColumn="0"/>
+                <w:tcW w:w="1188" w:type="dxa"/>
+              </w:tcPr>
+              <w:p>
+                <w:r>
+                  <w:t>20</w:t>
+                </w:r>
+              </w:p>
+            </w:tc>
+            <w:tc>
+              <w:tcPr>
+                <w:tcW w:w="1278" w:type="dxa"/>
+              </w:tcPr>
+              <w:p>
+                <w:pPr>
+                  <w:cnfStyle w:val="000000100000" w:firstRow="0" w:lastRow="0" w:firstColumn="0" w:lastColumn="0" w:oddVBand="0" w:evenVBand="0" w:oddHBand="1" w:evenHBand="0" w:firstRowFirstColumn="0" w:firstRowLastColumn="0" w:lastRowFirstColumn="0" w:lastRowLastColumn="0"/>
+                </w:pPr>
+                <w:r>
+                  <w:t>1/17/2024</w:t>
+                </w:r>
+              </w:p>
+            </w:tc>
+            <w:tc>
+              <w:tcPr>
+                <w:tcW w:w="4726" w:type="dxa"/>
+              </w:tcPr>
+              <w:p>
+                <w:pPr>
+                  <w:cnfStyle w:val="000000100000" w:firstRow="0" w:lastRow="0" w:firstColumn="0" w:lastColumn="0" w:oddVBand="0" w:evenVBand="0" w:oddHBand="1" w:evenHBand="0" w:firstRowFirstColumn="0" w:firstRowLastColumn="0" w:lastRowFirstColumn="0" w:lastRowLastColumn="0"/>
+                </w:pPr>
+                <w:r>
+                  <w:t>Added new values into web.config as of IES.2024.1 (</w:t>
+                </w:r>
+                <w:r>
+                  <w:rPr>
+                    <w:rFonts w:ascii="Cascadia Mono" w:eastAsiaTheme="minorHAnsi" w:hAnsi="Cascadia Mono" w:cs="Cascadia Mono"/>
+                    <w:color w:val="0000FF"/>
+                    <w:sz w:val="19"/>
+                    <w:szCs w:val="19"/>
+                  </w:rPr>
+                  <w:t>IESBannerApp</w:t>
+                </w:r>
+                <w:r>
+                  <w:rPr>
+                    <w:rFonts w:ascii="Cascadia Mono" w:eastAsiaTheme="minorHAnsi" w:hAnsi="Cascadia Mono" w:cs="Cascadia Mono"/>
+                    <w:color w:val="0000FF"/>
+                    <w:sz w:val="19"/>
+                    <w:szCs w:val="19"/>
+                  </w:rPr>
+                  <w:t xml:space="preserve">, </w:t>
+                </w:r>
+                <w:r>
+                  <w:rPr>
+                    <w:rFonts w:ascii="Cascadia Mono" w:eastAsiaTheme="minorHAnsi" w:hAnsi="Cascadia Mono" w:cs="Cascadia Mono"/>
+                    <w:color w:val="0000FF"/>
+                    <w:sz w:val="19"/>
+                    <w:szCs w:val="19"/>
+                  </w:rPr>
+                  <w:t>OneLmxStartDate</w:t>
+                </w:r>
+                <w:r>
+                  <w:rPr>
+                    <w:rFonts w:ascii="Cascadia Mono" w:eastAsiaTheme="minorHAnsi" w:hAnsi="Cascadia Mono" w:cs="Cascadia Mono"/>
+                    <w:color w:val="0000FF"/>
+                    <w:sz w:val="19"/>
+                    <w:szCs w:val="19"/>
+                  </w:rPr>
+                  <w:t>)</w:t>
+                </w:r>
+              </w:p>
+            </w:tc>
+            <w:tc>
+              <w:tcPr>
+                <w:tcW w:w="1772" w:type="dxa"/>
+              </w:tcPr>
+              <w:p>
+                <w:pPr>
+                  <w:cnfStyle w:val="000000100000" w:firstRow="0" w:lastRow="0" w:firstColumn="0" w:lastColumn="0" w:oddVBand="0" w:evenVBand="0" w:oddHBand="1" w:evenHBand="0" w:firstRowFirstColumn="0" w:firstRowLastColumn="0" w:lastRowFirstColumn="0" w:lastRowLastColumn="0"/>
                 </w:pPr>
                 <w:r>
                   <w:t>Timothy Wilson</w:t>
@@ -1680,10 +1771,10 @@
         </w:p>
       </w:sdtContent>
     </w:sdt>
-    <w:bookmarkStart w:id="49" w:name="_Toc443999447" w:displacedByCustomXml="prev"/>
-    <w:bookmarkStart w:id="50" w:name="_Toc534277458" w:displacedByCustomXml="prev"/>
-    <w:bookmarkStart w:id="51" w:name="_Toc4599934" w:displacedByCustomXml="prev"/>
-    <w:bookmarkStart w:id="52" w:name="_Toc34724954" w:displacedByCustomXml="prev"/>
+    <w:bookmarkStart w:id="49" w:name="_Toc34724954" w:displacedByCustomXml="prev"/>
+    <w:bookmarkStart w:id="50" w:name="_Toc4599934" w:displacedByCustomXml="prev"/>
+    <w:bookmarkStart w:id="51" w:name="_Toc534277458" w:displacedByCustomXml="prev"/>
+    <w:bookmarkStart w:id="52" w:name="_Toc443999447" w:displacedByCustomXml="prev"/>
     <w:p>
       <w:pPr>
         <w:pStyle w:val="Heading1"/>
@@ -2002,6 +2093,7 @@
         </w:numPr>
       </w:pPr>
       <w:r>
+        <w:lastRenderedPageBreak/>
         <w:t>Web application files, needed for the application</w:t>
       </w:r>
       <w:r>
@@ -2062,7 +2154,6 @@
         <w:rPr>
           <w:color w:val="E36C0A" w:themeColor="accent6" w:themeShade="BF"/>
         </w:rPr>
-        <w:lastRenderedPageBreak/>
         <w:t xml:space="preserve">(Space) </w:t>
       </w:r>
       <w:r>
@@ -4221,69 +4312,15 @@
       <w:r>
         <w:t xml:space="preserve">. Our location for example is: </w:t>
       </w:r>
-      <w:r>
-        <w:t>“</w:t>
-      </w:r>
-      <w:r>
-        <w:t>https://space.p.external.lmco.com/sites/fbo/CCDME/Estimating/SiteLinks/genBOE (includes User Training List)/genBOE MOQ Types Help Text/</w:t>
-      </w:r>
-      <w:r>
-        <w:t>”</w:t>
-      </w:r>
+      <w:hyperlink r:id="rId12" w:history="1">
+        <w:r>
+          <w:rPr>
+            <w:rStyle w:val="Hyperlink"/>
+          </w:rPr>
+          <w:t>https://space.p.external.lmco.com/sites/fbo/CCDME/Estimating/SiteLinks/genBOE (includes User Training List)/genBOE MOQ Types Help Text/</w:t>
+        </w:r>
+      </w:hyperlink>
       <w:bookmarkStart w:id="66" w:name="_Hlk108615124"/>
-      <w:r>
-        <w:rPr>
-          <w:rFonts w:ascii="Consolas" w:eastAsiaTheme="minorHAnsi" w:hAnsi="Consolas" w:cs="Consolas"/>
-          <w:color w:val="008000"/>
-          <w:sz w:val="19"/>
-          <w:szCs w:val="19"/>
-        </w:rPr>
-        <w:br w:type="page"/>
-      </w:r>
-    </w:p>
-    <w:p>
-      <w:pPr>
-        <w:pStyle w:val="ListParagraph"/>
-        <w:spacing w:after="0"/>
-        <w:ind w:left="1440"/>
-      </w:pPr>
-      <w:commentRangeStart w:id="67"/>
-      <w:r>
-        <w:rPr>
-          <w:rFonts w:ascii="Consolas" w:eastAsiaTheme="minorHAnsi" w:hAnsi="Consolas" w:cs="Consolas"/>
-          <w:color w:val="008000"/>
-          <w:sz w:val="19"/>
-          <w:szCs w:val="19"/>
-        </w:rPr>
-        <w:lastRenderedPageBreak/>
-        <w:t>SAP</w:t>
-      </w:r>
-      <w:commentRangeEnd w:id="67"/>
-      <w:r>
-        <w:rPr>
-          <w:rStyle w:val="CommentReference"/>
-          <w:rFonts w:ascii="Calibri" w:eastAsiaTheme="minorHAnsi" w:hAnsi="Calibri" w:cs="Times New Roman"/>
-        </w:rPr>
-        <w:commentReference w:id="67"/>
-      </w:r>
-      <w:r>
-        <w:rPr>
-          <w:rFonts w:ascii="Consolas" w:eastAsiaTheme="minorHAnsi" w:hAnsi="Consolas" w:cs="Consolas"/>
-          <w:color w:val="008000"/>
-          <w:sz w:val="19"/>
-          <w:szCs w:val="19"/>
-        </w:rPr>
-        <w:t xml:space="preserve"> </w:t>
-      </w:r>
-      <w:r>
-        <w:rPr>
-          <w:rFonts w:ascii="Consolas" w:eastAsiaTheme="minorHAnsi" w:hAnsi="Consolas" w:cs="Consolas"/>
-          <w:color w:val="008000"/>
-          <w:sz w:val="19"/>
-          <w:szCs w:val="19"/>
-        </w:rPr>
-        <w:t>Settings</w:t>
-      </w:r>
     </w:p>
     <w:p>
       <w:pPr>
@@ -4293,45 +4330,42 @@
           <w:numId w:val="4"/>
         </w:numPr>
         <w:spacing w:after="0"/>
-      </w:pPr>
-      <w:r>
-        <w:rPr>
-          <w:rFonts w:ascii="Consolas" w:eastAsiaTheme="minorHAnsi" w:hAnsi="Consolas" w:cs="Consolas"/>
-          <w:color w:val="0000FF"/>
-          <w:sz w:val="19"/>
-          <w:szCs w:val="19"/>
-        </w:rPr>
-        <w:t>oAuthDomain</w:t>
-      </w:r>
-      <w:r>
-        <w:rPr>
-          <w:rFonts w:ascii="Consolas" w:eastAsiaTheme="minorHAnsi" w:hAnsi="Consolas" w:cs="Consolas"/>
-          <w:color w:val="0000FF"/>
-          <w:sz w:val="19"/>
-          <w:szCs w:val="19"/>
-        </w:rPr>
-        <w:t xml:space="preserve"> </w:t>
-      </w:r>
-      <w:r>
-        <w:t xml:space="preserve">– </w:t>
-      </w:r>
-      <w:r>
-        <w:rPr>
-          <w:rFonts w:ascii="Calibri" w:eastAsia="Times New Roman" w:hAnsi="Calibri" w:cs="Calibri"/>
-          <w:i/>
-        </w:rPr>
-        <w:t>blank</w:t>
-      </w:r>
-      <w:r>
-        <w:rPr>
-          <w:rFonts w:ascii="Calibri" w:eastAsia="Times New Roman" w:hAnsi="Calibri" w:cs="Calibri"/>
-          <w:i/>
-          <w:vertAlign w:val="superscript"/>
-        </w:rPr>
-        <w:t>2</w:t>
-      </w:r>
-    </w:p>
-    <w:bookmarkEnd w:id="66"/>
+        <w:rPr>
+          <w:rFonts w:ascii="Consolas" w:eastAsiaTheme="minorHAnsi" w:hAnsi="Consolas" w:cs="Consolas"/>
+          <w:color w:val="008000"/>
+          <w:sz w:val="19"/>
+          <w:szCs w:val="19"/>
+        </w:rPr>
+      </w:pPr>
+      <w:r>
+        <w:rPr>
+          <w:rFonts w:ascii="Cascadia Mono" w:eastAsiaTheme="minorHAnsi" w:hAnsi="Cascadia Mono" w:cs="Cascadia Mono"/>
+          <w:color w:val="0000FF"/>
+          <w:sz w:val="19"/>
+          <w:szCs w:val="19"/>
+        </w:rPr>
+        <w:lastRenderedPageBreak/>
+        <w:t>OneLmxStartDate</w:t>
+      </w:r>
+      <w:r>
+        <w:rPr>
+          <w:rFonts w:ascii="Cascadia Mono" w:eastAsiaTheme="minorHAnsi" w:hAnsi="Cascadia Mono" w:cs="Cascadia Mono"/>
+          <w:color w:val="0000FF"/>
+          <w:sz w:val="19"/>
+          <w:szCs w:val="19"/>
+        </w:rPr>
+        <w:t xml:space="preserve"> – </w:t>
+      </w:r>
+      <w:r>
+        <w:t xml:space="preserve">set this to the cutoff for when </w:t>
+      </w:r>
+      <w:r>
+        <w:t xml:space="preserve">the Business Area </w:t>
+      </w:r>
+      <w:r>
+        <w:t>cuts over to using 1LMX rates</w:t>
+      </w:r>
+    </w:p>
     <w:p>
       <w:pPr>
         <w:pStyle w:val="ListParagraph"/>
@@ -4340,26 +4374,92 @@
           <w:numId w:val="4"/>
         </w:numPr>
         <w:spacing w:after="0"/>
+        <w:rPr>
+          <w:rFonts w:ascii="Consolas" w:eastAsiaTheme="minorHAnsi" w:hAnsi="Consolas" w:cs="Consolas"/>
+          <w:color w:val="008000"/>
+          <w:sz w:val="19"/>
+          <w:szCs w:val="19"/>
+        </w:rPr>
+      </w:pPr>
+      <w:r>
+        <w:rPr>
+          <w:rFonts w:ascii="Cascadia Mono" w:eastAsiaTheme="minorHAnsi" w:hAnsi="Cascadia Mono" w:cs="Cascadia Mono"/>
+          <w:color w:val="0000FF"/>
+          <w:sz w:val="19"/>
+          <w:szCs w:val="19"/>
+        </w:rPr>
+        <w:t>IESBannerApp –</w:t>
+      </w:r>
+      <w:r>
+        <w:rPr>
+          <w:rFonts w:ascii="Consolas" w:eastAsiaTheme="minorHAnsi" w:hAnsi="Consolas" w:cs="Consolas"/>
+          <w:color w:val="008000"/>
+          <w:sz w:val="19"/>
+          <w:szCs w:val="19"/>
+        </w:rPr>
+        <w:t xml:space="preserve"> </w:t>
+      </w:r>
+    </w:p>
+    <w:p>
+      <w:pPr>
+        <w:pStyle w:val="ListParagraph"/>
+        <w:numPr>
+          <w:ilvl w:val="2"/>
+          <w:numId w:val="4"/>
+        </w:numPr>
+        <w:spacing w:after="0"/>
+        <w:textAlignment w:val="center"/>
+        <w:rPr>
+          <w:rFonts w:ascii="Calibri" w:eastAsia="Times New Roman" w:hAnsi="Calibri" w:cs="Calibri"/>
+        </w:rPr>
+      </w:pPr>
+      <w:r>
+        <w:rPr>
+          <w:rFonts w:ascii="Calibri" w:eastAsia="Times New Roman" w:hAnsi="Calibri" w:cs="Calibri"/>
+          <w:color w:val="E36C0A" w:themeColor="accent6" w:themeShade="BF"/>
+        </w:rPr>
+        <w:t>Space</w:t>
+      </w:r>
+      <w:r>
+        <w:t xml:space="preserve">: </w:t>
+      </w:r>
+      <w:r>
+        <w:t xml:space="preserve">set to </w:t>
+      </w:r>
+      <w:r>
         <w:rPr>
           <w:rFonts w:ascii="Consolas" w:hAnsi="Consolas" w:cs="Consolas"/>
           <w:color w:val="1F497D" w:themeColor="text2"/>
           <w:sz w:val="20"/>
         </w:rPr>
-      </w:pPr>
-      <w:r>
-        <w:rPr>
-          <w:rFonts w:ascii="Consolas" w:eastAsiaTheme="minorHAnsi" w:hAnsi="Consolas" w:cs="Consolas"/>
-          <w:color w:val="0000FF"/>
-          <w:sz w:val="19"/>
-          <w:szCs w:val="19"/>
-        </w:rPr>
-        <w:t xml:space="preserve">EnableSAP </w:t>
-      </w:r>
-      <w:r>
-        <w:t>–</w:t>
-      </w:r>
-      <w:r>
-        <w:t xml:space="preserve"> set to </w:t>
+        <w:t>BOESSC</w:t>
+      </w:r>
+    </w:p>
+    <w:p>
+      <w:pPr>
+        <w:pStyle w:val="ListParagraph"/>
+        <w:numPr>
+          <w:ilvl w:val="2"/>
+          <w:numId w:val="4"/>
+        </w:numPr>
+        <w:spacing w:after="0"/>
+        <w:textAlignment w:val="center"/>
+        <w:rPr>
+          <w:rFonts w:ascii="Calibri" w:eastAsia="Times New Roman" w:hAnsi="Calibri" w:cs="Calibri"/>
+        </w:rPr>
+      </w:pPr>
+      <w:r>
+        <w:rPr>
+          <w:rFonts w:ascii="Calibri" w:eastAsia="Times New Roman" w:hAnsi="Calibri" w:cs="Calibri"/>
+          <w:color w:val="E36C0A" w:themeColor="accent6" w:themeShade="BF"/>
+        </w:rPr>
+        <w:t>RMS</w:t>
+      </w:r>
+      <w:r>
+        <w:t>: keep at</w:t>
+      </w:r>
+      <w:r>
+        <w:t xml:space="preserve"> </w:t>
       </w:r>
       <w:r>
         <w:rPr>
@@ -4367,9 +4467,108 @@
           <w:color w:val="1F497D" w:themeColor="text2"/>
           <w:sz w:val="20"/>
         </w:rPr>
-        <w:t>false</w:t>
-      </w:r>
-    </w:p>
+        <w:t>BOERMS</w:t>
+      </w:r>
+    </w:p>
+    <w:p>
+      <w:pPr>
+        <w:pStyle w:val="ListParagraph"/>
+        <w:spacing w:after="0"/>
+        <w:ind w:left="1440"/>
+      </w:pPr>
+      <w:r>
+        <w:rPr>
+          <w:rFonts w:ascii="Consolas" w:eastAsiaTheme="minorHAnsi" w:hAnsi="Consolas" w:cs="Consolas"/>
+          <w:color w:val="008000"/>
+          <w:sz w:val="19"/>
+          <w:szCs w:val="19"/>
+        </w:rPr>
+        <w:br/>
+      </w:r>
+      <w:commentRangeStart w:id="67"/>
+      <w:r>
+        <w:rPr>
+          <w:rFonts w:ascii="Consolas" w:eastAsiaTheme="minorHAnsi" w:hAnsi="Consolas" w:cs="Consolas"/>
+          <w:color w:val="008000"/>
+          <w:sz w:val="19"/>
+          <w:szCs w:val="19"/>
+        </w:rPr>
+        <w:t>SAP</w:t>
+      </w:r>
+      <w:commentRangeEnd w:id="67"/>
+      <w:r>
+        <w:rPr>
+          <w:rStyle w:val="CommentReference"/>
+          <w:rFonts w:ascii="Calibri" w:eastAsiaTheme="minorHAnsi" w:hAnsi="Calibri" w:cs="Times New Roman"/>
+        </w:rPr>
+        <w:commentReference w:id="67"/>
+      </w:r>
+      <w:r>
+        <w:rPr>
+          <w:rFonts w:ascii="Consolas" w:eastAsiaTheme="minorHAnsi" w:hAnsi="Consolas" w:cs="Consolas"/>
+          <w:color w:val="008000"/>
+          <w:sz w:val="19"/>
+          <w:szCs w:val="19"/>
+        </w:rPr>
+        <w:t xml:space="preserve"> </w:t>
+      </w:r>
+      <w:r>
+        <w:rPr>
+          <w:rFonts w:ascii="Consolas" w:eastAsiaTheme="minorHAnsi" w:hAnsi="Consolas" w:cs="Consolas"/>
+          <w:color w:val="008000"/>
+          <w:sz w:val="19"/>
+          <w:szCs w:val="19"/>
+        </w:rPr>
+        <w:t>Settings</w:t>
+      </w:r>
+    </w:p>
+    <w:p>
+      <w:pPr>
+        <w:pStyle w:val="ListParagraph"/>
+        <w:numPr>
+          <w:ilvl w:val="1"/>
+          <w:numId w:val="4"/>
+        </w:numPr>
+        <w:spacing w:after="0"/>
+      </w:pPr>
+      <w:r>
+        <w:rPr>
+          <w:rFonts w:ascii="Consolas" w:eastAsiaTheme="minorHAnsi" w:hAnsi="Consolas" w:cs="Consolas"/>
+          <w:color w:val="0000FF"/>
+          <w:sz w:val="19"/>
+          <w:szCs w:val="19"/>
+        </w:rPr>
+        <w:t>oAuthDomain</w:t>
+      </w:r>
+      <w:r>
+        <w:rPr>
+          <w:rFonts w:ascii="Consolas" w:eastAsiaTheme="minorHAnsi" w:hAnsi="Consolas" w:cs="Consolas"/>
+          <w:color w:val="0000FF"/>
+          <w:sz w:val="19"/>
+          <w:szCs w:val="19"/>
+        </w:rPr>
+        <w:t xml:space="preserve"> </w:t>
+      </w:r>
+      <w:r>
+        <w:t xml:space="preserve">– </w:t>
+      </w:r>
+      <w:r>
+        <w:rPr>
+          <w:rFonts w:ascii="Calibri" w:eastAsia="Times New Roman" w:hAnsi="Calibri" w:cs="Calibri"/>
+          <w:i/>
+        </w:rPr>
+        <w:t>blank</w:t>
+      </w:r>
+      <w:r>
+        <w:rPr>
+          <w:rFonts w:ascii="Calibri" w:eastAsia="Times New Roman" w:hAnsi="Calibri" w:cs="Calibri"/>
+          <w:i/>
+          <w:vertAlign w:val="superscript"/>
+        </w:rPr>
+        <w:t>2</w:t>
+      </w:r>
+    </w:p>
+    <w:bookmarkEnd w:id="66"/>
     <w:p>
       <w:pPr>
         <w:pStyle w:val="ListParagraph"/>
@@ -4391,59 +4590,21 @@
           <w:sz w:val="19"/>
           <w:szCs w:val="19"/>
         </w:rPr>
-        <w:t xml:space="preserve">IESSAPUrl </w:t>
-      </w:r>
-      <w:r>
-        <w:t xml:space="preserve">– </w:t>
-      </w:r>
-      <w:r>
-        <w:rPr>
-          <w:rFonts w:ascii="Calibri" w:eastAsia="Times New Roman" w:hAnsi="Calibri" w:cs="Calibri"/>
-          <w:i/>
-        </w:rPr>
-        <w:t>blank</w:t>
-      </w:r>
-      <w:r>
-        <w:rPr>
-          <w:rFonts w:ascii="Calibri" w:eastAsia="Times New Roman" w:hAnsi="Calibri" w:cs="Calibri"/>
-          <w:i/>
-          <w:vertAlign w:val="superscript"/>
-        </w:rPr>
-        <w:t>2</w:t>
-      </w:r>
-    </w:p>
-    <w:p>
-      <w:pPr>
-        <w:pStyle w:val="ListParagraph"/>
-        <w:numPr>
-          <w:ilvl w:val="1"/>
-          <w:numId w:val="4"/>
-        </w:numPr>
-        <w:spacing w:after="0"/>
+        <w:t xml:space="preserve">EnableSAP </w:t>
+      </w:r>
+      <w:r>
+        <w:t>–</w:t>
+      </w:r>
+      <w:r>
+        <w:t xml:space="preserve"> set to </w:t>
+      </w:r>
+      <w:r>
         <w:rPr>
           <w:rFonts w:ascii="Consolas" w:hAnsi="Consolas" w:cs="Consolas"/>
           <w:color w:val="1F497D" w:themeColor="text2"/>
           <w:sz w:val="20"/>
         </w:rPr>
-      </w:pPr>
-      <w:r>
-        <w:rPr>
-          <w:rFonts w:ascii="Consolas" w:eastAsiaTheme="minorHAnsi" w:hAnsi="Consolas" w:cs="Consolas"/>
-          <w:color w:val="0000FF"/>
-          <w:sz w:val="19"/>
-          <w:szCs w:val="19"/>
-        </w:rPr>
-        <w:t xml:space="preserve">SAPSpaceStartDate </w:t>
-      </w:r>
-      <w:r>
-        <w:t xml:space="preserve">– </w:t>
-      </w:r>
-      <w:r>
-        <w:rPr>
-          <w:rFonts w:ascii="Calibri" w:eastAsia="Times New Roman" w:hAnsi="Calibri" w:cs="Calibri"/>
-          <w:iCs/>
-        </w:rPr>
-        <w:t>leave as is, once SAP integration is available, we can worry about this value</w:t>
+        <w:t>false</w:t>
       </w:r>
     </w:p>
     <w:p>
@@ -4467,16 +4628,7 @@
           <w:sz w:val="19"/>
           <w:szCs w:val="19"/>
         </w:rPr>
-        <w:t>oAuthIESClientId</w:t>
-      </w:r>
-      <w:r>
-        <w:rPr>
-          <w:rFonts w:ascii="Consolas" w:eastAsiaTheme="minorHAnsi" w:hAnsi="Consolas" w:cs="Consolas"/>
-          <w:color w:val="0000FF"/>
-          <w:sz w:val="19"/>
-          <w:szCs w:val="19"/>
-        </w:rPr>
-        <w:t xml:space="preserve"> </w:t>
+        <w:t xml:space="preserve">IESSAPUrl </w:t>
       </w:r>
       <w:r>
         <w:t xml:space="preserve">– </w:t>
@@ -4518,16 +4670,7 @@
           <w:sz w:val="19"/>
           <w:szCs w:val="19"/>
         </w:rPr>
-        <w:t>oAuthIESClientSecret</w:t>
-      </w:r>
-      <w:r>
-        <w:rPr>
-          <w:rFonts w:ascii="Consolas" w:eastAsiaTheme="minorHAnsi" w:hAnsi="Consolas" w:cs="Consolas"/>
-          <w:color w:val="0000FF"/>
-          <w:sz w:val="19"/>
-          <w:szCs w:val="19"/>
-        </w:rPr>
-        <w:t xml:space="preserve"> </w:t>
+        <w:t xml:space="preserve">SAPSpaceStartDate </w:t>
       </w:r>
       <w:r>
         <w:t xml:space="preserve">– </w:t>
@@ -4535,22 +4678,18 @@
       <w:r>
         <w:rPr>
           <w:rFonts w:ascii="Calibri" w:eastAsia="Times New Roman" w:hAnsi="Calibri" w:cs="Calibri"/>
-          <w:i/>
-        </w:rPr>
-        <w:t>blank</w:t>
-      </w:r>
-      <w:r>
-        <w:rPr>
-          <w:rFonts w:ascii="Calibri" w:eastAsia="Times New Roman" w:hAnsi="Calibri" w:cs="Calibri"/>
-          <w:i/>
-          <w:vertAlign w:val="superscript"/>
-        </w:rPr>
-        <w:t>2</w:t>
-      </w:r>
-    </w:p>
-    <w:p>
-      <w:pPr>
-        <w:pStyle w:val="ListParagraph"/>
+          <w:iCs/>
+        </w:rPr>
+        <w:t>leave as is, once SAP integration is available, we can worry about this value</w:t>
+      </w:r>
+    </w:p>
+    <w:p>
+      <w:pPr>
+        <w:pStyle w:val="ListParagraph"/>
+        <w:numPr>
+          <w:ilvl w:val="1"/>
+          <w:numId w:val="4"/>
+        </w:numPr>
         <w:spacing w:after="0"/>
         <w:rPr>
           <w:rFonts w:ascii="Consolas" w:hAnsi="Consolas" w:cs="Consolas"/>
@@ -4558,21 +4697,41 @@
           <w:sz w:val="20"/>
         </w:rPr>
       </w:pPr>
-    </w:p>
-    <w:p>
-      <w:pPr>
-        <w:pStyle w:val="ListParagraph"/>
-        <w:spacing w:after="0"/>
-        <w:ind w:left="1440"/>
-      </w:pPr>
-      <w:r>
-        <w:rPr>
-          <w:rFonts w:ascii="Consolas" w:eastAsiaTheme="minorHAnsi" w:hAnsi="Consolas" w:cs="Consolas"/>
-          <w:color w:val="008000"/>
-          <w:sz w:val="19"/>
-          <w:szCs w:val="19"/>
-        </w:rPr>
-        <w:t>SSC Settings</w:t>
+      <w:r>
+        <w:rPr>
+          <w:rFonts w:ascii="Consolas" w:eastAsiaTheme="minorHAnsi" w:hAnsi="Consolas" w:cs="Consolas"/>
+          <w:color w:val="0000FF"/>
+          <w:sz w:val="19"/>
+          <w:szCs w:val="19"/>
+        </w:rPr>
+        <w:t>oAuthIESClientId</w:t>
+      </w:r>
+      <w:r>
+        <w:rPr>
+          <w:rFonts w:ascii="Consolas" w:eastAsiaTheme="minorHAnsi" w:hAnsi="Consolas" w:cs="Consolas"/>
+          <w:color w:val="0000FF"/>
+          <w:sz w:val="19"/>
+          <w:szCs w:val="19"/>
+        </w:rPr>
+        <w:t xml:space="preserve"> </w:t>
+      </w:r>
+      <w:r>
+        <w:t xml:space="preserve">– </w:t>
+      </w:r>
+      <w:r>
+        <w:rPr>
+          <w:rFonts w:ascii="Calibri" w:eastAsia="Times New Roman" w:hAnsi="Calibri" w:cs="Calibri"/>
+          <w:i/>
+        </w:rPr>
+        <w:t>blank</w:t>
+      </w:r>
+      <w:r>
+        <w:rPr>
+          <w:rFonts w:ascii="Calibri" w:eastAsia="Times New Roman" w:hAnsi="Calibri" w:cs="Calibri"/>
+          <w:i/>
+          <w:vertAlign w:val="superscript"/>
+        </w:rPr>
+        <w:t>2</w:t>
       </w:r>
     </w:p>
     <w:p>
@@ -4583,92 +4742,74 @@
           <w:numId w:val="4"/>
         </w:numPr>
         <w:spacing w:after="0"/>
-      </w:pPr>
-      <w:r>
-        <w:rPr>
-          <w:rFonts w:ascii="Consolas" w:eastAsiaTheme="minorHAnsi" w:hAnsi="Consolas" w:cs="Consolas"/>
-          <w:color w:val="0000FF"/>
-          <w:sz w:val="19"/>
-          <w:szCs w:val="19"/>
-        </w:rPr>
-        <w:t>ShowEquivalentPersonsOption</w:t>
-      </w:r>
-    </w:p>
-    <w:p>
-      <w:pPr>
-        <w:pStyle w:val="ListParagraph"/>
-        <w:numPr>
-          <w:ilvl w:val="2"/>
-          <w:numId w:val="30"/>
-        </w:numPr>
-        <w:spacing w:after="0"/>
-      </w:pPr>
-      <w:r>
-        <w:rPr>
-          <w:rFonts w:ascii="Calibri" w:eastAsia="Times New Roman" w:hAnsi="Calibri" w:cs="Calibri"/>
-          <w:color w:val="E36C0A" w:themeColor="accent6" w:themeShade="BF"/>
-        </w:rPr>
-        <w:t>Space</w:t>
-      </w:r>
-      <w:r>
-        <w:t>:</w:t>
-      </w:r>
-      <w:r>
-        <w:t xml:space="preserve"> set as appropriate</w:t>
-      </w:r>
-      <w:r>
-        <w:t xml:space="preserve">, </w:t>
-      </w:r>
-      <w:r>
-        <w:t xml:space="preserve"> </w:t>
-      </w:r>
-      <w:r>
         <w:rPr>
           <w:rFonts w:ascii="Consolas" w:hAnsi="Consolas" w:cs="Consolas"/>
           <w:color w:val="1F497D" w:themeColor="text2"/>
           <w:sz w:val="20"/>
         </w:rPr>
-        <w:t>true</w:t>
-      </w:r>
-      <w:r>
+      </w:pPr>
+      <w:r>
+        <w:rPr>
+          <w:rFonts w:ascii="Consolas" w:eastAsiaTheme="minorHAnsi" w:hAnsi="Consolas" w:cs="Consolas"/>
+          <w:color w:val="0000FF"/>
+          <w:sz w:val="19"/>
+          <w:szCs w:val="19"/>
+        </w:rPr>
+        <w:t>oAuthIESClientSecret</w:t>
+      </w:r>
+      <w:r>
+        <w:rPr>
+          <w:rFonts w:ascii="Consolas" w:eastAsiaTheme="minorHAnsi" w:hAnsi="Consolas" w:cs="Consolas"/>
+          <w:color w:val="0000FF"/>
+          <w:sz w:val="19"/>
+          <w:szCs w:val="19"/>
+        </w:rPr>
         <w:t xml:space="preserve"> </w:t>
       </w:r>
       <w:r>
-        <w:t>will cause EPs to be used, instead of hours</w:t>
-      </w:r>
-    </w:p>
-    <w:p>
-      <w:pPr>
-        <w:pStyle w:val="ListParagraph"/>
-        <w:numPr>
-          <w:ilvl w:val="2"/>
-          <w:numId w:val="30"/>
-        </w:numPr>
-        <w:spacing w:after="0"/>
-      </w:pPr>
-      <w:r>
-        <w:rPr>
-          <w:rFonts w:ascii="Calibri" w:eastAsia="Times New Roman" w:hAnsi="Calibri" w:cs="Calibri"/>
-          <w:color w:val="E36C0A" w:themeColor="accent6" w:themeShade="BF"/>
-        </w:rPr>
-        <w:t>RMS</w:t>
-      </w:r>
-      <w:r>
-        <w:t xml:space="preserve">: </w:t>
-      </w:r>
-      <w:r>
-        <w:t>keep at</w:t>
-      </w:r>
-      <w:r>
-        <w:t xml:space="preserve"> </w:t>
-      </w:r>
-      <w:r>
+        <w:t xml:space="preserve">– </w:t>
+      </w:r>
+      <w:r>
+        <w:rPr>
+          <w:rFonts w:ascii="Calibri" w:eastAsia="Times New Roman" w:hAnsi="Calibri" w:cs="Calibri"/>
+          <w:i/>
+        </w:rPr>
+        <w:t>blank</w:t>
+      </w:r>
+      <w:r>
+        <w:rPr>
+          <w:rFonts w:ascii="Calibri" w:eastAsia="Times New Roman" w:hAnsi="Calibri" w:cs="Calibri"/>
+          <w:i/>
+          <w:vertAlign w:val="superscript"/>
+        </w:rPr>
+        <w:t>2</w:t>
+      </w:r>
+    </w:p>
+    <w:p>
+      <w:pPr>
+        <w:pStyle w:val="ListParagraph"/>
+        <w:spacing w:after="0"/>
         <w:rPr>
           <w:rFonts w:ascii="Consolas" w:hAnsi="Consolas" w:cs="Consolas"/>
           <w:color w:val="1F497D" w:themeColor="text2"/>
           <w:sz w:val="20"/>
         </w:rPr>
-        <w:t>false</w:t>
+      </w:pPr>
+    </w:p>
+    <w:p>
+      <w:pPr>
+        <w:pStyle w:val="ListParagraph"/>
+        <w:spacing w:after="0"/>
+        <w:ind w:left="1440"/>
+      </w:pPr>
+      <w:r>
+        <w:rPr>
+          <w:rFonts w:ascii="Consolas" w:eastAsiaTheme="minorHAnsi" w:hAnsi="Consolas" w:cs="Consolas"/>
+          <w:color w:val="008000"/>
+          <w:sz w:val="19"/>
+          <w:szCs w:val="19"/>
+        </w:rPr>
+        <w:t>SSC Settings</w:t>
       </w:r>
     </w:p>
     <w:p>
@@ -4687,7 +4828,7 @@
           <w:sz w:val="19"/>
           <w:szCs w:val="19"/>
         </w:rPr>
-        <w:t>IsBOEFormVisible</w:t>
+        <w:t>ShowEquivalentPersonsOption</w:t>
       </w:r>
     </w:p>
     <w:p>
@@ -4707,10 +4848,16 @@
         <w:t>Space</w:t>
       </w:r>
       <w:r>
-        <w:t xml:space="preserve">: </w:t>
-      </w:r>
-      <w:r>
-        <w:t xml:space="preserve">set to </w:t>
+        <w:t>:</w:t>
+      </w:r>
+      <w:r>
+        <w:t xml:space="preserve"> set as appropriate</w:t>
+      </w:r>
+      <w:r>
+        <w:t xml:space="preserve">, </w:t>
+      </w:r>
+      <w:r>
+        <w:t xml:space="preserve"> </w:t>
       </w:r>
       <w:r>
         <w:rPr>
@@ -4721,13 +4868,10 @@
         <w:t>true</w:t>
       </w:r>
       <w:r>
-        <w:rPr>
-          <w:sz w:val="20"/>
-        </w:rPr>
-        <w:t xml:space="preserve">, </w:t>
-      </w:r>
-      <w:r>
-        <w:t>will cause IBOE and PBOE forms to be enabled</w:t>
+        <w:t xml:space="preserve"> </w:t>
+      </w:r>
+      <w:r>
+        <w:t>will cause EPs to be used, instead of hours</w:t>
       </w:r>
     </w:p>
     <w:p>
@@ -4772,19 +4916,15 @@
           <w:numId w:val="4"/>
         </w:numPr>
         <w:spacing w:after="0"/>
-        <w:textAlignment w:val="center"/>
-        <w:rPr>
-          <w:rFonts w:ascii="Calibri" w:eastAsia="Times New Roman" w:hAnsi="Calibri" w:cs="Calibri"/>
-        </w:rPr>
-      </w:pPr>
-      <w:r>
-        <w:rPr>
-          <w:rFonts w:ascii="Consolas" w:eastAsiaTheme="minorHAnsi" w:hAnsi="Consolas" w:cs="Consolas"/>
-          <w:color w:val="0000FF"/>
-          <w:sz w:val="19"/>
-          <w:szCs w:val="19"/>
-        </w:rPr>
-        <w:t>IsPortionMarkingEnabled</w:t>
+      </w:pPr>
+      <w:r>
+        <w:rPr>
+          <w:rFonts w:ascii="Consolas" w:eastAsiaTheme="minorHAnsi" w:hAnsi="Consolas" w:cs="Consolas"/>
+          <w:color w:val="0000FF"/>
+          <w:sz w:val="19"/>
+          <w:szCs w:val="19"/>
+        </w:rPr>
+        <w:t>IsBOEFormVisible</w:t>
       </w:r>
     </w:p>
     <w:p>
@@ -4795,10 +4935,6 @@
           <w:numId w:val="30"/>
         </w:numPr>
         <w:spacing w:after="0"/>
-        <w:textAlignment w:val="center"/>
-        <w:rPr>
-          <w:rFonts w:ascii="Calibri" w:eastAsia="Times New Roman" w:hAnsi="Calibri" w:cs="Calibri"/>
-        </w:rPr>
       </w:pPr>
       <w:r>
         <w:rPr>
@@ -4823,13 +4959,12 @@
       </w:r>
       <w:r>
         <w:rPr>
-          <w:color w:val="1F497D" w:themeColor="text2"/>
           <w:sz w:val="20"/>
         </w:rPr>
-        <w:t xml:space="preserve"> </w:t>
-      </w:r>
-      <w:r>
-        <w:t>– will cause IBOE and PBOE to add (U) markings</w:t>
+        <w:t xml:space="preserve">, </w:t>
+      </w:r>
+      <w:r>
+        <w:t>will cause IBOE and PBOE forms to be enabled</w:t>
       </w:r>
     </w:p>
     <w:p>
@@ -4886,107 +5021,7 @@
           <w:sz w:val="19"/>
           <w:szCs w:val="19"/>
         </w:rPr>
-        <w:t>IESHomeUrl</w:t>
-      </w:r>
-    </w:p>
-    <w:p>
-      <w:pPr>
-        <w:pStyle w:val="ListParagraph"/>
-        <w:numPr>
-          <w:ilvl w:val="2"/>
-          <w:numId w:val="30"/>
-        </w:numPr>
-        <w:spacing w:after="0"/>
-        <w:textAlignment w:val="center"/>
-        <w:rPr>
-          <w:rFonts w:ascii="Calibri" w:eastAsia="Times New Roman" w:hAnsi="Calibri" w:cs="Calibri"/>
-        </w:rPr>
-      </w:pPr>
-      <w:r>
-        <w:rPr>
-          <w:rFonts w:ascii="Calibri" w:eastAsia="Times New Roman" w:hAnsi="Calibri" w:cs="Calibri"/>
-          <w:color w:val="E36C0A" w:themeColor="accent6" w:themeShade="BF"/>
-        </w:rPr>
-        <w:t>Space</w:t>
-      </w:r>
-      <w:r>
-        <w:t xml:space="preserve">: </w:t>
-      </w:r>
-      <w:r>
-        <w:t>IES URL, base URL followed by “</w:t>
-      </w:r>
-      <w:r>
-        <w:rPr>
-          <w:rFonts w:ascii="Consolas" w:eastAsiaTheme="minorHAnsi" w:hAnsi="Consolas" w:cs="Consolas"/>
-          <w:color w:val="1F497D" w:themeColor="text2"/>
-          <w:sz w:val="19"/>
-          <w:szCs w:val="19"/>
-        </w:rPr>
-        <w:t>/Home/</w:t>
-      </w:r>
-      <w:r>
-        <w:t>”</w:t>
-      </w:r>
-    </w:p>
-    <w:p>
-      <w:pPr>
-        <w:pStyle w:val="ListParagraph"/>
-        <w:numPr>
-          <w:ilvl w:val="2"/>
-          <w:numId w:val="30"/>
-        </w:numPr>
-        <w:spacing w:after="0"/>
-      </w:pPr>
-      <w:r>
-        <w:rPr>
-          <w:rFonts w:ascii="Calibri" w:eastAsia="Times New Roman" w:hAnsi="Calibri" w:cs="Calibri"/>
-          <w:color w:val="E36C0A" w:themeColor="accent6" w:themeShade="BF"/>
-        </w:rPr>
-        <w:t>RMS</w:t>
-      </w:r>
-      <w:r>
-        <w:t xml:space="preserve">: </w:t>
-      </w:r>
-      <w:r>
-        <w:t xml:space="preserve">set to </w:t>
-      </w:r>
-      <w:r>
-        <w:rPr>
-          <w:rFonts w:ascii="Calibri" w:eastAsia="Times New Roman" w:hAnsi="Calibri" w:cs="Calibri"/>
-          <w:i/>
-        </w:rPr>
-        <w:t>blank</w:t>
-      </w:r>
-      <w:r>
-        <w:rPr>
-          <w:rFonts w:ascii="Calibri" w:eastAsia="Times New Roman" w:hAnsi="Calibri" w:cs="Calibri"/>
-          <w:i/>
-          <w:vertAlign w:val="superscript"/>
-        </w:rPr>
-        <w:t>2</w:t>
-      </w:r>
-    </w:p>
-    <w:p>
-      <w:pPr>
-        <w:pStyle w:val="ListParagraph"/>
-        <w:numPr>
-          <w:ilvl w:val="1"/>
-          <w:numId w:val="4"/>
-        </w:numPr>
-        <w:spacing w:after="0"/>
-        <w:textAlignment w:val="center"/>
-        <w:rPr>
-          <w:rFonts w:ascii="Calibri" w:eastAsia="Times New Roman" w:hAnsi="Calibri" w:cs="Calibri"/>
-        </w:rPr>
-      </w:pPr>
-      <w:r>
-        <w:rPr>
-          <w:rFonts w:ascii="Consolas" w:eastAsiaTheme="minorHAnsi" w:hAnsi="Consolas" w:cs="Consolas"/>
-          <w:color w:val="0000FF"/>
-          <w:sz w:val="19"/>
-          <w:szCs w:val="19"/>
-        </w:rPr>
-        <w:t>IsPTMIntegrated</w:t>
+        <w:t>IsPortionMarkingEnabled</w:t>
       </w:r>
     </w:p>
     <w:p>
@@ -5023,6 +5058,16 @@
         </w:rPr>
         <w:t>true</w:t>
       </w:r>
+      <w:r>
+        <w:rPr>
+          <w:color w:val="1F497D" w:themeColor="text2"/>
+          <w:sz w:val="20"/>
+        </w:rPr>
+        <w:t xml:space="preserve"> </w:t>
+      </w:r>
+      <w:r>
+        <w:t>– will cause IBOE and PBOE to add (U) markings</w:t>
+      </w:r>
     </w:p>
     <w:p>
       <w:pPr>
@@ -5032,10 +5077,6 @@
           <w:numId w:val="30"/>
         </w:numPr>
         <w:spacing w:after="0"/>
-        <w:textAlignment w:val="center"/>
-        <w:rPr>
-          <w:rFonts w:ascii="Calibri" w:eastAsia="Times New Roman" w:hAnsi="Calibri" w:cs="Calibri"/>
-        </w:rPr>
       </w:pPr>
       <w:r>
         <w:rPr>
@@ -5070,24 +5111,119 @@
           <w:numId w:val="4"/>
         </w:numPr>
         <w:spacing w:after="0"/>
-      </w:pPr>
-      <w:r>
-        <w:rPr>
-          <w:rFonts w:ascii="Consolas" w:eastAsiaTheme="minorHAnsi" w:hAnsi="Consolas" w:cs="Consolas"/>
-          <w:color w:val="0000FF"/>
-          <w:sz w:val="19"/>
-          <w:szCs w:val="19"/>
-        </w:rPr>
-        <w:t>ShowIesHeader</w:t>
-      </w:r>
-      <w:r>
-        <w:rPr>
-          <w:rFonts w:ascii="Consolas" w:eastAsiaTheme="minorHAnsi" w:hAnsi="Consolas" w:cs="Consolas"/>
-          <w:color w:val="0000FF"/>
-          <w:sz w:val="19"/>
-          <w:szCs w:val="19"/>
-        </w:rPr>
-        <w:t xml:space="preserve"> </w:t>
+        <w:textAlignment w:val="center"/>
+        <w:rPr>
+          <w:rFonts w:ascii="Calibri" w:eastAsia="Times New Roman" w:hAnsi="Calibri" w:cs="Calibri"/>
+        </w:rPr>
+      </w:pPr>
+      <w:r>
+        <w:rPr>
+          <w:rFonts w:ascii="Consolas" w:eastAsiaTheme="minorHAnsi" w:hAnsi="Consolas" w:cs="Consolas"/>
+          <w:color w:val="0000FF"/>
+          <w:sz w:val="19"/>
+          <w:szCs w:val="19"/>
+        </w:rPr>
+        <w:t>IESHomeUrl</w:t>
+      </w:r>
+    </w:p>
+    <w:p>
+      <w:pPr>
+        <w:pStyle w:val="ListParagraph"/>
+        <w:numPr>
+          <w:ilvl w:val="2"/>
+          <w:numId w:val="30"/>
+        </w:numPr>
+        <w:spacing w:after="0"/>
+        <w:textAlignment w:val="center"/>
+        <w:rPr>
+          <w:rFonts w:ascii="Calibri" w:eastAsia="Times New Roman" w:hAnsi="Calibri" w:cs="Calibri"/>
+        </w:rPr>
+      </w:pPr>
+      <w:r>
+        <w:rPr>
+          <w:rFonts w:ascii="Calibri" w:eastAsia="Times New Roman" w:hAnsi="Calibri" w:cs="Calibri"/>
+          <w:color w:val="E36C0A" w:themeColor="accent6" w:themeShade="BF"/>
+        </w:rPr>
+        <w:t>Space</w:t>
+      </w:r>
+      <w:r>
+        <w:t xml:space="preserve">: </w:t>
+      </w:r>
+      <w:r>
+        <w:t>IES URL, base URL followed by “</w:t>
+      </w:r>
+      <w:r>
+        <w:rPr>
+          <w:rFonts w:ascii="Consolas" w:eastAsiaTheme="minorHAnsi" w:hAnsi="Consolas" w:cs="Consolas"/>
+          <w:color w:val="1F497D" w:themeColor="text2"/>
+          <w:sz w:val="19"/>
+          <w:szCs w:val="19"/>
+        </w:rPr>
+        <w:t>/Home/</w:t>
+      </w:r>
+      <w:r>
+        <w:t>”</w:t>
+      </w:r>
+    </w:p>
+    <w:p>
+      <w:pPr>
+        <w:pStyle w:val="ListParagraph"/>
+        <w:numPr>
+          <w:ilvl w:val="2"/>
+          <w:numId w:val="30"/>
+        </w:numPr>
+        <w:spacing w:after="0"/>
+      </w:pPr>
+      <w:r>
+        <w:rPr>
+          <w:rFonts w:ascii="Calibri" w:eastAsia="Times New Roman" w:hAnsi="Calibri" w:cs="Calibri"/>
+          <w:color w:val="E36C0A" w:themeColor="accent6" w:themeShade="BF"/>
+        </w:rPr>
+        <w:t>RMS</w:t>
+      </w:r>
+      <w:r>
+        <w:t xml:space="preserve">: </w:t>
+      </w:r>
+      <w:r>
+        <w:t xml:space="preserve">set to </w:t>
+      </w:r>
+      <w:r>
+        <w:rPr>
+          <w:rFonts w:ascii="Calibri" w:eastAsia="Times New Roman" w:hAnsi="Calibri" w:cs="Calibri"/>
+          <w:i/>
+        </w:rPr>
+        <w:t>blank</w:t>
+      </w:r>
+      <w:r>
+        <w:rPr>
+          <w:rFonts w:ascii="Calibri" w:eastAsia="Times New Roman" w:hAnsi="Calibri" w:cs="Calibri"/>
+          <w:i/>
+          <w:vertAlign w:val="superscript"/>
+        </w:rPr>
+        <w:t>2</w:t>
+      </w:r>
+    </w:p>
+    <w:p>
+      <w:pPr>
+        <w:pStyle w:val="ListParagraph"/>
+        <w:numPr>
+          <w:ilvl w:val="1"/>
+          <w:numId w:val="4"/>
+        </w:numPr>
+        <w:spacing w:after="0"/>
+        <w:textAlignment w:val="center"/>
+        <w:rPr>
+          <w:rFonts w:ascii="Calibri" w:eastAsia="Times New Roman" w:hAnsi="Calibri" w:cs="Calibri"/>
+        </w:rPr>
+      </w:pPr>
+      <w:r>
+        <w:rPr>
+          <w:rFonts w:ascii="Consolas" w:eastAsiaTheme="minorHAnsi" w:hAnsi="Consolas" w:cs="Consolas"/>
+          <w:color w:val="0000FF"/>
+          <w:sz w:val="19"/>
+          <w:szCs w:val="19"/>
+        </w:rPr>
+        <w:t>IsPTMIntegrated</w:t>
       </w:r>
     </w:p>
     <w:p>
@@ -5146,7 +5282,10 @@
         <w:t>RMS</w:t>
       </w:r>
       <w:r>
-        <w:t>: keep at</w:t>
+        <w:t xml:space="preserve">: </w:t>
+      </w:r>
+      <w:r>
+        <w:t>keep at</w:t>
       </w:r>
       <w:r>
         <w:t xml:space="preserve"> </w:t>
@@ -5163,84 +5302,29 @@
     <w:p>
       <w:pPr>
         <w:pStyle w:val="ListParagraph"/>
-        <w:spacing w:after="0"/>
-        <w:ind w:left="1440"/>
-        <w:textAlignment w:val="center"/>
-        <w:rPr>
-          <w:rFonts w:ascii="Calibri" w:eastAsia="Times New Roman" w:hAnsi="Calibri" w:cs="Calibri"/>
-        </w:rPr>
-      </w:pPr>
-    </w:p>
-    <w:p>
-      <w:pPr>
-        <w:pStyle w:val="ListParagraph"/>
-        <w:spacing w:after="0"/>
-        <w:ind w:left="1440"/>
-        <w:textAlignment w:val="center"/>
-        <w:rPr>
-          <w:rFonts w:ascii="Calibri" w:eastAsia="Times New Roman" w:hAnsi="Calibri" w:cs="Calibri"/>
-        </w:rPr>
-      </w:pPr>
-      <w:r>
-        <w:rPr>
-          <w:rFonts w:ascii="Consolas" w:eastAsiaTheme="minorHAnsi" w:hAnsi="Consolas" w:cs="Consolas"/>
-          <w:color w:val="008000"/>
-          <w:sz w:val="19"/>
-          <w:szCs w:val="19"/>
-        </w:rPr>
-        <w:t>Hours offset</w:t>
-      </w:r>
-    </w:p>
-    <w:p>
-      <w:pPr>
-        <w:pStyle w:val="ListParagraph"/>
         <w:numPr>
           <w:ilvl w:val="1"/>
           <w:numId w:val="4"/>
         </w:numPr>
         <w:spacing w:after="0"/>
-        <w:textAlignment w:val="center"/>
-        <w:rPr>
-          <w:rFonts w:ascii="Calibri" w:eastAsia="Times New Roman" w:hAnsi="Calibri" w:cs="Calibri"/>
-        </w:rPr>
-      </w:pPr>
-      <w:r>
-        <w:rPr>
-          <w:rFonts w:ascii="Consolas" w:eastAsiaTheme="minorHAnsi" w:hAnsi="Consolas" w:cs="Consolas"/>
-          <w:color w:val="0000FF"/>
-          <w:sz w:val="19"/>
-          <w:szCs w:val="19"/>
-        </w:rPr>
-        <w:t>DatabaseESTOffset</w:t>
-      </w:r>
-      <w:r>
-        <w:rPr>
-          <w:rFonts w:ascii="Calibri" w:eastAsia="Times New Roman" w:hAnsi="Calibri" w:cs="Calibri"/>
-        </w:rPr>
-        <w:t xml:space="preserve"> – adjust based on whether your DB is in a different time zone than your web server. 0 means it’s in the same zone.</w:t>
-      </w:r>
-    </w:p>
-    <w:p>
-      <w:pPr>
-        <w:pStyle w:val="ListParagraph"/>
-        <w:numPr>
-          <w:ilvl w:val="1"/>
-          <w:numId w:val="4"/>
-        </w:numPr>
-        <w:spacing w:after="0"/>
-        <w:textAlignment w:val="center"/>
-        <w:rPr>
-          <w:rFonts w:ascii="Calibri" w:eastAsia="Times New Roman" w:hAnsi="Calibri" w:cs="Calibri"/>
-        </w:rPr>
-      </w:pPr>
-      <w:r>
-        <w:rPr>
-          <w:rFonts w:ascii="Consolas" w:eastAsiaTheme="minorHAnsi" w:hAnsi="Consolas" w:cs="Consolas"/>
-          <w:color w:val="0000FF"/>
-          <w:sz w:val="19"/>
-          <w:szCs w:val="19"/>
-        </w:rPr>
-        <w:t>CanCreateWorkspaceWithoutPtmTrackingNumber</w:t>
+      </w:pPr>
+      <w:r>
+        <w:rPr>
+          <w:rFonts w:ascii="Consolas" w:eastAsiaTheme="minorHAnsi" w:hAnsi="Consolas" w:cs="Consolas"/>
+          <w:color w:val="0000FF"/>
+          <w:sz w:val="19"/>
+          <w:szCs w:val="19"/>
+        </w:rPr>
+        <w:t>ShowIesHeader</w:t>
+      </w:r>
+      <w:r>
+        <w:rPr>
+          <w:rFonts w:ascii="Consolas" w:eastAsiaTheme="minorHAnsi" w:hAnsi="Consolas" w:cs="Consolas"/>
+          <w:color w:val="0000FF"/>
+          <w:sz w:val="19"/>
+          <w:szCs w:val="19"/>
+        </w:rPr>
+        <w:t xml:space="preserve"> </w:t>
       </w:r>
     </w:p>
     <w:p>
@@ -5264,979 +5348,9 @@
         <w:t>Space</w:t>
       </w:r>
       <w:r>
-        <w:rPr>
-          <w:rFonts w:ascii="Calibri" w:eastAsia="Times New Roman" w:hAnsi="Calibri" w:cs="Calibri"/>
-        </w:rPr>
         <w:t xml:space="preserve">: </w:t>
       </w:r>
       <w:r>
-        <w:rPr>
-          <w:rFonts w:ascii="Calibri" w:eastAsia="Times New Roman" w:hAnsi="Calibri" w:cs="Calibri"/>
-        </w:rPr>
-        <w:t xml:space="preserve">We have this </w:t>
-      </w:r>
-      <w:r>
-        <w:rPr>
-          <w:rFonts w:ascii="Calibri" w:eastAsia="Times New Roman" w:hAnsi="Calibri" w:cs="Calibri"/>
-          <w:i/>
-          <w:iCs/>
-        </w:rPr>
-        <w:t>blank</w:t>
-      </w:r>
-      <w:r>
-        <w:rPr>
-          <w:rFonts w:ascii="Calibri" w:eastAsia="Times New Roman" w:hAnsi="Calibri" w:cs="Calibri"/>
-        </w:rPr>
-        <w:t>, but please verify this with Frank – there may be a group of users that needs to be added here.</w:t>
-      </w:r>
-    </w:p>
-    <w:p>
-      <w:pPr>
-        <w:pStyle w:val="ListParagraph"/>
-        <w:numPr>
-          <w:ilvl w:val="2"/>
-          <w:numId w:val="30"/>
-        </w:numPr>
-        <w:spacing w:after="0"/>
-      </w:pPr>
-      <w:r>
-        <w:rPr>
-          <w:rFonts w:ascii="Calibri" w:eastAsia="Times New Roman" w:hAnsi="Calibri" w:cs="Calibri"/>
-          <w:color w:val="E36C0A" w:themeColor="accent6" w:themeShade="BF"/>
-        </w:rPr>
-        <w:t>RMS</w:t>
-      </w:r>
-      <w:r>
-        <w:t xml:space="preserve">: </w:t>
-      </w:r>
-      <w:r>
-        <w:t>keep at</w:t>
-      </w:r>
-      <w:r>
-        <w:rPr>
-          <w:rFonts w:ascii="Calibri" w:eastAsia="Times New Roman" w:hAnsi="Calibri" w:cs="Calibri"/>
-          <w:i/>
-          <w:iCs/>
-        </w:rPr>
-        <w:t xml:space="preserve"> </w:t>
-      </w:r>
-      <w:r>
-        <w:rPr>
-          <w:rFonts w:ascii="Calibri" w:eastAsia="Times New Roman" w:hAnsi="Calibri" w:cs="Calibri"/>
-          <w:i/>
-          <w:iCs/>
-        </w:rPr>
-        <w:t>blank</w:t>
-      </w:r>
-    </w:p>
-    <w:p>
-      <w:pPr>
-        <w:pStyle w:val="ListParagraph"/>
-        <w:spacing w:after="0"/>
-        <w:ind w:left="1440"/>
-        <w:textAlignment w:val="center"/>
-        <w:rPr>
-          <w:rFonts w:ascii="Calibri" w:eastAsia="Times New Roman" w:hAnsi="Calibri" w:cs="Calibri"/>
-        </w:rPr>
-      </w:pPr>
-    </w:p>
-    <w:p>
-      <w:pPr>
-        <w:pStyle w:val="ListParagraph"/>
-        <w:spacing w:after="0"/>
-        <w:ind w:left="1440"/>
-        <w:textAlignment w:val="center"/>
-        <w:rPr>
-          <w:rFonts w:ascii="Calibri" w:eastAsia="Times New Roman" w:hAnsi="Calibri" w:cs="Calibri"/>
-        </w:rPr>
-      </w:pPr>
-      <w:r>
-        <w:rPr>
-          <w:rFonts w:ascii="Consolas" w:eastAsiaTheme="minorHAnsi" w:hAnsi="Consolas" w:cs="Consolas"/>
-          <w:color w:val="008000"/>
-          <w:sz w:val="19"/>
-          <w:szCs w:val="19"/>
-        </w:rPr>
-        <w:t>Piwik Settings</w:t>
-      </w:r>
-    </w:p>
-    <w:p>
-      <w:pPr>
-        <w:pStyle w:val="ListParagraph"/>
-        <w:numPr>
-          <w:ilvl w:val="1"/>
-          <w:numId w:val="4"/>
-        </w:numPr>
-        <w:spacing w:after="0"/>
-        <w:textAlignment w:val="center"/>
-        <w:rPr>
-          <w:rFonts w:ascii="Calibri" w:eastAsia="Times New Roman" w:hAnsi="Calibri" w:cs="Calibri"/>
-        </w:rPr>
-      </w:pPr>
-      <w:r>
-        <w:rPr>
-          <w:rFonts w:ascii="Consolas" w:eastAsiaTheme="minorHAnsi" w:hAnsi="Consolas" w:cs="Consolas"/>
-          <w:color w:val="0000FF"/>
-          <w:sz w:val="19"/>
-          <w:szCs w:val="19"/>
-        </w:rPr>
-        <w:t>DisablePiwik</w:t>
-      </w:r>
-      <w:r>
-        <w:rPr>
-          <w:rStyle w:val="FootnoteReference"/>
-          <w:rFonts w:eastAsiaTheme="minorHAnsi" w:cs="Consolas"/>
-        </w:rPr>
-        <w:footnoteReference w:id="3"/>
-      </w:r>
-      <w:r>
-        <w:t xml:space="preserve"> – set this to </w:t>
-      </w:r>
-      <w:r>
-        <w:rPr>
-          <w:rFonts w:ascii="Consolas" w:hAnsi="Consolas" w:cs="Consolas"/>
-          <w:sz w:val="20"/>
-        </w:rPr>
-        <w:t>true</w:t>
-      </w:r>
-      <w:r>
-        <w:rPr>
-          <w:sz w:val="20"/>
-        </w:rPr>
-        <w:t xml:space="preserve"> </w:t>
-      </w:r>
-      <w:r>
-        <w:t>(to not track the website usage via piwik</w:t>
-      </w:r>
-      <w:r>
-        <w:t>)</w:t>
-      </w:r>
-      <w:r>
-        <w:t xml:space="preserve">. </w:t>
-      </w:r>
-      <w:r>
-        <w:rPr>
-          <w:rFonts w:ascii="Calibri" w:eastAsia="Times New Roman" w:hAnsi="Calibri" w:cs="Calibri"/>
-        </w:rPr>
-        <w:t>I</w:t>
-      </w:r>
-      <w:r>
-        <w:rPr>
-          <w:rFonts w:ascii="Calibri" w:eastAsia="Times New Roman" w:hAnsi="Calibri" w:cs="Calibri"/>
-        </w:rPr>
-        <w:t>gnore the other piwik settings once you disable it</w:t>
-      </w:r>
-    </w:p>
-    <w:p>
-      <w:pPr>
-        <w:pStyle w:val="ListParagraph"/>
-        <w:spacing w:after="0"/>
-        <w:ind w:left="1440"/>
-      </w:pPr>
-    </w:p>
-    <w:p>
-      <w:pPr>
-        <w:pStyle w:val="ListParagraph"/>
-        <w:spacing w:after="0"/>
-        <w:ind w:left="1440"/>
-      </w:pPr>
-      <w:r>
-        <w:rPr>
-          <w:rFonts w:ascii="Consolas" w:eastAsiaTheme="minorHAnsi" w:hAnsi="Consolas" w:cs="Consolas"/>
-          <w:color w:val="008000"/>
-          <w:sz w:val="19"/>
-          <w:szCs w:val="19"/>
-        </w:rPr>
-        <w:lastRenderedPageBreak/>
-        <w:t>MST Measure / Metrics</w:t>
-      </w:r>
-    </w:p>
-    <w:p>
-      <w:pPr>
-        <w:pStyle w:val="ListParagraph"/>
-        <w:numPr>
-          <w:ilvl w:val="1"/>
-          <w:numId w:val="4"/>
-        </w:numPr>
-        <w:spacing w:after="0"/>
-      </w:pPr>
-      <w:r>
-        <w:rPr>
-          <w:rFonts w:ascii="Consolas" w:eastAsiaTheme="minorHAnsi" w:hAnsi="Consolas" w:cs="Consolas"/>
-          <w:color w:val="0000FF"/>
-          <w:sz w:val="19"/>
-          <w:szCs w:val="19"/>
-        </w:rPr>
-        <w:t>MstMetricsUrl</w:t>
-      </w:r>
-    </w:p>
-    <w:p>
-      <w:pPr>
-        <w:pStyle w:val="ListParagraph"/>
-        <w:numPr>
-          <w:ilvl w:val="2"/>
-          <w:numId w:val="30"/>
-        </w:numPr>
-        <w:spacing w:after="0"/>
-      </w:pPr>
-      <w:r>
-        <w:rPr>
-          <w:rFonts w:ascii="Calibri" w:eastAsia="Times New Roman" w:hAnsi="Calibri" w:cs="Calibri"/>
-          <w:color w:val="E36C0A" w:themeColor="accent6" w:themeShade="BF"/>
-        </w:rPr>
-        <w:t>Space</w:t>
-      </w:r>
-      <w:r>
-        <w:rPr>
-          <w:rFonts w:ascii="Calibri" w:eastAsia="Times New Roman" w:hAnsi="Calibri" w:cs="Calibri"/>
-        </w:rPr>
-        <w:t xml:space="preserve">: </w:t>
-      </w:r>
-      <w:r>
-        <w:t xml:space="preserve">set to </w:t>
-      </w:r>
-      <w:r>
-        <w:rPr>
-          <w:rFonts w:ascii="Calibri" w:eastAsia="Times New Roman" w:hAnsi="Calibri" w:cs="Calibri"/>
-          <w:i/>
-        </w:rPr>
-        <w:t>blank</w:t>
-      </w:r>
-      <w:r>
-        <w:rPr>
-          <w:rFonts w:ascii="Calibri" w:eastAsia="Times New Roman" w:hAnsi="Calibri" w:cs="Calibri"/>
-          <w:i/>
-          <w:vertAlign w:val="superscript"/>
-        </w:rPr>
-        <w:t>2</w:t>
-      </w:r>
-    </w:p>
-    <w:p>
-      <w:pPr>
-        <w:pStyle w:val="ListParagraph"/>
-        <w:numPr>
-          <w:ilvl w:val="2"/>
-          <w:numId w:val="30"/>
-        </w:numPr>
-        <w:spacing w:after="0"/>
-      </w:pPr>
-      <w:r>
-        <w:rPr>
-          <w:rFonts w:ascii="Calibri" w:eastAsia="Times New Roman" w:hAnsi="Calibri" w:cs="Calibri"/>
-          <w:color w:val="E36C0A" w:themeColor="accent6" w:themeShade="BF"/>
-        </w:rPr>
-        <w:t>RMS</w:t>
-      </w:r>
-      <w:r>
-        <w:rPr>
-          <w:rFonts w:ascii="Calibri" w:eastAsia="Times New Roman" w:hAnsi="Calibri" w:cs="Calibri"/>
-        </w:rPr>
-        <w:t xml:space="preserve">: </w:t>
-      </w:r>
-      <w:r>
-        <w:rPr>
-          <w:rFonts w:ascii="Calibri" w:eastAsia="Times New Roman" w:hAnsi="Calibri" w:cs="Calibri"/>
-        </w:rPr>
-        <w:t>If used, the URL to the application</w:t>
-      </w:r>
-    </w:p>
-    <w:p>
-      <w:pPr>
-        <w:pStyle w:val="ListParagraph"/>
-        <w:numPr>
-          <w:ilvl w:val="1"/>
-          <w:numId w:val="4"/>
-        </w:numPr>
-        <w:spacing w:after="0"/>
-      </w:pPr>
-      <w:r>
-        <w:rPr>
-          <w:rFonts w:ascii="Consolas" w:eastAsiaTheme="minorHAnsi" w:hAnsi="Consolas" w:cs="Consolas"/>
-          <w:color w:val="0000FF"/>
-          <w:sz w:val="19"/>
-          <w:szCs w:val="19"/>
-        </w:rPr>
-        <w:t>MSTSearchCriteriaHelp</w:t>
-      </w:r>
-    </w:p>
-    <w:p>
-      <w:pPr>
-        <w:pStyle w:val="ListParagraph"/>
-        <w:numPr>
-          <w:ilvl w:val="2"/>
-          <w:numId w:val="30"/>
-        </w:numPr>
-        <w:spacing w:after="0"/>
-      </w:pPr>
-      <w:r>
-        <w:rPr>
-          <w:rFonts w:ascii="Calibri" w:eastAsia="Times New Roman" w:hAnsi="Calibri" w:cs="Calibri"/>
-          <w:color w:val="E36C0A" w:themeColor="accent6" w:themeShade="BF"/>
-        </w:rPr>
-        <w:t>Space</w:t>
-      </w:r>
-      <w:r>
-        <w:rPr>
-          <w:rFonts w:ascii="Calibri" w:eastAsia="Times New Roman" w:hAnsi="Calibri" w:cs="Calibri"/>
-        </w:rPr>
-        <w:t xml:space="preserve">: </w:t>
-      </w:r>
-      <w:r>
-        <w:t xml:space="preserve">set to </w:t>
-      </w:r>
-      <w:r>
-        <w:rPr>
-          <w:rFonts w:ascii="Calibri" w:eastAsia="Times New Roman" w:hAnsi="Calibri" w:cs="Calibri"/>
-          <w:i/>
-        </w:rPr>
-        <w:t>blank</w:t>
-      </w:r>
-      <w:r>
-        <w:rPr>
-          <w:rFonts w:ascii="Calibri" w:eastAsia="Times New Roman" w:hAnsi="Calibri" w:cs="Calibri"/>
-          <w:i/>
-          <w:vertAlign w:val="superscript"/>
-        </w:rPr>
-        <w:t>2</w:t>
-      </w:r>
-    </w:p>
-    <w:p>
-      <w:pPr>
-        <w:pStyle w:val="ListParagraph"/>
-        <w:numPr>
-          <w:ilvl w:val="2"/>
-          <w:numId w:val="30"/>
-        </w:numPr>
-        <w:spacing w:after="0"/>
-      </w:pPr>
-      <w:r>
-        <w:rPr>
-          <w:rFonts w:ascii="Calibri" w:eastAsia="Times New Roman" w:hAnsi="Calibri" w:cs="Calibri"/>
-          <w:color w:val="E36C0A" w:themeColor="accent6" w:themeShade="BF"/>
-        </w:rPr>
-        <w:t>RMS</w:t>
-      </w:r>
-      <w:r>
-        <w:rPr>
-          <w:rFonts w:ascii="Calibri" w:eastAsia="Times New Roman" w:hAnsi="Calibri" w:cs="Calibri"/>
-        </w:rPr>
-        <w:t xml:space="preserve">: If used, the URL to </w:t>
-      </w:r>
-      <w:r>
-        <w:rPr>
-          <w:rFonts w:ascii="Calibri" w:eastAsia="Times New Roman" w:hAnsi="Calibri" w:cs="Calibri"/>
-        </w:rPr>
-        <w:t>the Search Criteria Help</w:t>
-      </w:r>
-    </w:p>
-    <w:p>
-      <w:pPr>
-        <w:pStyle w:val="ListParagraph"/>
-        <w:numPr>
-          <w:ilvl w:val="1"/>
-          <w:numId w:val="4"/>
-        </w:numPr>
-        <w:spacing w:after="0"/>
-      </w:pPr>
-      <w:r>
-        <w:rPr>
-          <w:rFonts w:ascii="Consolas" w:eastAsiaTheme="minorHAnsi" w:hAnsi="Consolas" w:cs="Consolas"/>
-          <w:color w:val="0000FF"/>
-          <w:sz w:val="19"/>
-          <w:szCs w:val="19"/>
-        </w:rPr>
-        <w:t>MSTSearchResultsHelpLink</w:t>
-      </w:r>
-    </w:p>
-    <w:p>
-      <w:pPr>
-        <w:pStyle w:val="ListParagraph"/>
-        <w:numPr>
-          <w:ilvl w:val="2"/>
-          <w:numId w:val="30"/>
-        </w:numPr>
-        <w:spacing w:after="0"/>
-      </w:pPr>
-      <w:r>
-        <w:rPr>
-          <w:rFonts w:ascii="Calibri" w:eastAsia="Times New Roman" w:hAnsi="Calibri" w:cs="Calibri"/>
-          <w:color w:val="E36C0A" w:themeColor="accent6" w:themeShade="BF"/>
-        </w:rPr>
-        <w:t>Space</w:t>
-      </w:r>
-      <w:r>
-        <w:rPr>
-          <w:rFonts w:ascii="Calibri" w:eastAsia="Times New Roman" w:hAnsi="Calibri" w:cs="Calibri"/>
-        </w:rPr>
-        <w:t xml:space="preserve">: </w:t>
-      </w:r>
-      <w:r>
-        <w:t xml:space="preserve">set to </w:t>
-      </w:r>
-      <w:r>
-        <w:rPr>
-          <w:rFonts w:ascii="Calibri" w:eastAsia="Times New Roman" w:hAnsi="Calibri" w:cs="Calibri"/>
-          <w:i/>
-        </w:rPr>
-        <w:t>blank</w:t>
-      </w:r>
-      <w:r>
-        <w:rPr>
-          <w:rFonts w:ascii="Calibri" w:eastAsia="Times New Roman" w:hAnsi="Calibri" w:cs="Calibri"/>
-          <w:i/>
-          <w:vertAlign w:val="superscript"/>
-        </w:rPr>
-        <w:t>2</w:t>
-      </w:r>
-    </w:p>
-    <w:p>
-      <w:pPr>
-        <w:pStyle w:val="ListParagraph"/>
-        <w:numPr>
-          <w:ilvl w:val="2"/>
-          <w:numId w:val="30"/>
-        </w:numPr>
-        <w:spacing w:after="0"/>
-      </w:pPr>
-      <w:r>
-        <w:rPr>
-          <w:rFonts w:ascii="Calibri" w:eastAsia="Times New Roman" w:hAnsi="Calibri" w:cs="Calibri"/>
-          <w:color w:val="E36C0A" w:themeColor="accent6" w:themeShade="BF"/>
-        </w:rPr>
-        <w:t>RMS</w:t>
-      </w:r>
-      <w:r>
-        <w:rPr>
-          <w:rFonts w:ascii="Calibri" w:eastAsia="Times New Roman" w:hAnsi="Calibri" w:cs="Calibri"/>
-        </w:rPr>
-        <w:t xml:space="preserve">: If used, the URL to </w:t>
-      </w:r>
-      <w:r>
-        <w:rPr>
-          <w:rFonts w:ascii="Calibri" w:eastAsia="Times New Roman" w:hAnsi="Calibri" w:cs="Calibri"/>
-        </w:rPr>
-        <w:t>the Results Help</w:t>
-      </w:r>
-    </w:p>
-    <w:p>
-      <w:pPr>
-        <w:pStyle w:val="ListParagraph"/>
-        <w:numPr>
-          <w:ilvl w:val="1"/>
-          <w:numId w:val="4"/>
-        </w:numPr>
-        <w:spacing w:after="0"/>
-      </w:pPr>
-      <w:r>
-        <w:rPr>
-          <w:rFonts w:ascii="Consolas" w:eastAsiaTheme="minorHAnsi" w:hAnsi="Consolas" w:cs="Consolas"/>
-          <w:color w:val="0000FF"/>
-          <w:sz w:val="19"/>
-          <w:szCs w:val="19"/>
-        </w:rPr>
-        <w:t>MSTSearchResultsDetailHelpLink</w:t>
-      </w:r>
-      <w:r>
-        <w:rPr>
-          <w:rFonts w:ascii="Calibri" w:eastAsia="Times New Roman" w:hAnsi="Calibri" w:cs="Calibri"/>
-        </w:rPr>
-        <w:t xml:space="preserve"> </w:t>
-      </w:r>
-    </w:p>
-    <w:p>
-      <w:pPr>
-        <w:pStyle w:val="ListParagraph"/>
-        <w:numPr>
-          <w:ilvl w:val="2"/>
-          <w:numId w:val="30"/>
-        </w:numPr>
-        <w:spacing w:after="0"/>
-      </w:pPr>
-      <w:r>
-        <w:rPr>
-          <w:rFonts w:ascii="Calibri" w:eastAsia="Times New Roman" w:hAnsi="Calibri" w:cs="Calibri"/>
-          <w:color w:val="E36C0A" w:themeColor="accent6" w:themeShade="BF"/>
-        </w:rPr>
-        <w:t>Space</w:t>
-      </w:r>
-      <w:r>
-        <w:rPr>
-          <w:rFonts w:ascii="Calibri" w:eastAsia="Times New Roman" w:hAnsi="Calibri" w:cs="Calibri"/>
-        </w:rPr>
-        <w:t xml:space="preserve">: </w:t>
-      </w:r>
-      <w:r>
-        <w:t xml:space="preserve">set to </w:t>
-      </w:r>
-      <w:r>
-        <w:rPr>
-          <w:rFonts w:ascii="Calibri" w:eastAsia="Times New Roman" w:hAnsi="Calibri" w:cs="Calibri"/>
-          <w:i/>
-        </w:rPr>
-        <w:t>blank</w:t>
-      </w:r>
-      <w:r>
-        <w:rPr>
-          <w:rFonts w:ascii="Calibri" w:eastAsia="Times New Roman" w:hAnsi="Calibri" w:cs="Calibri"/>
-          <w:i/>
-          <w:vertAlign w:val="superscript"/>
-        </w:rPr>
-        <w:t>2</w:t>
-      </w:r>
-    </w:p>
-    <w:p>
-      <w:pPr>
-        <w:pStyle w:val="ListParagraph"/>
-        <w:numPr>
-          <w:ilvl w:val="2"/>
-          <w:numId w:val="30"/>
-        </w:numPr>
-        <w:spacing w:after="0"/>
-      </w:pPr>
-      <w:r>
-        <w:rPr>
-          <w:rFonts w:ascii="Calibri" w:eastAsia="Times New Roman" w:hAnsi="Calibri" w:cs="Calibri"/>
-          <w:color w:val="E36C0A" w:themeColor="accent6" w:themeShade="BF"/>
-        </w:rPr>
-        <w:t>RMS</w:t>
-      </w:r>
-      <w:r>
-        <w:rPr>
-          <w:rFonts w:ascii="Calibri" w:eastAsia="Times New Roman" w:hAnsi="Calibri" w:cs="Calibri"/>
-        </w:rPr>
-        <w:t xml:space="preserve">: If used, the URL to </w:t>
-      </w:r>
-      <w:r>
-        <w:rPr>
-          <w:rFonts w:ascii="Calibri" w:eastAsia="Times New Roman" w:hAnsi="Calibri" w:cs="Calibri"/>
-        </w:rPr>
-        <w:t>the Result Details Help</w:t>
-      </w:r>
-    </w:p>
-    <w:p>
-      <w:pPr>
-        <w:rPr>
-          <w:rFonts w:ascii="Consolas" w:eastAsiaTheme="minorHAnsi" w:hAnsi="Consolas" w:cs="Consolas"/>
-          <w:color w:val="008000"/>
-          <w:sz w:val="19"/>
-          <w:szCs w:val="19"/>
-        </w:rPr>
-      </w:pPr>
-    </w:p>
-    <w:p>
-      <w:pPr>
-        <w:pStyle w:val="ListParagraph"/>
-        <w:spacing w:after="0"/>
-        <w:ind w:left="1440"/>
-        <w:textAlignment w:val="center"/>
-        <w:rPr>
-          <w:rFonts w:ascii="Calibri" w:eastAsia="Times New Roman" w:hAnsi="Calibri" w:cs="Calibri"/>
-        </w:rPr>
-      </w:pPr>
-      <w:r>
-        <w:rPr>
-          <w:rFonts w:ascii="Consolas" w:eastAsiaTheme="minorHAnsi" w:hAnsi="Consolas" w:cs="Consolas"/>
-          <w:color w:val="008000"/>
-          <w:sz w:val="19"/>
-          <w:szCs w:val="19"/>
-        </w:rPr>
-        <w:t>Additional RMS Settings</w:t>
-      </w:r>
-    </w:p>
-    <w:p>
-      <w:pPr>
-        <w:pStyle w:val="ListParagraph"/>
-        <w:numPr>
-          <w:ilvl w:val="1"/>
-          <w:numId w:val="4"/>
-        </w:numPr>
-        <w:spacing w:after="0"/>
-      </w:pPr>
-      <w:r>
-        <w:rPr>
-          <w:rFonts w:ascii="Consolas" w:eastAsiaTheme="minorHAnsi" w:hAnsi="Consolas" w:cs="Consolas"/>
-          <w:color w:val="0000FF"/>
-          <w:sz w:val="19"/>
-          <w:szCs w:val="19"/>
-        </w:rPr>
-        <w:t>ArchiveUrlBoe</w:t>
-      </w:r>
-      <w:r>
-        <w:t xml:space="preserve"> </w:t>
-      </w:r>
-    </w:p>
-    <w:p>
-      <w:pPr>
-        <w:pStyle w:val="ListParagraph"/>
-        <w:numPr>
-          <w:ilvl w:val="2"/>
-          <w:numId w:val="4"/>
-        </w:numPr>
-        <w:spacing w:after="0"/>
-      </w:pPr>
-      <w:r>
-        <w:rPr>
-          <w:rFonts w:ascii="Calibri" w:eastAsia="Times New Roman" w:hAnsi="Calibri" w:cs="Calibri"/>
-          <w:color w:val="E36C0A" w:themeColor="accent6" w:themeShade="BF"/>
-        </w:rPr>
-        <w:t>Space</w:t>
-      </w:r>
-      <w:r>
-        <w:rPr>
-          <w:rFonts w:ascii="Calibri" w:eastAsia="Times New Roman" w:hAnsi="Calibri" w:cs="Calibri"/>
-        </w:rPr>
-        <w:t xml:space="preserve">: </w:t>
-      </w:r>
-      <w:r>
-        <w:t xml:space="preserve">set to </w:t>
-      </w:r>
-      <w:r>
-        <w:rPr>
-          <w:rFonts w:ascii="Calibri" w:eastAsia="Times New Roman" w:hAnsi="Calibri" w:cs="Calibri"/>
-          <w:i/>
-        </w:rPr>
-        <w:t>blank</w:t>
-      </w:r>
-      <w:r>
-        <w:rPr>
-          <w:rFonts w:ascii="Calibri" w:eastAsia="Times New Roman" w:hAnsi="Calibri" w:cs="Calibri"/>
-          <w:i/>
-          <w:vertAlign w:val="superscript"/>
-        </w:rPr>
-        <w:t>2</w:t>
-      </w:r>
-    </w:p>
-    <w:p>
-      <w:pPr>
-        <w:pStyle w:val="ListParagraph"/>
-        <w:numPr>
-          <w:ilvl w:val="2"/>
-          <w:numId w:val="4"/>
-        </w:numPr>
-        <w:spacing w:after="0"/>
-      </w:pPr>
-      <w:r>
-        <w:rPr>
-          <w:rFonts w:ascii="Calibri" w:eastAsia="Times New Roman" w:hAnsi="Calibri" w:cs="Calibri"/>
-          <w:color w:val="E36C0A" w:themeColor="accent6" w:themeShade="BF"/>
-        </w:rPr>
-        <w:t>RMS</w:t>
-      </w:r>
-      <w:r>
-        <w:t xml:space="preserve">: A base URL where the Archive RMS genBOE instance is located. i.e. </w:t>
-      </w:r>
-      <w:r>
-        <w:rPr>
-          <w:rFonts w:ascii="Cascadia Mono" w:eastAsiaTheme="minorHAnsi" w:hAnsi="Cascadia Mono" w:cs="Cascadia Mono"/>
-          <w:color w:val="000000"/>
-          <w:sz w:val="19"/>
-          <w:szCs w:val="19"/>
-        </w:rPr>
-        <w:t>https://archive-genboerms.us.lmco.com</w:t>
-      </w:r>
-    </w:p>
-    <w:p>
-      <w:pPr>
-        <w:pStyle w:val="ListParagraph"/>
-        <w:numPr>
-          <w:ilvl w:val="1"/>
-          <w:numId w:val="4"/>
-        </w:numPr>
-        <w:spacing w:after="0"/>
-      </w:pPr>
-      <w:r>
-        <w:rPr>
-          <w:rFonts w:ascii="Consolas" w:eastAsiaTheme="minorHAnsi" w:hAnsi="Consolas" w:cs="Consolas"/>
-          <w:color w:val="0000FF"/>
-          <w:sz w:val="19"/>
-          <w:szCs w:val="19"/>
-        </w:rPr>
-        <w:t>RmsHelpBaseLink</w:t>
-      </w:r>
-    </w:p>
-    <w:p>
-      <w:pPr>
-        <w:pStyle w:val="ListParagraph"/>
-        <w:numPr>
-          <w:ilvl w:val="2"/>
-          <w:numId w:val="30"/>
-        </w:numPr>
-        <w:spacing w:after="0"/>
-      </w:pPr>
-      <w:r>
-        <w:rPr>
-          <w:rFonts w:ascii="Calibri" w:eastAsia="Times New Roman" w:hAnsi="Calibri" w:cs="Calibri"/>
-          <w:color w:val="E36C0A" w:themeColor="accent6" w:themeShade="BF"/>
-        </w:rPr>
-        <w:t>Space</w:t>
-      </w:r>
-      <w:r>
-        <w:rPr>
-          <w:rFonts w:ascii="Calibri" w:eastAsia="Times New Roman" w:hAnsi="Calibri" w:cs="Calibri"/>
-        </w:rPr>
-        <w:t xml:space="preserve">: </w:t>
-      </w:r>
-      <w:r>
-        <w:t xml:space="preserve">set to </w:t>
-      </w:r>
-      <w:r>
-        <w:rPr>
-          <w:rFonts w:ascii="Calibri" w:eastAsia="Times New Roman" w:hAnsi="Calibri" w:cs="Calibri"/>
-          <w:i/>
-        </w:rPr>
-        <w:t>blank</w:t>
-      </w:r>
-      <w:r>
-        <w:rPr>
-          <w:rFonts w:ascii="Calibri" w:eastAsia="Times New Roman" w:hAnsi="Calibri" w:cs="Calibri"/>
-          <w:i/>
-          <w:vertAlign w:val="superscript"/>
-        </w:rPr>
-        <w:t>2</w:t>
-      </w:r>
-    </w:p>
-    <w:p>
-      <w:pPr>
-        <w:pStyle w:val="ListParagraph"/>
-        <w:numPr>
-          <w:ilvl w:val="2"/>
-          <w:numId w:val="30"/>
-        </w:numPr>
-        <w:spacing w:after="0"/>
-      </w:pPr>
-      <w:r>
-        <w:rPr>
-          <w:rFonts w:ascii="Calibri" w:eastAsia="Times New Roman" w:hAnsi="Calibri" w:cs="Calibri"/>
-          <w:color w:val="E36C0A" w:themeColor="accent6" w:themeShade="BF"/>
-        </w:rPr>
-        <w:t>RMS</w:t>
-      </w:r>
-      <w:r>
-        <w:rPr>
-          <w:rFonts w:ascii="Calibri" w:eastAsia="Times New Roman" w:hAnsi="Calibri" w:cs="Calibri"/>
-        </w:rPr>
-        <w:t xml:space="preserve">: A base URL where RMS help files will be located. It should start with </w:t>
-      </w:r>
-      <w:r>
-        <w:rPr>
-          <w:rFonts w:ascii="Consolas" w:eastAsia="Times New Roman" w:hAnsi="Consolas" w:cs="Calibri"/>
-          <w:color w:val="1F497D" w:themeColor="text2"/>
-          <w:sz w:val="19"/>
-          <w:szCs w:val="19"/>
-        </w:rPr>
-        <w:t>http(s)://</w:t>
-      </w:r>
-      <w:r>
-        <w:rPr>
-          <w:rFonts w:ascii="Calibri" w:eastAsia="Times New Roman" w:hAnsi="Calibri" w:cs="Calibri"/>
-          <w:color w:val="1F497D" w:themeColor="text2"/>
-        </w:rPr>
-        <w:t xml:space="preserve"> </w:t>
-      </w:r>
-      <w:r>
-        <w:rPr>
-          <w:rFonts w:ascii="Calibri" w:eastAsia="Times New Roman" w:hAnsi="Calibri" w:cs="Calibri"/>
-        </w:rPr>
-        <w:t xml:space="preserve">and end with a </w:t>
-      </w:r>
-      <w:r>
-        <w:rPr>
-          <w:rFonts w:ascii="Consolas" w:eastAsia="Times New Roman" w:hAnsi="Consolas" w:cs="Calibri"/>
-          <w:color w:val="1F497D" w:themeColor="text2"/>
-          <w:sz w:val="19"/>
-          <w:szCs w:val="19"/>
-        </w:rPr>
-        <w:t>/</w:t>
-      </w:r>
-    </w:p>
-    <w:p>
-      <w:pPr>
-        <w:pStyle w:val="ListParagraph"/>
-        <w:numPr>
-          <w:ilvl w:val="1"/>
-          <w:numId w:val="4"/>
-        </w:numPr>
-        <w:spacing w:after="0"/>
-      </w:pPr>
-      <w:r>
-        <w:rPr>
-          <w:rFonts w:ascii="Consolas" w:eastAsiaTheme="minorHAnsi" w:hAnsi="Consolas" w:cs="Consolas"/>
-          <w:color w:val="0000FF"/>
-          <w:sz w:val="19"/>
-          <w:szCs w:val="19"/>
-        </w:rPr>
-        <w:t>RmsHelpBaseLinkNew</w:t>
-      </w:r>
-    </w:p>
-    <w:p>
-      <w:pPr>
-        <w:pStyle w:val="ListParagraph"/>
-        <w:numPr>
-          <w:ilvl w:val="2"/>
-          <w:numId w:val="30"/>
-        </w:numPr>
-        <w:spacing w:after="0"/>
-      </w:pPr>
-      <w:r>
-        <w:rPr>
-          <w:rFonts w:ascii="Calibri" w:eastAsia="Times New Roman" w:hAnsi="Calibri" w:cs="Calibri"/>
-          <w:color w:val="E36C0A" w:themeColor="accent6" w:themeShade="BF"/>
-        </w:rPr>
-        <w:t>Space</w:t>
-      </w:r>
-      <w:r>
-        <w:rPr>
-          <w:rFonts w:ascii="Calibri" w:eastAsia="Times New Roman" w:hAnsi="Calibri" w:cs="Calibri"/>
-        </w:rPr>
-        <w:t xml:space="preserve">: </w:t>
-      </w:r>
-      <w:r>
-        <w:t xml:space="preserve">set to </w:t>
-      </w:r>
-      <w:r>
-        <w:rPr>
-          <w:rFonts w:ascii="Calibri" w:eastAsia="Times New Roman" w:hAnsi="Calibri" w:cs="Calibri"/>
-          <w:i/>
-        </w:rPr>
-        <w:t>blank</w:t>
-      </w:r>
-      <w:r>
-        <w:rPr>
-          <w:rFonts w:ascii="Calibri" w:eastAsia="Times New Roman" w:hAnsi="Calibri" w:cs="Calibri"/>
-          <w:i/>
-          <w:vertAlign w:val="superscript"/>
-        </w:rPr>
-        <w:t>2</w:t>
-      </w:r>
-    </w:p>
-    <w:p>
-      <w:pPr>
-        <w:pStyle w:val="ListParagraph"/>
-        <w:numPr>
-          <w:ilvl w:val="2"/>
-          <w:numId w:val="30"/>
-        </w:numPr>
-        <w:spacing w:after="0"/>
-      </w:pPr>
-      <w:r>
-        <w:rPr>
-          <w:rFonts w:ascii="Calibri" w:eastAsia="Times New Roman" w:hAnsi="Calibri" w:cs="Calibri"/>
-          <w:color w:val="E36C0A" w:themeColor="accent6" w:themeShade="BF"/>
-        </w:rPr>
-        <w:t>RMS</w:t>
-      </w:r>
-      <w:r>
-        <w:rPr>
-          <w:rFonts w:ascii="Calibri" w:eastAsia="Times New Roman" w:hAnsi="Calibri" w:cs="Calibri"/>
-        </w:rPr>
-        <w:t xml:space="preserve">: A base URL where RMS help files will be located. It should start with </w:t>
-      </w:r>
-      <w:r>
-        <w:rPr>
-          <w:rFonts w:ascii="Consolas" w:eastAsia="Times New Roman" w:hAnsi="Consolas" w:cs="Calibri"/>
-          <w:color w:val="1F497D" w:themeColor="text2"/>
-          <w:sz w:val="19"/>
-          <w:szCs w:val="19"/>
-        </w:rPr>
-        <w:t>http(s)://</w:t>
-      </w:r>
-      <w:r>
-        <w:rPr>
-          <w:rFonts w:ascii="Calibri" w:eastAsia="Times New Roman" w:hAnsi="Calibri" w:cs="Calibri"/>
-          <w:color w:val="1F497D" w:themeColor="text2"/>
-        </w:rPr>
-        <w:t xml:space="preserve"> </w:t>
-      </w:r>
-      <w:r>
-        <w:rPr>
-          <w:rFonts w:ascii="Calibri" w:eastAsia="Times New Roman" w:hAnsi="Calibri" w:cs="Calibri"/>
-        </w:rPr>
-        <w:t xml:space="preserve">and end with a </w:t>
-      </w:r>
-      <w:r>
-        <w:rPr>
-          <w:rFonts w:ascii="Consolas" w:eastAsia="Times New Roman" w:hAnsi="Consolas" w:cs="Calibri"/>
-          <w:color w:val="1F497D" w:themeColor="text2"/>
-          <w:sz w:val="19"/>
-          <w:szCs w:val="19"/>
-        </w:rPr>
-        <w:t>/</w:t>
-      </w:r>
-    </w:p>
-    <w:p/>
-    <w:p>
-      <w:pPr>
-        <w:pStyle w:val="ListParagraph"/>
-        <w:spacing w:after="0"/>
-        <w:ind w:left="1440"/>
-        <w:textAlignment w:val="center"/>
-        <w:rPr>
-          <w:rFonts w:ascii="Calibri" w:eastAsia="Times New Roman" w:hAnsi="Calibri" w:cs="Calibri"/>
-        </w:rPr>
-      </w:pPr>
-      <w:r>
-        <w:rPr>
-          <w:rFonts w:ascii="Consolas" w:eastAsiaTheme="minorHAnsi" w:hAnsi="Consolas" w:cs="Consolas"/>
-          <w:color w:val="008000"/>
-          <w:sz w:val="19"/>
-          <w:szCs w:val="19"/>
-        </w:rPr>
-        <w:t>Project Map Settings</w:t>
-      </w:r>
-    </w:p>
-    <w:p>
-      <w:pPr>
-        <w:pStyle w:val="ListParagraph"/>
-        <w:numPr>
-          <w:ilvl w:val="1"/>
-          <w:numId w:val="4"/>
-        </w:numPr>
-        <w:spacing w:after="0"/>
-        <w:textAlignment w:val="center"/>
-        <w:rPr>
-          <w:rFonts w:ascii="Calibri" w:eastAsia="Times New Roman" w:hAnsi="Calibri" w:cs="Calibri"/>
-        </w:rPr>
-      </w:pPr>
-      <w:r>
-        <w:rPr>
-          <w:rFonts w:ascii="Consolas" w:eastAsiaTheme="minorHAnsi" w:hAnsi="Consolas" w:cs="Consolas"/>
-          <w:color w:val="0000FF"/>
-          <w:sz w:val="19"/>
-          <w:szCs w:val="19"/>
-        </w:rPr>
-        <w:t>IsProjectMapEnabled</w:t>
-      </w:r>
-    </w:p>
-    <w:p>
-      <w:pPr>
-        <w:pStyle w:val="ListParagraph"/>
-        <w:numPr>
-          <w:ilvl w:val="2"/>
-          <w:numId w:val="30"/>
-        </w:numPr>
-        <w:spacing w:after="0"/>
-        <w:textAlignment w:val="center"/>
-        <w:rPr>
-          <w:rFonts w:ascii="Calibri" w:eastAsia="Times New Roman" w:hAnsi="Calibri" w:cs="Calibri"/>
-        </w:rPr>
-      </w:pPr>
-      <w:r>
-        <w:rPr>
-          <w:rFonts w:ascii="Calibri" w:eastAsia="Times New Roman" w:hAnsi="Calibri" w:cs="Calibri"/>
-          <w:color w:val="E36C0A" w:themeColor="accent6" w:themeShade="BF"/>
-        </w:rPr>
-        <w:t>Space</w:t>
-      </w:r>
-      <w:r>
-        <w:rPr>
-          <w:rFonts w:ascii="Calibri" w:eastAsia="Times New Roman" w:hAnsi="Calibri" w:cs="Calibri"/>
-        </w:rPr>
-        <w:t xml:space="preserve">: </w:t>
-      </w:r>
-      <w:r>
-        <w:rPr>
-          <w:rFonts w:ascii="Calibri" w:eastAsia="Times New Roman" w:hAnsi="Calibri" w:cs="Calibri"/>
-        </w:rPr>
         <w:t xml:space="preserve">set to </w:t>
       </w:r>
       <w:r>
@@ -6245,7 +5359,7 @@
           <w:color w:val="1F497D" w:themeColor="text2"/>
           <w:sz w:val="20"/>
         </w:rPr>
-        <w:t>false</w:t>
+        <w:t>true</w:t>
       </w:r>
     </w:p>
     <w:p>
@@ -6269,22 +5383,10 @@
         <w:t>RMS</w:t>
       </w:r>
       <w:r>
-        <w:rPr>
-          <w:rFonts w:ascii="Calibri" w:eastAsia="Times New Roman" w:hAnsi="Calibri" w:cs="Calibri"/>
-        </w:rPr>
-        <w:t xml:space="preserve">: </w:t>
-      </w:r>
-      <w:r>
-        <w:rPr>
-          <w:rFonts w:cstheme="minorHAnsi"/>
-        </w:rPr>
-        <w:t xml:space="preserve">set </w:t>
-      </w:r>
-      <w:r>
-        <w:rPr>
-          <w:rFonts w:cstheme="minorHAnsi"/>
-        </w:rPr>
-        <w:t xml:space="preserve">to </w:t>
+        <w:t>: keep at</w:t>
+      </w:r>
+      <w:r>
+        <w:t xml:space="preserve"> </w:t>
       </w:r>
       <w:r>
         <w:rPr>
@@ -6292,6 +5394,1141 @@
           <w:color w:val="1F497D" w:themeColor="text2"/>
           <w:sz w:val="20"/>
         </w:rPr>
+        <w:t>false</w:t>
+      </w:r>
+    </w:p>
+    <w:p>
+      <w:pPr>
+        <w:pStyle w:val="ListParagraph"/>
+        <w:spacing w:after="0"/>
+        <w:ind w:left="1440"/>
+        <w:textAlignment w:val="center"/>
+        <w:rPr>
+          <w:rFonts w:ascii="Calibri" w:eastAsia="Times New Roman" w:hAnsi="Calibri" w:cs="Calibri"/>
+        </w:rPr>
+      </w:pPr>
+    </w:p>
+    <w:p>
+      <w:pPr>
+        <w:pStyle w:val="ListParagraph"/>
+        <w:spacing w:after="0"/>
+        <w:ind w:left="1440"/>
+        <w:textAlignment w:val="center"/>
+        <w:rPr>
+          <w:rFonts w:ascii="Calibri" w:eastAsia="Times New Roman" w:hAnsi="Calibri" w:cs="Calibri"/>
+        </w:rPr>
+      </w:pPr>
+      <w:r>
+        <w:rPr>
+          <w:rFonts w:ascii="Consolas" w:eastAsiaTheme="minorHAnsi" w:hAnsi="Consolas" w:cs="Consolas"/>
+          <w:color w:val="008000"/>
+          <w:sz w:val="19"/>
+          <w:szCs w:val="19"/>
+        </w:rPr>
+        <w:t>Hours offset</w:t>
+      </w:r>
+    </w:p>
+    <w:p>
+      <w:pPr>
+        <w:pStyle w:val="ListParagraph"/>
+        <w:numPr>
+          <w:ilvl w:val="1"/>
+          <w:numId w:val="4"/>
+        </w:numPr>
+        <w:spacing w:after="0"/>
+        <w:textAlignment w:val="center"/>
+        <w:rPr>
+          <w:rFonts w:ascii="Calibri" w:eastAsia="Times New Roman" w:hAnsi="Calibri" w:cs="Calibri"/>
+        </w:rPr>
+      </w:pPr>
+      <w:r>
+        <w:rPr>
+          <w:rFonts w:ascii="Consolas" w:eastAsiaTheme="minorHAnsi" w:hAnsi="Consolas" w:cs="Consolas"/>
+          <w:color w:val="0000FF"/>
+          <w:sz w:val="19"/>
+          <w:szCs w:val="19"/>
+        </w:rPr>
+        <w:t>DatabaseESTOffset</w:t>
+      </w:r>
+      <w:r>
+        <w:rPr>
+          <w:rFonts w:ascii="Calibri" w:eastAsia="Times New Roman" w:hAnsi="Calibri" w:cs="Calibri"/>
+        </w:rPr>
+        <w:t xml:space="preserve"> – adjust based on whether your DB is in a different time zone than your web server. 0 means it’s in the same zone.</w:t>
+      </w:r>
+    </w:p>
+    <w:p>
+      <w:pPr>
+        <w:pStyle w:val="ListParagraph"/>
+        <w:numPr>
+          <w:ilvl w:val="1"/>
+          <w:numId w:val="4"/>
+        </w:numPr>
+        <w:spacing w:after="0"/>
+        <w:textAlignment w:val="center"/>
+        <w:rPr>
+          <w:rFonts w:ascii="Calibri" w:eastAsia="Times New Roman" w:hAnsi="Calibri" w:cs="Calibri"/>
+        </w:rPr>
+      </w:pPr>
+      <w:r>
+        <w:rPr>
+          <w:rFonts w:ascii="Consolas" w:eastAsiaTheme="minorHAnsi" w:hAnsi="Consolas" w:cs="Consolas"/>
+          <w:color w:val="0000FF"/>
+          <w:sz w:val="19"/>
+          <w:szCs w:val="19"/>
+        </w:rPr>
+        <w:t>CanCreateWorkspaceWithoutPtmTrackingNumber</w:t>
+      </w:r>
+    </w:p>
+    <w:p>
+      <w:pPr>
+        <w:pStyle w:val="ListParagraph"/>
+        <w:numPr>
+          <w:ilvl w:val="2"/>
+          <w:numId w:val="30"/>
+        </w:numPr>
+        <w:spacing w:after="0"/>
+        <w:textAlignment w:val="center"/>
+        <w:rPr>
+          <w:rFonts w:ascii="Calibri" w:eastAsia="Times New Roman" w:hAnsi="Calibri" w:cs="Calibri"/>
+        </w:rPr>
+      </w:pPr>
+      <w:r>
+        <w:rPr>
+          <w:rFonts w:ascii="Calibri" w:eastAsia="Times New Roman" w:hAnsi="Calibri" w:cs="Calibri"/>
+          <w:color w:val="E36C0A" w:themeColor="accent6" w:themeShade="BF"/>
+        </w:rPr>
+        <w:t>Space</w:t>
+      </w:r>
+      <w:r>
+        <w:rPr>
+          <w:rFonts w:ascii="Calibri" w:eastAsia="Times New Roman" w:hAnsi="Calibri" w:cs="Calibri"/>
+        </w:rPr>
+        <w:t xml:space="preserve">: </w:t>
+      </w:r>
+      <w:r>
+        <w:rPr>
+          <w:rFonts w:ascii="Calibri" w:eastAsia="Times New Roman" w:hAnsi="Calibri" w:cs="Calibri"/>
+        </w:rPr>
+        <w:t xml:space="preserve">We have this </w:t>
+      </w:r>
+      <w:r>
+        <w:rPr>
+          <w:rFonts w:ascii="Calibri" w:eastAsia="Times New Roman" w:hAnsi="Calibri" w:cs="Calibri"/>
+          <w:i/>
+          <w:iCs/>
+        </w:rPr>
+        <w:t>blank</w:t>
+      </w:r>
+      <w:r>
+        <w:rPr>
+          <w:rFonts w:ascii="Calibri" w:eastAsia="Times New Roman" w:hAnsi="Calibri" w:cs="Calibri"/>
+        </w:rPr>
+        <w:t>, but please verify this with Frank – there may be a group of users that needs to be added here.</w:t>
+      </w:r>
+    </w:p>
+    <w:p>
+      <w:pPr>
+        <w:pStyle w:val="ListParagraph"/>
+        <w:numPr>
+          <w:ilvl w:val="2"/>
+          <w:numId w:val="30"/>
+        </w:numPr>
+        <w:spacing w:after="0"/>
+      </w:pPr>
+      <w:r>
+        <w:rPr>
+          <w:rFonts w:ascii="Calibri" w:eastAsia="Times New Roman" w:hAnsi="Calibri" w:cs="Calibri"/>
+          <w:color w:val="E36C0A" w:themeColor="accent6" w:themeShade="BF"/>
+        </w:rPr>
+        <w:t>RMS</w:t>
+      </w:r>
+      <w:r>
+        <w:t xml:space="preserve">: </w:t>
+      </w:r>
+      <w:r>
+        <w:t>keep at</w:t>
+      </w:r>
+      <w:r>
+        <w:rPr>
+          <w:rFonts w:ascii="Calibri" w:eastAsia="Times New Roman" w:hAnsi="Calibri" w:cs="Calibri"/>
+          <w:i/>
+          <w:iCs/>
+        </w:rPr>
+        <w:t xml:space="preserve"> </w:t>
+      </w:r>
+      <w:r>
+        <w:rPr>
+          <w:rFonts w:ascii="Calibri" w:eastAsia="Times New Roman" w:hAnsi="Calibri" w:cs="Calibri"/>
+          <w:i/>
+          <w:iCs/>
+        </w:rPr>
+        <w:t>blank</w:t>
+      </w:r>
+    </w:p>
+    <w:p>
+      <w:pPr>
+        <w:pStyle w:val="ListParagraph"/>
+        <w:spacing w:after="0"/>
+        <w:ind w:left="1440"/>
+        <w:textAlignment w:val="center"/>
+        <w:rPr>
+          <w:rFonts w:ascii="Calibri" w:eastAsia="Times New Roman" w:hAnsi="Calibri" w:cs="Calibri"/>
+        </w:rPr>
+      </w:pPr>
+    </w:p>
+    <w:p>
+      <w:pPr>
+        <w:pStyle w:val="ListParagraph"/>
+        <w:spacing w:after="0"/>
+        <w:ind w:left="1440"/>
+        <w:textAlignment w:val="center"/>
+        <w:rPr>
+          <w:rFonts w:ascii="Calibri" w:eastAsia="Times New Roman" w:hAnsi="Calibri" w:cs="Calibri"/>
+        </w:rPr>
+      </w:pPr>
+      <w:r>
+        <w:rPr>
+          <w:rFonts w:ascii="Consolas" w:eastAsiaTheme="minorHAnsi" w:hAnsi="Consolas" w:cs="Consolas"/>
+          <w:color w:val="008000"/>
+          <w:sz w:val="19"/>
+          <w:szCs w:val="19"/>
+        </w:rPr>
+        <w:lastRenderedPageBreak/>
+        <w:t>Piwik Settings</w:t>
+      </w:r>
+    </w:p>
+    <w:p>
+      <w:pPr>
+        <w:pStyle w:val="ListParagraph"/>
+        <w:numPr>
+          <w:ilvl w:val="1"/>
+          <w:numId w:val="4"/>
+        </w:numPr>
+        <w:spacing w:after="0"/>
+        <w:textAlignment w:val="center"/>
+        <w:rPr>
+          <w:rFonts w:ascii="Calibri" w:eastAsia="Times New Roman" w:hAnsi="Calibri" w:cs="Calibri"/>
+        </w:rPr>
+      </w:pPr>
+      <w:r>
+        <w:rPr>
+          <w:rFonts w:ascii="Consolas" w:eastAsiaTheme="minorHAnsi" w:hAnsi="Consolas" w:cs="Consolas"/>
+          <w:color w:val="0000FF"/>
+          <w:sz w:val="19"/>
+          <w:szCs w:val="19"/>
+        </w:rPr>
+        <w:t>DisablePiwik</w:t>
+      </w:r>
+      <w:r>
+        <w:rPr>
+          <w:rStyle w:val="FootnoteReference"/>
+          <w:rFonts w:eastAsiaTheme="minorHAnsi" w:cs="Consolas"/>
+        </w:rPr>
+        <w:footnoteReference w:id="3"/>
+      </w:r>
+      <w:r>
+        <w:t xml:space="preserve"> – set this to </w:t>
+      </w:r>
+      <w:r>
+        <w:rPr>
+          <w:rFonts w:ascii="Consolas" w:hAnsi="Consolas" w:cs="Consolas"/>
+          <w:sz w:val="20"/>
+        </w:rPr>
+        <w:t>true</w:t>
+      </w:r>
+      <w:r>
+        <w:rPr>
+          <w:sz w:val="20"/>
+        </w:rPr>
+        <w:t xml:space="preserve"> </w:t>
+      </w:r>
+      <w:r>
+        <w:t>(to not track the website usage via piwik</w:t>
+      </w:r>
+      <w:r>
+        <w:t>)</w:t>
+      </w:r>
+      <w:r>
+        <w:t xml:space="preserve">. </w:t>
+      </w:r>
+      <w:r>
+        <w:rPr>
+          <w:rFonts w:ascii="Calibri" w:eastAsia="Times New Roman" w:hAnsi="Calibri" w:cs="Calibri"/>
+        </w:rPr>
+        <w:t>I</w:t>
+      </w:r>
+      <w:r>
+        <w:rPr>
+          <w:rFonts w:ascii="Calibri" w:eastAsia="Times New Roman" w:hAnsi="Calibri" w:cs="Calibri"/>
+        </w:rPr>
+        <w:t>gnore the other piwik settings once you disable it</w:t>
+      </w:r>
+    </w:p>
+    <w:p>
+      <w:pPr>
+        <w:pStyle w:val="ListParagraph"/>
+        <w:spacing w:after="0"/>
+        <w:ind w:left="1440"/>
+      </w:pPr>
+    </w:p>
+    <w:p>
+      <w:pPr>
+        <w:pStyle w:val="ListParagraph"/>
+        <w:spacing w:after="0"/>
+        <w:ind w:left="1440"/>
+      </w:pPr>
+      <w:r>
+        <w:rPr>
+          <w:rFonts w:ascii="Consolas" w:eastAsiaTheme="minorHAnsi" w:hAnsi="Consolas" w:cs="Consolas"/>
+          <w:color w:val="008000"/>
+          <w:sz w:val="19"/>
+          <w:szCs w:val="19"/>
+        </w:rPr>
+        <w:t>MST Measure / Metrics</w:t>
+      </w:r>
+    </w:p>
+    <w:p>
+      <w:pPr>
+        <w:pStyle w:val="ListParagraph"/>
+        <w:numPr>
+          <w:ilvl w:val="1"/>
+          <w:numId w:val="4"/>
+        </w:numPr>
+        <w:spacing w:after="0"/>
+      </w:pPr>
+      <w:r>
+        <w:rPr>
+          <w:rFonts w:ascii="Consolas" w:eastAsiaTheme="minorHAnsi" w:hAnsi="Consolas" w:cs="Consolas"/>
+          <w:color w:val="0000FF"/>
+          <w:sz w:val="19"/>
+          <w:szCs w:val="19"/>
+        </w:rPr>
+        <w:t>MstMetricsUrl</w:t>
+      </w:r>
+    </w:p>
+    <w:p>
+      <w:pPr>
+        <w:pStyle w:val="ListParagraph"/>
+        <w:numPr>
+          <w:ilvl w:val="2"/>
+          <w:numId w:val="30"/>
+        </w:numPr>
+        <w:spacing w:after="0"/>
+      </w:pPr>
+      <w:r>
+        <w:rPr>
+          <w:rFonts w:ascii="Calibri" w:eastAsia="Times New Roman" w:hAnsi="Calibri" w:cs="Calibri"/>
+          <w:color w:val="E36C0A" w:themeColor="accent6" w:themeShade="BF"/>
+        </w:rPr>
+        <w:t>Space</w:t>
+      </w:r>
+      <w:r>
+        <w:rPr>
+          <w:rFonts w:ascii="Calibri" w:eastAsia="Times New Roman" w:hAnsi="Calibri" w:cs="Calibri"/>
+        </w:rPr>
+        <w:t xml:space="preserve">: </w:t>
+      </w:r>
+      <w:r>
+        <w:t xml:space="preserve">set to </w:t>
+      </w:r>
+      <w:r>
+        <w:rPr>
+          <w:rFonts w:ascii="Calibri" w:eastAsia="Times New Roman" w:hAnsi="Calibri" w:cs="Calibri"/>
+          <w:i/>
+        </w:rPr>
+        <w:t>blank</w:t>
+      </w:r>
+      <w:r>
+        <w:rPr>
+          <w:rFonts w:ascii="Calibri" w:eastAsia="Times New Roman" w:hAnsi="Calibri" w:cs="Calibri"/>
+          <w:i/>
+          <w:vertAlign w:val="superscript"/>
+        </w:rPr>
+        <w:t>2</w:t>
+      </w:r>
+    </w:p>
+    <w:p>
+      <w:pPr>
+        <w:pStyle w:val="ListParagraph"/>
+        <w:numPr>
+          <w:ilvl w:val="2"/>
+          <w:numId w:val="30"/>
+        </w:numPr>
+        <w:spacing w:after="0"/>
+      </w:pPr>
+      <w:r>
+        <w:rPr>
+          <w:rFonts w:ascii="Calibri" w:eastAsia="Times New Roman" w:hAnsi="Calibri" w:cs="Calibri"/>
+          <w:color w:val="E36C0A" w:themeColor="accent6" w:themeShade="BF"/>
+        </w:rPr>
+        <w:t>RMS</w:t>
+      </w:r>
+      <w:r>
+        <w:rPr>
+          <w:rFonts w:ascii="Calibri" w:eastAsia="Times New Roman" w:hAnsi="Calibri" w:cs="Calibri"/>
+        </w:rPr>
+        <w:t xml:space="preserve">: </w:t>
+      </w:r>
+      <w:r>
+        <w:rPr>
+          <w:rFonts w:ascii="Calibri" w:eastAsia="Times New Roman" w:hAnsi="Calibri" w:cs="Calibri"/>
+        </w:rPr>
+        <w:t>If used, the URL to the application</w:t>
+      </w:r>
+    </w:p>
+    <w:p>
+      <w:pPr>
+        <w:pStyle w:val="ListParagraph"/>
+        <w:numPr>
+          <w:ilvl w:val="1"/>
+          <w:numId w:val="4"/>
+        </w:numPr>
+        <w:spacing w:after="0"/>
+      </w:pPr>
+      <w:r>
+        <w:rPr>
+          <w:rFonts w:ascii="Consolas" w:eastAsiaTheme="minorHAnsi" w:hAnsi="Consolas" w:cs="Consolas"/>
+          <w:color w:val="0000FF"/>
+          <w:sz w:val="19"/>
+          <w:szCs w:val="19"/>
+        </w:rPr>
+        <w:t>MSTSearchCriteriaHelp</w:t>
+      </w:r>
+    </w:p>
+    <w:p>
+      <w:pPr>
+        <w:pStyle w:val="ListParagraph"/>
+        <w:numPr>
+          <w:ilvl w:val="2"/>
+          <w:numId w:val="30"/>
+        </w:numPr>
+        <w:spacing w:after="0"/>
+      </w:pPr>
+      <w:r>
+        <w:rPr>
+          <w:rFonts w:ascii="Calibri" w:eastAsia="Times New Roman" w:hAnsi="Calibri" w:cs="Calibri"/>
+          <w:color w:val="E36C0A" w:themeColor="accent6" w:themeShade="BF"/>
+        </w:rPr>
+        <w:t>Space</w:t>
+      </w:r>
+      <w:r>
+        <w:rPr>
+          <w:rFonts w:ascii="Calibri" w:eastAsia="Times New Roman" w:hAnsi="Calibri" w:cs="Calibri"/>
+        </w:rPr>
+        <w:t xml:space="preserve">: </w:t>
+      </w:r>
+      <w:r>
+        <w:t xml:space="preserve">set to </w:t>
+      </w:r>
+      <w:r>
+        <w:rPr>
+          <w:rFonts w:ascii="Calibri" w:eastAsia="Times New Roman" w:hAnsi="Calibri" w:cs="Calibri"/>
+          <w:i/>
+        </w:rPr>
+        <w:t>blank</w:t>
+      </w:r>
+      <w:r>
+        <w:rPr>
+          <w:rFonts w:ascii="Calibri" w:eastAsia="Times New Roman" w:hAnsi="Calibri" w:cs="Calibri"/>
+          <w:i/>
+          <w:vertAlign w:val="superscript"/>
+        </w:rPr>
+        <w:t>2</w:t>
+      </w:r>
+    </w:p>
+    <w:p>
+      <w:pPr>
+        <w:pStyle w:val="ListParagraph"/>
+        <w:numPr>
+          <w:ilvl w:val="2"/>
+          <w:numId w:val="30"/>
+        </w:numPr>
+        <w:spacing w:after="0"/>
+      </w:pPr>
+      <w:r>
+        <w:rPr>
+          <w:rFonts w:ascii="Calibri" w:eastAsia="Times New Roman" w:hAnsi="Calibri" w:cs="Calibri"/>
+          <w:color w:val="E36C0A" w:themeColor="accent6" w:themeShade="BF"/>
+        </w:rPr>
+        <w:t>RMS</w:t>
+      </w:r>
+      <w:r>
+        <w:rPr>
+          <w:rFonts w:ascii="Calibri" w:eastAsia="Times New Roman" w:hAnsi="Calibri" w:cs="Calibri"/>
+        </w:rPr>
+        <w:t xml:space="preserve">: If used, the URL to </w:t>
+      </w:r>
+      <w:r>
+        <w:rPr>
+          <w:rFonts w:ascii="Calibri" w:eastAsia="Times New Roman" w:hAnsi="Calibri" w:cs="Calibri"/>
+        </w:rPr>
+        <w:t>the Search Criteria Help</w:t>
+      </w:r>
+    </w:p>
+    <w:p>
+      <w:pPr>
+        <w:pStyle w:val="ListParagraph"/>
+        <w:numPr>
+          <w:ilvl w:val="1"/>
+          <w:numId w:val="4"/>
+        </w:numPr>
+        <w:spacing w:after="0"/>
+      </w:pPr>
+      <w:r>
+        <w:rPr>
+          <w:rFonts w:ascii="Consolas" w:eastAsiaTheme="minorHAnsi" w:hAnsi="Consolas" w:cs="Consolas"/>
+          <w:color w:val="0000FF"/>
+          <w:sz w:val="19"/>
+          <w:szCs w:val="19"/>
+        </w:rPr>
+        <w:t>MSTSearchResultsHelpLink</w:t>
+      </w:r>
+    </w:p>
+    <w:p>
+      <w:pPr>
+        <w:pStyle w:val="ListParagraph"/>
+        <w:numPr>
+          <w:ilvl w:val="2"/>
+          <w:numId w:val="30"/>
+        </w:numPr>
+        <w:spacing w:after="0"/>
+      </w:pPr>
+      <w:r>
+        <w:rPr>
+          <w:rFonts w:ascii="Calibri" w:eastAsia="Times New Roman" w:hAnsi="Calibri" w:cs="Calibri"/>
+          <w:color w:val="E36C0A" w:themeColor="accent6" w:themeShade="BF"/>
+        </w:rPr>
+        <w:t>Space</w:t>
+      </w:r>
+      <w:r>
+        <w:rPr>
+          <w:rFonts w:ascii="Calibri" w:eastAsia="Times New Roman" w:hAnsi="Calibri" w:cs="Calibri"/>
+        </w:rPr>
+        <w:t xml:space="preserve">: </w:t>
+      </w:r>
+      <w:r>
+        <w:t xml:space="preserve">set to </w:t>
+      </w:r>
+      <w:r>
+        <w:rPr>
+          <w:rFonts w:ascii="Calibri" w:eastAsia="Times New Roman" w:hAnsi="Calibri" w:cs="Calibri"/>
+          <w:i/>
+        </w:rPr>
+        <w:t>blank</w:t>
+      </w:r>
+      <w:r>
+        <w:rPr>
+          <w:rFonts w:ascii="Calibri" w:eastAsia="Times New Roman" w:hAnsi="Calibri" w:cs="Calibri"/>
+          <w:i/>
+          <w:vertAlign w:val="superscript"/>
+        </w:rPr>
+        <w:t>2</w:t>
+      </w:r>
+    </w:p>
+    <w:p>
+      <w:pPr>
+        <w:pStyle w:val="ListParagraph"/>
+        <w:numPr>
+          <w:ilvl w:val="2"/>
+          <w:numId w:val="30"/>
+        </w:numPr>
+        <w:spacing w:after="0"/>
+      </w:pPr>
+      <w:r>
+        <w:rPr>
+          <w:rFonts w:ascii="Calibri" w:eastAsia="Times New Roman" w:hAnsi="Calibri" w:cs="Calibri"/>
+          <w:color w:val="E36C0A" w:themeColor="accent6" w:themeShade="BF"/>
+        </w:rPr>
+        <w:t>RMS</w:t>
+      </w:r>
+      <w:r>
+        <w:rPr>
+          <w:rFonts w:ascii="Calibri" w:eastAsia="Times New Roman" w:hAnsi="Calibri" w:cs="Calibri"/>
+        </w:rPr>
+        <w:t xml:space="preserve">: If used, the URL to </w:t>
+      </w:r>
+      <w:r>
+        <w:rPr>
+          <w:rFonts w:ascii="Calibri" w:eastAsia="Times New Roman" w:hAnsi="Calibri" w:cs="Calibri"/>
+        </w:rPr>
+        <w:t>the Results Help</w:t>
+      </w:r>
+    </w:p>
+    <w:p>
+      <w:pPr>
+        <w:pStyle w:val="ListParagraph"/>
+        <w:numPr>
+          <w:ilvl w:val="1"/>
+          <w:numId w:val="4"/>
+        </w:numPr>
+        <w:spacing w:after="0"/>
+      </w:pPr>
+      <w:r>
+        <w:rPr>
+          <w:rFonts w:ascii="Consolas" w:eastAsiaTheme="minorHAnsi" w:hAnsi="Consolas" w:cs="Consolas"/>
+          <w:color w:val="0000FF"/>
+          <w:sz w:val="19"/>
+          <w:szCs w:val="19"/>
+        </w:rPr>
+        <w:t>MSTSearchResultsDetailHelpLink</w:t>
+      </w:r>
+      <w:r>
+        <w:rPr>
+          <w:rFonts w:ascii="Calibri" w:eastAsia="Times New Roman" w:hAnsi="Calibri" w:cs="Calibri"/>
+        </w:rPr>
+        <w:t xml:space="preserve"> </w:t>
+      </w:r>
+    </w:p>
+    <w:p>
+      <w:pPr>
+        <w:pStyle w:val="ListParagraph"/>
+        <w:numPr>
+          <w:ilvl w:val="2"/>
+          <w:numId w:val="30"/>
+        </w:numPr>
+        <w:spacing w:after="0"/>
+      </w:pPr>
+      <w:r>
+        <w:rPr>
+          <w:rFonts w:ascii="Calibri" w:eastAsia="Times New Roman" w:hAnsi="Calibri" w:cs="Calibri"/>
+          <w:color w:val="E36C0A" w:themeColor="accent6" w:themeShade="BF"/>
+        </w:rPr>
+        <w:t>Space</w:t>
+      </w:r>
+      <w:r>
+        <w:rPr>
+          <w:rFonts w:ascii="Calibri" w:eastAsia="Times New Roman" w:hAnsi="Calibri" w:cs="Calibri"/>
+        </w:rPr>
+        <w:t xml:space="preserve">: </w:t>
+      </w:r>
+      <w:r>
+        <w:t xml:space="preserve">set to </w:t>
+      </w:r>
+      <w:r>
+        <w:rPr>
+          <w:rFonts w:ascii="Calibri" w:eastAsia="Times New Roman" w:hAnsi="Calibri" w:cs="Calibri"/>
+          <w:i/>
+        </w:rPr>
+        <w:t>blank</w:t>
+      </w:r>
+      <w:r>
+        <w:rPr>
+          <w:rFonts w:ascii="Calibri" w:eastAsia="Times New Roman" w:hAnsi="Calibri" w:cs="Calibri"/>
+          <w:i/>
+          <w:vertAlign w:val="superscript"/>
+        </w:rPr>
+        <w:t>2</w:t>
+      </w:r>
+    </w:p>
+    <w:p>
+      <w:pPr>
+        <w:pStyle w:val="ListParagraph"/>
+        <w:numPr>
+          <w:ilvl w:val="2"/>
+          <w:numId w:val="30"/>
+        </w:numPr>
+        <w:spacing w:after="0"/>
+      </w:pPr>
+      <w:r>
+        <w:rPr>
+          <w:rFonts w:ascii="Calibri" w:eastAsia="Times New Roman" w:hAnsi="Calibri" w:cs="Calibri"/>
+          <w:color w:val="E36C0A" w:themeColor="accent6" w:themeShade="BF"/>
+        </w:rPr>
+        <w:t>RMS</w:t>
+      </w:r>
+      <w:r>
+        <w:rPr>
+          <w:rFonts w:ascii="Calibri" w:eastAsia="Times New Roman" w:hAnsi="Calibri" w:cs="Calibri"/>
+        </w:rPr>
+        <w:t xml:space="preserve">: If used, the URL to </w:t>
+      </w:r>
+      <w:r>
+        <w:rPr>
+          <w:rFonts w:ascii="Calibri" w:eastAsia="Times New Roman" w:hAnsi="Calibri" w:cs="Calibri"/>
+        </w:rPr>
+        <w:t>the Result Details Help</w:t>
+      </w:r>
+    </w:p>
+    <w:p>
+      <w:pPr>
+        <w:rPr>
+          <w:rFonts w:ascii="Consolas" w:eastAsiaTheme="minorHAnsi" w:hAnsi="Consolas" w:cs="Consolas"/>
+          <w:color w:val="008000"/>
+          <w:sz w:val="19"/>
+          <w:szCs w:val="19"/>
+        </w:rPr>
+      </w:pPr>
+    </w:p>
+    <w:p>
+      <w:pPr>
+        <w:pStyle w:val="ListParagraph"/>
+        <w:spacing w:after="0"/>
+        <w:ind w:left="1440"/>
+        <w:textAlignment w:val="center"/>
+        <w:rPr>
+          <w:rFonts w:ascii="Calibri" w:eastAsia="Times New Roman" w:hAnsi="Calibri" w:cs="Calibri"/>
+        </w:rPr>
+      </w:pPr>
+      <w:r>
+        <w:rPr>
+          <w:rFonts w:ascii="Consolas" w:eastAsiaTheme="minorHAnsi" w:hAnsi="Consolas" w:cs="Consolas"/>
+          <w:color w:val="008000"/>
+          <w:sz w:val="19"/>
+          <w:szCs w:val="19"/>
+        </w:rPr>
+        <w:t>Additional RMS Settings</w:t>
+      </w:r>
+    </w:p>
+    <w:p>
+      <w:pPr>
+        <w:pStyle w:val="ListParagraph"/>
+        <w:numPr>
+          <w:ilvl w:val="1"/>
+          <w:numId w:val="4"/>
+        </w:numPr>
+        <w:spacing w:after="0"/>
+      </w:pPr>
+      <w:r>
+        <w:rPr>
+          <w:rFonts w:ascii="Consolas" w:eastAsiaTheme="minorHAnsi" w:hAnsi="Consolas" w:cs="Consolas"/>
+          <w:color w:val="0000FF"/>
+          <w:sz w:val="19"/>
+          <w:szCs w:val="19"/>
+        </w:rPr>
+        <w:t>ArchiveUrlBoe</w:t>
+      </w:r>
+      <w:r>
+        <w:t xml:space="preserve"> </w:t>
+      </w:r>
+    </w:p>
+    <w:p>
+      <w:pPr>
+        <w:pStyle w:val="ListParagraph"/>
+        <w:numPr>
+          <w:ilvl w:val="2"/>
+          <w:numId w:val="4"/>
+        </w:numPr>
+        <w:spacing w:after="0"/>
+      </w:pPr>
+      <w:r>
+        <w:rPr>
+          <w:rFonts w:ascii="Calibri" w:eastAsia="Times New Roman" w:hAnsi="Calibri" w:cs="Calibri"/>
+          <w:color w:val="E36C0A" w:themeColor="accent6" w:themeShade="BF"/>
+        </w:rPr>
+        <w:t>Space</w:t>
+      </w:r>
+      <w:r>
+        <w:rPr>
+          <w:rFonts w:ascii="Calibri" w:eastAsia="Times New Roman" w:hAnsi="Calibri" w:cs="Calibri"/>
+        </w:rPr>
+        <w:t xml:space="preserve">: </w:t>
+      </w:r>
+      <w:r>
+        <w:t xml:space="preserve">set to </w:t>
+      </w:r>
+      <w:r>
+        <w:rPr>
+          <w:rFonts w:ascii="Calibri" w:eastAsia="Times New Roman" w:hAnsi="Calibri" w:cs="Calibri"/>
+          <w:i/>
+        </w:rPr>
+        <w:t>blank</w:t>
+      </w:r>
+      <w:r>
+        <w:rPr>
+          <w:rFonts w:ascii="Calibri" w:eastAsia="Times New Roman" w:hAnsi="Calibri" w:cs="Calibri"/>
+          <w:i/>
+          <w:vertAlign w:val="superscript"/>
+        </w:rPr>
+        <w:t>2</w:t>
+      </w:r>
+    </w:p>
+    <w:p>
+      <w:pPr>
+        <w:pStyle w:val="ListParagraph"/>
+        <w:numPr>
+          <w:ilvl w:val="2"/>
+          <w:numId w:val="4"/>
+        </w:numPr>
+        <w:spacing w:after="0"/>
+      </w:pPr>
+      <w:r>
+        <w:rPr>
+          <w:rFonts w:ascii="Calibri" w:eastAsia="Times New Roman" w:hAnsi="Calibri" w:cs="Calibri"/>
+          <w:color w:val="E36C0A" w:themeColor="accent6" w:themeShade="BF"/>
+        </w:rPr>
+        <w:t>RMS</w:t>
+      </w:r>
+      <w:r>
+        <w:t xml:space="preserve">: A base URL where the Archive RMS genBOE instance is located. i.e. </w:t>
+      </w:r>
+      <w:r>
+        <w:rPr>
+          <w:rFonts w:ascii="Cascadia Mono" w:eastAsiaTheme="minorHAnsi" w:hAnsi="Cascadia Mono" w:cs="Cascadia Mono"/>
+          <w:color w:val="000000"/>
+          <w:sz w:val="19"/>
+          <w:szCs w:val="19"/>
+        </w:rPr>
+        <w:t>https://archive-genboerms.us.lmco.com</w:t>
+      </w:r>
+    </w:p>
+    <w:p>
+      <w:pPr>
+        <w:pStyle w:val="ListParagraph"/>
+        <w:numPr>
+          <w:ilvl w:val="1"/>
+          <w:numId w:val="4"/>
+        </w:numPr>
+        <w:spacing w:after="0"/>
+      </w:pPr>
+      <w:r>
+        <w:rPr>
+          <w:rFonts w:ascii="Consolas" w:eastAsiaTheme="minorHAnsi" w:hAnsi="Consolas" w:cs="Consolas"/>
+          <w:color w:val="0000FF"/>
+          <w:sz w:val="19"/>
+          <w:szCs w:val="19"/>
+        </w:rPr>
+        <w:t>RmsHelpBaseLink</w:t>
+      </w:r>
+    </w:p>
+    <w:p>
+      <w:pPr>
+        <w:pStyle w:val="ListParagraph"/>
+        <w:numPr>
+          <w:ilvl w:val="2"/>
+          <w:numId w:val="30"/>
+        </w:numPr>
+        <w:spacing w:after="0"/>
+      </w:pPr>
+      <w:r>
+        <w:rPr>
+          <w:rFonts w:ascii="Calibri" w:eastAsia="Times New Roman" w:hAnsi="Calibri" w:cs="Calibri"/>
+          <w:color w:val="E36C0A" w:themeColor="accent6" w:themeShade="BF"/>
+        </w:rPr>
+        <w:t>Space</w:t>
+      </w:r>
+      <w:r>
+        <w:rPr>
+          <w:rFonts w:ascii="Calibri" w:eastAsia="Times New Roman" w:hAnsi="Calibri" w:cs="Calibri"/>
+        </w:rPr>
+        <w:t xml:space="preserve">: </w:t>
+      </w:r>
+      <w:r>
+        <w:t xml:space="preserve">set to </w:t>
+      </w:r>
+      <w:r>
+        <w:rPr>
+          <w:rFonts w:ascii="Calibri" w:eastAsia="Times New Roman" w:hAnsi="Calibri" w:cs="Calibri"/>
+          <w:i/>
+        </w:rPr>
+        <w:t>blank</w:t>
+      </w:r>
+      <w:r>
+        <w:rPr>
+          <w:rFonts w:ascii="Calibri" w:eastAsia="Times New Roman" w:hAnsi="Calibri" w:cs="Calibri"/>
+          <w:i/>
+          <w:vertAlign w:val="superscript"/>
+        </w:rPr>
+        <w:t>2</w:t>
+      </w:r>
+    </w:p>
+    <w:p>
+      <w:pPr>
+        <w:pStyle w:val="ListParagraph"/>
+        <w:numPr>
+          <w:ilvl w:val="2"/>
+          <w:numId w:val="30"/>
+        </w:numPr>
+        <w:spacing w:after="0"/>
+      </w:pPr>
+      <w:r>
+        <w:rPr>
+          <w:rFonts w:ascii="Calibri" w:eastAsia="Times New Roman" w:hAnsi="Calibri" w:cs="Calibri"/>
+          <w:color w:val="E36C0A" w:themeColor="accent6" w:themeShade="BF"/>
+        </w:rPr>
+        <w:t>RMS</w:t>
+      </w:r>
+      <w:r>
+        <w:rPr>
+          <w:rFonts w:ascii="Calibri" w:eastAsia="Times New Roman" w:hAnsi="Calibri" w:cs="Calibri"/>
+        </w:rPr>
+        <w:t xml:space="preserve">: A base URL where RMS help files will be located. It should start with </w:t>
+      </w:r>
+      <w:r>
+        <w:rPr>
+          <w:rFonts w:ascii="Consolas" w:eastAsia="Times New Roman" w:hAnsi="Consolas" w:cs="Calibri"/>
+          <w:color w:val="1F497D" w:themeColor="text2"/>
+          <w:sz w:val="19"/>
+          <w:szCs w:val="19"/>
+        </w:rPr>
+        <w:t>http(s)://</w:t>
+      </w:r>
+      <w:r>
+        <w:rPr>
+          <w:rFonts w:ascii="Calibri" w:eastAsia="Times New Roman" w:hAnsi="Calibri" w:cs="Calibri"/>
+          <w:color w:val="1F497D" w:themeColor="text2"/>
+        </w:rPr>
+        <w:t xml:space="preserve"> </w:t>
+      </w:r>
+      <w:r>
+        <w:rPr>
+          <w:rFonts w:ascii="Calibri" w:eastAsia="Times New Roman" w:hAnsi="Calibri" w:cs="Calibri"/>
+        </w:rPr>
+        <w:t xml:space="preserve">and end with a </w:t>
+      </w:r>
+      <w:r>
+        <w:rPr>
+          <w:rFonts w:ascii="Consolas" w:eastAsia="Times New Roman" w:hAnsi="Consolas" w:cs="Calibri"/>
+          <w:color w:val="1F497D" w:themeColor="text2"/>
+          <w:sz w:val="19"/>
+          <w:szCs w:val="19"/>
+        </w:rPr>
+        <w:t>/</w:t>
+      </w:r>
+    </w:p>
+    <w:p>
+      <w:pPr>
+        <w:pStyle w:val="ListParagraph"/>
+        <w:numPr>
+          <w:ilvl w:val="1"/>
+          <w:numId w:val="4"/>
+        </w:numPr>
+        <w:spacing w:after="0"/>
+      </w:pPr>
+      <w:r>
+        <w:rPr>
+          <w:rFonts w:ascii="Consolas" w:eastAsiaTheme="minorHAnsi" w:hAnsi="Consolas" w:cs="Consolas"/>
+          <w:color w:val="0000FF"/>
+          <w:sz w:val="19"/>
+          <w:szCs w:val="19"/>
+        </w:rPr>
+        <w:t>RmsHelpBaseLinkNew</w:t>
+      </w:r>
+    </w:p>
+    <w:p>
+      <w:pPr>
+        <w:pStyle w:val="ListParagraph"/>
+        <w:numPr>
+          <w:ilvl w:val="2"/>
+          <w:numId w:val="30"/>
+        </w:numPr>
+        <w:spacing w:after="0"/>
+      </w:pPr>
+      <w:r>
+        <w:rPr>
+          <w:rFonts w:ascii="Calibri" w:eastAsia="Times New Roman" w:hAnsi="Calibri" w:cs="Calibri"/>
+          <w:color w:val="E36C0A" w:themeColor="accent6" w:themeShade="BF"/>
+        </w:rPr>
+        <w:t>Space</w:t>
+      </w:r>
+      <w:r>
+        <w:rPr>
+          <w:rFonts w:ascii="Calibri" w:eastAsia="Times New Roman" w:hAnsi="Calibri" w:cs="Calibri"/>
+        </w:rPr>
+        <w:t xml:space="preserve">: </w:t>
+      </w:r>
+      <w:r>
+        <w:t xml:space="preserve">set to </w:t>
+      </w:r>
+      <w:r>
+        <w:rPr>
+          <w:rFonts w:ascii="Calibri" w:eastAsia="Times New Roman" w:hAnsi="Calibri" w:cs="Calibri"/>
+          <w:i/>
+        </w:rPr>
+        <w:t>blank</w:t>
+      </w:r>
+      <w:r>
+        <w:rPr>
+          <w:rFonts w:ascii="Calibri" w:eastAsia="Times New Roman" w:hAnsi="Calibri" w:cs="Calibri"/>
+          <w:i/>
+          <w:vertAlign w:val="superscript"/>
+        </w:rPr>
+        <w:t>2</w:t>
+      </w:r>
+    </w:p>
+    <w:p>
+      <w:pPr>
+        <w:pStyle w:val="ListParagraph"/>
+        <w:numPr>
+          <w:ilvl w:val="2"/>
+          <w:numId w:val="30"/>
+        </w:numPr>
+        <w:spacing w:after="0"/>
+      </w:pPr>
+      <w:r>
+        <w:rPr>
+          <w:rFonts w:ascii="Calibri" w:eastAsia="Times New Roman" w:hAnsi="Calibri" w:cs="Calibri"/>
+          <w:color w:val="E36C0A" w:themeColor="accent6" w:themeShade="BF"/>
+        </w:rPr>
+        <w:t>RMS</w:t>
+      </w:r>
+      <w:r>
+        <w:rPr>
+          <w:rFonts w:ascii="Calibri" w:eastAsia="Times New Roman" w:hAnsi="Calibri" w:cs="Calibri"/>
+        </w:rPr>
+        <w:t xml:space="preserve">: A base URL where RMS help files will be located. It should start with </w:t>
+      </w:r>
+      <w:r>
+        <w:rPr>
+          <w:rFonts w:ascii="Consolas" w:eastAsia="Times New Roman" w:hAnsi="Consolas" w:cs="Calibri"/>
+          <w:color w:val="1F497D" w:themeColor="text2"/>
+          <w:sz w:val="19"/>
+          <w:szCs w:val="19"/>
+        </w:rPr>
+        <w:t>http(s)://</w:t>
+      </w:r>
+      <w:r>
+        <w:rPr>
+          <w:rFonts w:ascii="Calibri" w:eastAsia="Times New Roman" w:hAnsi="Calibri" w:cs="Calibri"/>
+          <w:color w:val="1F497D" w:themeColor="text2"/>
+        </w:rPr>
+        <w:t xml:space="preserve"> </w:t>
+      </w:r>
+      <w:r>
+        <w:rPr>
+          <w:rFonts w:ascii="Calibri" w:eastAsia="Times New Roman" w:hAnsi="Calibri" w:cs="Calibri"/>
+        </w:rPr>
+        <w:t xml:space="preserve">and end with a </w:t>
+      </w:r>
+      <w:r>
+        <w:rPr>
+          <w:rFonts w:ascii="Consolas" w:eastAsia="Times New Roman" w:hAnsi="Consolas" w:cs="Calibri"/>
+          <w:color w:val="1F497D" w:themeColor="text2"/>
+          <w:sz w:val="19"/>
+          <w:szCs w:val="19"/>
+        </w:rPr>
+        <w:t>/</w:t>
+      </w:r>
+    </w:p>
+    <w:p/>
+    <w:p>
+      <w:pPr>
+        <w:pStyle w:val="ListParagraph"/>
+        <w:spacing w:after="0"/>
+        <w:ind w:left="1440"/>
+        <w:textAlignment w:val="center"/>
+        <w:rPr>
+          <w:rFonts w:ascii="Calibri" w:eastAsia="Times New Roman" w:hAnsi="Calibri" w:cs="Calibri"/>
+        </w:rPr>
+      </w:pPr>
+      <w:r>
+        <w:rPr>
+          <w:rFonts w:ascii="Consolas" w:eastAsiaTheme="minorHAnsi" w:hAnsi="Consolas" w:cs="Consolas"/>
+          <w:color w:val="008000"/>
+          <w:sz w:val="19"/>
+          <w:szCs w:val="19"/>
+        </w:rPr>
+        <w:t>Project Map Settings</w:t>
+      </w:r>
+    </w:p>
+    <w:p>
+      <w:pPr>
+        <w:pStyle w:val="ListParagraph"/>
+        <w:numPr>
+          <w:ilvl w:val="1"/>
+          <w:numId w:val="4"/>
+        </w:numPr>
+        <w:spacing w:after="0"/>
+        <w:textAlignment w:val="center"/>
+        <w:rPr>
+          <w:rFonts w:ascii="Calibri" w:eastAsia="Times New Roman" w:hAnsi="Calibri" w:cs="Calibri"/>
+        </w:rPr>
+      </w:pPr>
+      <w:r>
+        <w:rPr>
+          <w:rFonts w:ascii="Consolas" w:eastAsiaTheme="minorHAnsi" w:hAnsi="Consolas" w:cs="Consolas"/>
+          <w:color w:val="0000FF"/>
+          <w:sz w:val="19"/>
+          <w:szCs w:val="19"/>
+        </w:rPr>
+        <w:t>IsProjectMapEnabled</w:t>
+      </w:r>
+    </w:p>
+    <w:p>
+      <w:pPr>
+        <w:pStyle w:val="ListParagraph"/>
+        <w:numPr>
+          <w:ilvl w:val="2"/>
+          <w:numId w:val="30"/>
+        </w:numPr>
+        <w:spacing w:after="0"/>
+        <w:textAlignment w:val="center"/>
+        <w:rPr>
+          <w:rFonts w:ascii="Calibri" w:eastAsia="Times New Roman" w:hAnsi="Calibri" w:cs="Calibri"/>
+        </w:rPr>
+      </w:pPr>
+      <w:r>
+        <w:rPr>
+          <w:rFonts w:ascii="Calibri" w:eastAsia="Times New Roman" w:hAnsi="Calibri" w:cs="Calibri"/>
+          <w:color w:val="E36C0A" w:themeColor="accent6" w:themeShade="BF"/>
+        </w:rPr>
+        <w:t>Space</w:t>
+      </w:r>
+      <w:r>
+        <w:rPr>
+          <w:rFonts w:ascii="Calibri" w:eastAsia="Times New Roman" w:hAnsi="Calibri" w:cs="Calibri"/>
+        </w:rPr>
+        <w:t xml:space="preserve">: </w:t>
+      </w:r>
+      <w:r>
+        <w:rPr>
+          <w:rFonts w:ascii="Calibri" w:eastAsia="Times New Roman" w:hAnsi="Calibri" w:cs="Calibri"/>
+        </w:rPr>
+        <w:t xml:space="preserve">set to </w:t>
+      </w:r>
+      <w:r>
+        <w:rPr>
+          <w:rFonts w:ascii="Consolas" w:hAnsi="Consolas" w:cs="Consolas"/>
+          <w:color w:val="1F497D" w:themeColor="text2"/>
+          <w:sz w:val="20"/>
+        </w:rPr>
+        <w:t>false</w:t>
+      </w:r>
+    </w:p>
+    <w:p>
+      <w:pPr>
+        <w:pStyle w:val="ListParagraph"/>
+        <w:numPr>
+          <w:ilvl w:val="2"/>
+          <w:numId w:val="30"/>
+        </w:numPr>
+        <w:spacing w:after="0"/>
+        <w:textAlignment w:val="center"/>
+        <w:rPr>
+          <w:rFonts w:ascii="Calibri" w:eastAsia="Times New Roman" w:hAnsi="Calibri" w:cs="Calibri"/>
+        </w:rPr>
+      </w:pPr>
+      <w:r>
+        <w:rPr>
+          <w:rFonts w:ascii="Calibri" w:eastAsia="Times New Roman" w:hAnsi="Calibri" w:cs="Calibri"/>
+          <w:color w:val="E36C0A" w:themeColor="accent6" w:themeShade="BF"/>
+        </w:rPr>
+        <w:t>RMS</w:t>
+      </w:r>
+      <w:r>
+        <w:rPr>
+          <w:rFonts w:ascii="Calibri" w:eastAsia="Times New Roman" w:hAnsi="Calibri" w:cs="Calibri"/>
+        </w:rPr>
+        <w:t xml:space="preserve">: </w:t>
+      </w:r>
+      <w:r>
+        <w:rPr>
+          <w:rFonts w:cstheme="minorHAnsi"/>
+        </w:rPr>
+        <w:t xml:space="preserve">set </w:t>
+      </w:r>
+      <w:r>
+        <w:rPr>
+          <w:rFonts w:cstheme="minorHAnsi"/>
+        </w:rPr>
+        <w:t xml:space="preserve">to </w:t>
+      </w:r>
+      <w:r>
+        <w:rPr>
+          <w:rFonts w:ascii="Consolas" w:hAnsi="Consolas" w:cs="Consolas"/>
+          <w:color w:val="1F497D" w:themeColor="text2"/>
+          <w:sz w:val="20"/>
+        </w:rPr>
         <w:t>true</w:t>
       </w:r>
       <w:r>
@@ -6476,6 +6713,7 @@
           <w:sz w:val="19"/>
           <w:szCs w:val="19"/>
         </w:rPr>
+        <w:lastRenderedPageBreak/>
         <w:t>allow</w:t>
       </w:r>
       <w:r>
@@ -6714,7 +6952,6 @@
         <w:rPr>
           <w:rFonts w:ascii="Calibri" w:eastAsia="Times New Roman" w:hAnsi="Calibri" w:cs="Calibri"/>
         </w:rPr>
-        <w:lastRenderedPageBreak/>
         <w:t xml:space="preserve">in </w:t>
       </w:r>
       <w:r>
@@ -9137,7 +9374,7 @@
       <w:r>
         <w:t xml:space="preserve">. Our location for example is: </w:t>
       </w:r>
-      <w:hyperlink r:id="rId12" w:history="1">
+      <w:hyperlink r:id="rId13" w:history="1">
         <w:r>
           <w:rPr>
             <w:rStyle w:val="Hyperlink"/>
@@ -11162,13 +11399,7 @@
         <w:t xml:space="preserve">HidePortionMarking </w:t>
       </w:r>
       <w:r>
-        <w:t>– set this to false,</w:t>
-      </w:r>
-      <w:r>
-        <w:t xml:space="preserve"> hides</w:t>
-      </w:r>
-      <w:r>
-        <w:t xml:space="preserve"> the portion marking buttons</w:t>
+        <w:t>– set this to false, hides the portion marking buttons</w:t>
       </w:r>
     </w:p>
     <w:p>
@@ -12618,13 +12849,7 @@
         <w:t xml:space="preserve">HidePortionMarking </w:t>
       </w:r>
       <w:r>
-        <w:t xml:space="preserve">– set this to </w:t>
-      </w:r>
-      <w:r>
-        <w:t>false</w:t>
-      </w:r>
-      <w:r>
-        <w:t>, hides the portion marking buttons</w:t>
+        <w:t>– set this to false, hides the portion marking buttons</w:t>
       </w:r>
       <w:r>
         <w:tab/>
@@ -15161,12 +15386,12 @@
       </w:pPr>
     </w:p>
     <w:sectPr>
-      <w:headerReference w:type="even" r:id="rId13"/>
-      <w:headerReference w:type="default" r:id="rId14"/>
-      <w:footerReference w:type="even" r:id="rId15"/>
-      <w:footerReference w:type="default" r:id="rId16"/>
-      <w:headerReference w:type="first" r:id="rId17"/>
-      <w:footerReference w:type="first" r:id="rId18"/>
+      <w:headerReference w:type="even" r:id="rId14"/>
+      <w:headerReference w:type="default" r:id="rId15"/>
+      <w:footerReference w:type="even" r:id="rId16"/>
+      <w:footerReference w:type="default" r:id="rId17"/>
+      <w:headerReference w:type="first" r:id="rId18"/>
+      <w:footerReference w:type="first" r:id="rId19"/>
       <w:pgSz w:w="12240" w:h="15840"/>
       <w:pgMar w:top="1440" w:right="1440" w:bottom="1440" w:left="1440" w:header="720" w:footer="720" w:gutter="0"/>
       <w:cols w:space="720"/>
@@ -18747,7 +18972,7 @@
   <w:abstractNum w:abstractNumId="27" w15:restartNumberingAfterBreak="0">
     <w:nsid w:val="7D9E78CB"/>
     <w:multiLevelType w:val="hybridMultilevel"/>
-    <w:tmpl w:val="F0547EBA"/>
+    <w:tmpl w:val="7F60F4C2"/>
     <w:lvl w:ilvl="0" w:tplc="C540E42A">
       <w:start w:val="1"/>
       <w:numFmt w:val="decimal"/>

</xml_diff>